<commit_message>
Belbin rollen van Nathalie en Chris ingevuld.
</commit_message>
<xml_diff>
--- a/ZKOO3_PvA.docx
+++ b/ZKOO3_PvA.docx
@@ -270,12 +270,6 @@
                                 <w:lang w:val="en-US"/>
                               </w:rPr>
                               <w:br/>
-                            </w:r>
-                            <w:r>
-                              <w:rPr>
-                                <w:color w:val="FF0000"/>
-                                <w:lang w:val="en-US"/>
-                              </w:rPr>
                               <w:t>2505493</w:t>
                             </w:r>
                             <w:r>
@@ -551,7 +545,27 @@
           <w:sz w:val="24"/>
           <w:szCs w:val="24"/>
         </w:rPr>
-        <w:t>Module Data Protection Leerjaar 2 blok 1</w:t>
+        <w:t xml:space="preserve">Module Data </w:t>
+      </w:r>
+      <w:proofErr w:type="spellStart"/>
+      <w:r>
+        <w:rPr>
+          <w:b/>
+          <w:bCs/>
+          <w:sz w:val="24"/>
+          <w:szCs w:val="24"/>
+        </w:rPr>
+        <w:t>Protection</w:t>
+      </w:r>
+      <w:proofErr w:type="spellEnd"/>
+      <w:r>
+        <w:rPr>
+          <w:b/>
+          <w:bCs/>
+          <w:sz w:val="24"/>
+          <w:szCs w:val="24"/>
+        </w:rPr>
+        <w:t xml:space="preserve"> Leerjaar 2 blok 1</w:t>
       </w:r>
     </w:p>
     <w:p>
@@ -1704,18 +1718,28 @@
       <w:r>
         <w:t xml:space="preserve">De opdrachtgever </w:t>
       </w:r>
+      <w:proofErr w:type="spellStart"/>
       <w:r>
         <w:t>Aan</w:t>
       </w:r>
       <w:r>
-        <w:t>ZKOO (Zorg</w:t>
+        <w:t>ZKOO</w:t>
+      </w:r>
+      <w:proofErr w:type="spellEnd"/>
+      <w:r>
+        <w:t xml:space="preserve"> (Zorg</w:t>
       </w:r>
       <w:r>
         <w:t xml:space="preserve"> </w:t>
       </w:r>
       <w:r>
-        <w:t>Kwaliteit Ondersteunings</w:t>
-      </w:r>
+        <w:t xml:space="preserve">Kwaliteit </w:t>
+      </w:r>
+      <w:proofErr w:type="spellStart"/>
+      <w:r>
+        <w:t>Ondersteunings</w:t>
+      </w:r>
+      <w:proofErr w:type="spellEnd"/>
       <w:r>
         <w:t xml:space="preserve"> </w:t>
       </w:r>
@@ -1965,8 +1989,16 @@
         <w:rPr>
           <w:rFonts w:ascii="Avenir Next LT Pro" w:hAnsi="Avenir Next LT Pro"/>
         </w:rPr>
-        <w:t>Toegangsbeheer en logging</w:t>
-      </w:r>
+        <w:t xml:space="preserve">Toegangsbeheer en </w:t>
+      </w:r>
+      <w:proofErr w:type="spellStart"/>
+      <w:r>
+        <w:rPr>
+          <w:rFonts w:ascii="Avenir Next LT Pro" w:hAnsi="Avenir Next LT Pro"/>
+        </w:rPr>
+        <w:t>logging</w:t>
+      </w:r>
+      <w:proofErr w:type="spellEnd"/>
     </w:p>
     <w:p>
       <w:pPr>
@@ -1988,7 +2020,23 @@
     </w:p>
     <w:p>
       <w:r>
-        <w:t>ZKOO werkt met moderne cloudomgevingen (Microsoft Azure) om schaalbaarheid, beschikbaarheid en beveiliging te garanderen.</w:t>
+        <w:t xml:space="preserve">ZKOO werkt met moderne </w:t>
+      </w:r>
+      <w:proofErr w:type="spellStart"/>
+      <w:r>
+        <w:t>cloudomgevingen</w:t>
+      </w:r>
+      <w:proofErr w:type="spellEnd"/>
+      <w:r>
+        <w:t xml:space="preserve"> (Microsoft </w:t>
+      </w:r>
+      <w:proofErr w:type="spellStart"/>
+      <w:r>
+        <w:t>Azure</w:t>
+      </w:r>
+      <w:proofErr w:type="spellEnd"/>
+      <w:r>
+        <w:t>) om schaalbaarheid, beschikbaarheid en beveiliging te garanderen.</w:t>
       </w:r>
     </w:p>
     <w:p>
@@ -2059,7 +2107,15 @@
         <w:t xml:space="preserve"> d</w:t>
       </w:r>
       <w:r>
-        <w:t xml:space="preserve">oor een versneld traject naar Microsoft Azure kritieke ICT-componenten onvoldoende beveiligd. Een databeveiligingsbeleid ontbreekt, toegangscontroles zijn niet duidelijk ingericht, en wetgeving zoals de AVG wordt mogelijk geschonden. </w:t>
+        <w:t xml:space="preserve">oor een versneld traject naar Microsoft </w:t>
+      </w:r>
+      <w:proofErr w:type="spellStart"/>
+      <w:r>
+        <w:t>Azure</w:t>
+      </w:r>
+      <w:proofErr w:type="spellEnd"/>
+      <w:r>
+        <w:t xml:space="preserve"> kritieke ICT-componenten onvoldoende beveiligd. Een databeveiligingsbeleid ontbreekt, toegangscontroles zijn niet duidelijk ingericht, en wetgeving zoals de AVG wordt mogelijk geschonden. </w:t>
       </w:r>
     </w:p>
     <w:p>
@@ -2125,7 +2181,15 @@
         <w:t>de</w:t>
       </w:r>
       <w:r>
-        <w:t xml:space="preserve"> cloudomgeving </w:t>
+        <w:t xml:space="preserve"> </w:t>
+      </w:r>
+      <w:proofErr w:type="spellStart"/>
+      <w:r>
+        <w:t>cloudomgeving</w:t>
+      </w:r>
+      <w:proofErr w:type="spellEnd"/>
+      <w:r>
+        <w:t xml:space="preserve"> </w:t>
       </w:r>
       <w:r>
         <w:t xml:space="preserve">van de klant van ZKOO </w:t>
@@ -2157,7 +2221,21 @@
         <w:rPr>
           <w:rFonts w:ascii="Avenir Next LT Pro" w:hAnsi="Avenir Next LT Pro"/>
         </w:rPr>
-        <w:t xml:space="preserve">De bestaande cloudomgeving (IST) </w:t>
+        <w:t xml:space="preserve">De bestaande </w:t>
+      </w:r>
+      <w:proofErr w:type="spellStart"/>
+      <w:r>
+        <w:rPr>
+          <w:rFonts w:ascii="Avenir Next LT Pro" w:hAnsi="Avenir Next LT Pro"/>
+        </w:rPr>
+        <w:t>cloudomgeving</w:t>
+      </w:r>
+      <w:proofErr w:type="spellEnd"/>
+      <w:r>
+        <w:rPr>
+          <w:rFonts w:ascii="Avenir Next LT Pro" w:hAnsi="Avenir Next LT Pro"/>
+        </w:rPr>
+        <w:t xml:space="preserve"> (IST) </w:t>
       </w:r>
       <w:r>
         <w:rPr>
@@ -2253,7 +2331,21 @@
         <w:rPr>
           <w:rFonts w:ascii="Avenir Next LT Pro" w:hAnsi="Avenir Next LT Pro"/>
         </w:rPr>
-        <w:t xml:space="preserve"> binnen Microsoft Azure.</w:t>
+        <w:t xml:space="preserve"> binnen Microsoft </w:t>
+      </w:r>
+      <w:proofErr w:type="spellStart"/>
+      <w:r>
+        <w:rPr>
+          <w:rFonts w:ascii="Avenir Next LT Pro" w:hAnsi="Avenir Next LT Pro"/>
+        </w:rPr>
+        <w:t>Azure</w:t>
+      </w:r>
+      <w:proofErr w:type="spellEnd"/>
+      <w:r>
+        <w:rPr>
+          <w:rFonts w:ascii="Avenir Next LT Pro" w:hAnsi="Avenir Next LT Pro"/>
+        </w:rPr>
+        <w:t>.</w:t>
       </w:r>
     </w:p>
     <w:p>
@@ -2425,9 +2517,11 @@
             <w:hideMark/>
           </w:tcPr>
           <w:p>
+            <w:proofErr w:type="spellStart"/>
             <w:r>
               <w:t>PvA</w:t>
             </w:r>
+            <w:proofErr w:type="spellEnd"/>
           </w:p>
         </w:tc>
         <w:tc>
@@ -2469,12 +2563,14 @@
             <w:hideMark/>
           </w:tcPr>
           <w:p>
+            <w:proofErr w:type="spellStart"/>
             <w:r>
               <w:t>Advies</w:t>
             </w:r>
             <w:r>
               <w:t>+ontwerp</w:t>
             </w:r>
+            <w:proofErr w:type="spellEnd"/>
           </w:p>
         </w:tc>
         <w:tc>
@@ -2542,8 +2638,13 @@
               <w:t>individuele CGI-toets</w:t>
             </w:r>
             <w:r>
-              <w:t xml:space="preserve"> in Azure</w:t>
-            </w:r>
+              <w:t xml:space="preserve"> in </w:t>
+            </w:r>
+            <w:proofErr w:type="spellStart"/>
+            <w:r>
+              <w:t>Azure</w:t>
+            </w:r>
+            <w:proofErr w:type="spellEnd"/>
           </w:p>
         </w:tc>
       </w:tr>
@@ -2610,7 +2711,21 @@
         <w:rPr>
           <w:rFonts w:ascii="Avenir Next LT Pro" w:hAnsi="Avenir Next LT Pro"/>
         </w:rPr>
-        <w:t>Analyse van bestaande (gesimuleerde) cloudomgeving.</w:t>
+        <w:t xml:space="preserve">Analyse van bestaande (gesimuleerde) </w:t>
+      </w:r>
+      <w:proofErr w:type="spellStart"/>
+      <w:r>
+        <w:rPr>
+          <w:rFonts w:ascii="Avenir Next LT Pro" w:hAnsi="Avenir Next LT Pro"/>
+        </w:rPr>
+        <w:t>cloudomgeving</w:t>
+      </w:r>
+      <w:proofErr w:type="spellEnd"/>
+      <w:r>
+        <w:rPr>
+          <w:rFonts w:ascii="Avenir Next LT Pro" w:hAnsi="Avenir Next LT Pro"/>
+        </w:rPr>
+        <w:t>.</w:t>
       </w:r>
     </w:p>
     <w:p>
@@ -2646,7 +2761,21 @@
         <w:rPr>
           <w:rFonts w:ascii="Avenir Next LT Pro" w:hAnsi="Avenir Next LT Pro"/>
         </w:rPr>
-        <w:t>Beveiligingsontwerp m.b.t. netwerksegmentatie, toegangsbeheer, dataclassificatie, logging, en veilig beheer.</w:t>
+        <w:t xml:space="preserve">Beveiligingsontwerp m.b.t. netwerksegmentatie, toegangsbeheer, dataclassificatie, </w:t>
+      </w:r>
+      <w:proofErr w:type="spellStart"/>
+      <w:r>
+        <w:rPr>
+          <w:rFonts w:ascii="Avenir Next LT Pro" w:hAnsi="Avenir Next LT Pro"/>
+        </w:rPr>
+        <w:t>logging</w:t>
+      </w:r>
+      <w:proofErr w:type="spellEnd"/>
+      <w:r>
+        <w:rPr>
+          <w:rFonts w:ascii="Avenir Next LT Pro" w:hAnsi="Avenir Next LT Pro"/>
+        </w:rPr>
+        <w:t>, en veilig beheer.</w:t>
       </w:r>
     </w:p>
     <w:p>
@@ -2664,7 +2793,21 @@
         <w:rPr>
           <w:rFonts w:ascii="Avenir Next LT Pro" w:hAnsi="Avenir Next LT Pro"/>
         </w:rPr>
-        <w:t>Implementatie binnen Azure-resourcegroup.</w:t>
+        <w:t xml:space="preserve">Implementatie binnen </w:t>
+      </w:r>
+      <w:proofErr w:type="spellStart"/>
+      <w:r>
+        <w:rPr>
+          <w:rFonts w:ascii="Avenir Next LT Pro" w:hAnsi="Avenir Next LT Pro"/>
+        </w:rPr>
+        <w:t>Azure-resourcegroup</w:t>
+      </w:r>
+      <w:proofErr w:type="spellEnd"/>
+      <w:r>
+        <w:rPr>
+          <w:rFonts w:ascii="Avenir Next LT Pro" w:hAnsi="Avenir Next LT Pro"/>
+        </w:rPr>
+        <w:t>.</w:t>
       </w:r>
     </w:p>
     <w:p>
@@ -2690,7 +2833,21 @@
         <w:rPr>
           <w:rFonts w:ascii="Avenir Next LT Pro" w:hAnsi="Avenir Next LT Pro"/>
         </w:rPr>
-        <w:t>Migratie van legacy-systemen.</w:t>
+        <w:t xml:space="preserve">Migratie van </w:t>
+      </w:r>
+      <w:proofErr w:type="spellStart"/>
+      <w:r>
+        <w:rPr>
+          <w:rFonts w:ascii="Avenir Next LT Pro" w:hAnsi="Avenir Next LT Pro"/>
+        </w:rPr>
+        <w:t>legacy</w:t>
+      </w:r>
+      <w:proofErr w:type="spellEnd"/>
+      <w:r>
+        <w:rPr>
+          <w:rFonts w:ascii="Avenir Next LT Pro" w:hAnsi="Avenir Next LT Pro"/>
+        </w:rPr>
+        <w:t>-systemen.</w:t>
       </w:r>
     </w:p>
     <w:p>
@@ -2855,11 +3012,19 @@
           <w:rFonts w:ascii="Avenir Next LT Pro" w:hAnsi="Avenir Next LT Pro"/>
         </w:rPr>
       </w:pPr>
-      <w:r>
-        <w:rPr>
-          <w:rFonts w:ascii="Avenir Next LT Pro" w:hAnsi="Avenir Next LT Pro"/>
-        </w:rPr>
-        <w:t xml:space="preserve">PvA </w:t>
+      <w:proofErr w:type="spellStart"/>
+      <w:r>
+        <w:rPr>
+          <w:rFonts w:ascii="Avenir Next LT Pro" w:hAnsi="Avenir Next LT Pro"/>
+        </w:rPr>
+        <w:t>PvA</w:t>
+      </w:r>
+      <w:proofErr w:type="spellEnd"/>
+      <w:r>
+        <w:rPr>
+          <w:rFonts w:ascii="Avenir Next LT Pro" w:hAnsi="Avenir Next LT Pro"/>
+        </w:rPr>
+        <w:t xml:space="preserve"> </w:t>
       </w:r>
       <w:r>
         <w:rPr>
@@ -3001,8 +3166,30 @@
         <w:rPr>
           <w:rFonts w:ascii="Avenir Next LT Pro" w:hAnsi="Avenir Next LT Pro"/>
         </w:rPr>
-        <w:t>Inrichten beveiligde cloudomgeving in Azure</w:t>
-      </w:r>
+        <w:t xml:space="preserve">Inrichten beveiligde </w:t>
+      </w:r>
+      <w:proofErr w:type="spellStart"/>
+      <w:r>
+        <w:rPr>
+          <w:rFonts w:ascii="Avenir Next LT Pro" w:hAnsi="Avenir Next LT Pro"/>
+        </w:rPr>
+        <w:t>cloudomgeving</w:t>
+      </w:r>
+      <w:proofErr w:type="spellEnd"/>
+      <w:r>
+        <w:rPr>
+          <w:rFonts w:ascii="Avenir Next LT Pro" w:hAnsi="Avenir Next LT Pro"/>
+        </w:rPr>
+        <w:t xml:space="preserve"> in </w:t>
+      </w:r>
+      <w:proofErr w:type="spellStart"/>
+      <w:r>
+        <w:rPr>
+          <w:rFonts w:ascii="Avenir Next LT Pro" w:hAnsi="Avenir Next LT Pro"/>
+        </w:rPr>
+        <w:t>Azure</w:t>
+      </w:r>
+      <w:proofErr w:type="spellEnd"/>
     </w:p>
     <w:p>
       <w:pPr>
@@ -3019,7 +3206,21 @@
         <w:rPr>
           <w:rFonts w:ascii="Avenir Next LT Pro" w:hAnsi="Avenir Next LT Pro"/>
         </w:rPr>
-        <w:t>Configuratie van firewalls, IDS, VPN’s, toegangscontrole</w:t>
+        <w:t xml:space="preserve">Configuratie van firewalls, IDS, </w:t>
+      </w:r>
+      <w:proofErr w:type="spellStart"/>
+      <w:r>
+        <w:rPr>
+          <w:rFonts w:ascii="Avenir Next LT Pro" w:hAnsi="Avenir Next LT Pro"/>
+        </w:rPr>
+        <w:t>VPN’s</w:t>
+      </w:r>
+      <w:proofErr w:type="spellEnd"/>
+      <w:r>
+        <w:rPr>
+          <w:rFonts w:ascii="Avenir Next LT Pro" w:hAnsi="Avenir Next LT Pro"/>
+        </w:rPr>
+        <w:t>, toegangscontrole</w:t>
       </w:r>
     </w:p>
     <w:p>
@@ -3051,11 +3252,19 @@
           <w:rFonts w:ascii="Avenir Next LT Pro" w:hAnsi="Avenir Next LT Pro"/>
         </w:rPr>
       </w:pPr>
-      <w:r>
-        <w:rPr>
-          <w:rFonts w:ascii="Avenir Next LT Pro" w:hAnsi="Avenir Next LT Pro"/>
-        </w:rPr>
-        <w:t>Logging en monitoring activeren</w:t>
+      <w:proofErr w:type="spellStart"/>
+      <w:r>
+        <w:rPr>
+          <w:rFonts w:ascii="Avenir Next LT Pro" w:hAnsi="Avenir Next LT Pro"/>
+        </w:rPr>
+        <w:t>Logging</w:t>
+      </w:r>
+      <w:proofErr w:type="spellEnd"/>
+      <w:r>
+        <w:rPr>
+          <w:rFonts w:ascii="Avenir Next LT Pro" w:hAnsi="Avenir Next LT Pro"/>
+        </w:rPr>
+        <w:t xml:space="preserve"> en monitoring activeren</w:t>
       </w:r>
     </w:p>
     <w:p>
@@ -3206,7 +3415,15 @@
         <w:t xml:space="preserve">Onze missie is als team samen te werken aan het verbeteren </w:t>
       </w:r>
       <w:r>
-        <w:t xml:space="preserve">van gegevensbescherming binnen de Azure-omgeving van ZKOO. Hierbij staan een eerlijke taakverdeling, open communicatie en verantwoordelijkheid voor ieders eigen werk hoog in het vaandel. </w:t>
+        <w:t xml:space="preserve">van gegevensbescherming binnen de </w:t>
+      </w:r>
+      <w:proofErr w:type="spellStart"/>
+      <w:r>
+        <w:t>Azure</w:t>
+      </w:r>
+      <w:proofErr w:type="spellEnd"/>
+      <w:r>
+        <w:t xml:space="preserve">-omgeving van ZKOO. Hierbij staan een eerlijke taakverdeling, open communicatie en verantwoordelijkheid voor ieders eigen werk hoog in het vaandel. </w:t>
       </w:r>
     </w:p>
     <w:p>
@@ -3217,7 +3434,15 @@
         </w:rPr>
       </w:pPr>
       <w:r>
-        <w:t xml:space="preserve">De visie die wij als team dragen is het opleveren van een onderbouwd advies en een werkende Proof of Concept. Hiermee laten we zien hoe de onderzochte beveiligingsrisico’s beperkt kunnen worden. </w:t>
+        <w:t xml:space="preserve">De visie die wij als team dragen is het opleveren van een onderbouwd advies en een werkende </w:t>
+      </w:r>
+      <w:proofErr w:type="spellStart"/>
+      <w:r>
+        <w:t>Proof</w:t>
+      </w:r>
+      <w:proofErr w:type="spellEnd"/>
+      <w:r>
+        <w:t xml:space="preserve"> of Concept. Hiermee laten we zien hoe de onderzochte beveiligingsrisico’s beperkt kunnen worden. </w:t>
       </w:r>
     </w:p>
     <w:p>
@@ -3330,6 +3555,7 @@
                 <w:lang w:val="es-ES_tradnl"/>
               </w:rPr>
             </w:pPr>
+            <w:proofErr w:type="spellStart"/>
             <w:r>
               <w:rPr>
                 <w:rFonts w:cs="Arial"/>
@@ -3339,6 +3565,7 @@
               </w:rPr>
               <w:t>E-mail</w:t>
             </w:r>
+            <w:proofErr w:type="spellEnd"/>
           </w:p>
         </w:tc>
         <w:tc>
@@ -3357,6 +3584,7 @@
                 <w:lang w:val="de-DE"/>
               </w:rPr>
             </w:pPr>
+            <w:proofErr w:type="spellStart"/>
             <w:r>
               <w:rPr>
                 <w:rFonts w:cs="Arial"/>
@@ -3366,6 +3594,7 @@
               </w:rPr>
               <w:t>Beschikbaarheid</w:t>
             </w:r>
+            <w:proofErr w:type="spellEnd"/>
           </w:p>
         </w:tc>
       </w:tr>
@@ -3504,8 +3733,19 @@
                 <w:szCs w:val="20"/>
                 <w:lang w:val="en-US"/>
               </w:rPr>
-              <w:t>Ma t/m Vr</w:t>
-            </w:r>
+              <w:t xml:space="preserve">Ma t/m </w:t>
+            </w:r>
+            <w:proofErr w:type="spellStart"/>
+            <w:r>
+              <w:rPr>
+                <w:rFonts w:cs="Arial"/>
+                <w:sz w:val="20"/>
+                <w:szCs w:val="20"/>
+                <w:lang w:val="en-US"/>
+              </w:rPr>
+              <w:t>Vr</w:t>
+            </w:r>
+            <w:proofErr w:type="spellEnd"/>
             <w:r>
               <w:rPr>
                 <w:rFonts w:cs="Arial"/>
@@ -3569,25 +3809,7 @@
                 <w:szCs w:val="20"/>
                 <w:lang w:val="en-US"/>
               </w:rPr>
-              <w:t>Chr</w:t>
-            </w:r>
-            <w:r>
-              <w:rPr>
-                <w:rFonts w:cs="Arial"/>
-                <w:sz w:val="20"/>
-                <w:szCs w:val="20"/>
-                <w:lang w:val="en-US"/>
-              </w:rPr>
-              <w:t>i</w:t>
-            </w:r>
-            <w:r>
-              <w:rPr>
-                <w:rFonts w:cs="Arial"/>
-                <w:sz w:val="20"/>
-                <w:szCs w:val="20"/>
-                <w:lang w:val="en-US"/>
-              </w:rPr>
-              <w:t>s Carley</w:t>
+              <w:t>Chris Carley</w:t>
             </w:r>
           </w:p>
         </w:tc>
@@ -3650,16 +3872,7 @@
                 <w:szCs w:val="20"/>
                 <w:lang w:val="en-US"/>
               </w:rPr>
-              <w:t>2605402</w:t>
-            </w:r>
-            <w:r>
-              <w:rPr>
-                <w:rFonts w:cs="Arial"/>
-                <w:sz w:val="20"/>
-                <w:szCs w:val="20"/>
-                <w:lang w:val="en-US"/>
-              </w:rPr>
-              <w:t>carley</w:t>
+              <w:t>2605402carley</w:t>
             </w:r>
             <w:r>
               <w:rPr>
@@ -3695,8 +3908,19 @@
                 <w:szCs w:val="20"/>
                 <w:lang w:val="en-US"/>
               </w:rPr>
-              <w:t>Ma t/m Vr</w:t>
-            </w:r>
+              <w:t xml:space="preserve">Ma t/m </w:t>
+            </w:r>
+            <w:proofErr w:type="spellStart"/>
+            <w:r>
+              <w:rPr>
+                <w:rFonts w:cs="Arial"/>
+                <w:sz w:val="20"/>
+                <w:szCs w:val="20"/>
+                <w:lang w:val="en-US"/>
+              </w:rPr>
+              <w:t>Vr</w:t>
+            </w:r>
+            <w:proofErr w:type="spellEnd"/>
             <w:r>
               <w:rPr>
                 <w:rFonts w:cs="Arial"/>
@@ -3841,8 +4065,19 @@
                 <w:szCs w:val="20"/>
                 <w:lang w:val="en-US"/>
               </w:rPr>
-              <w:t>Ma t/m Vr</w:t>
-            </w:r>
+              <w:t xml:space="preserve">Ma t/m </w:t>
+            </w:r>
+            <w:proofErr w:type="spellStart"/>
+            <w:r>
+              <w:rPr>
+                <w:rFonts w:cs="Arial"/>
+                <w:sz w:val="20"/>
+                <w:szCs w:val="20"/>
+                <w:lang w:val="en-US"/>
+              </w:rPr>
+              <w:t>Vr</w:t>
+            </w:r>
+            <w:proofErr w:type="spellEnd"/>
             <w:r>
               <w:rPr>
                 <w:rFonts w:cs="Arial"/>
@@ -3974,16 +4209,7 @@
                 <w:szCs w:val="20"/>
                 <w:lang w:val="en-US"/>
               </w:rPr>
-              <w:t>2062550</w:t>
-            </w:r>
-            <w:r>
-              <w:rPr>
-                <w:rFonts w:cs="Arial"/>
-                <w:sz w:val="20"/>
-                <w:szCs w:val="20"/>
-                <w:lang w:val="en-US"/>
-              </w:rPr>
-              <w:t>weerts</w:t>
+              <w:t>2062550weerts</w:t>
             </w:r>
             <w:r>
               <w:rPr>
@@ -4019,8 +4245,9 @@
                 <w:szCs w:val="20"/>
                 <w:lang w:val="en-US"/>
               </w:rPr>
-              <w:t>Ma t/m Vr</w:t>
-            </w:r>
+              <w:t xml:space="preserve">Ma t/m </w:t>
+            </w:r>
+            <w:proofErr w:type="spellStart"/>
             <w:r>
               <w:rPr>
                 <w:rFonts w:cs="Arial"/>
@@ -4028,8 +4255,9 @@
                 <w:szCs w:val="20"/>
                 <w:lang w:val="en-US"/>
               </w:rPr>
-              <w:t>:</w:t>
-            </w:r>
+              <w:t>Vr</w:t>
+            </w:r>
+            <w:proofErr w:type="spellEnd"/>
             <w:r>
               <w:rPr>
                 <w:rFonts w:cs="Arial"/>
@@ -4037,7 +4265,7 @@
                 <w:szCs w:val="20"/>
                 <w:lang w:val="en-US"/>
               </w:rPr>
-              <w:t xml:space="preserve"> 9:00 – 1</w:t>
+              <w:t>:</w:t>
             </w:r>
             <w:r>
               <w:rPr>
@@ -4046,7 +4274,7 @@
                 <w:szCs w:val="20"/>
                 <w:lang w:val="en-US"/>
               </w:rPr>
-              <w:t>6</w:t>
+              <w:t xml:space="preserve"> 9:00 – 1</w:t>
             </w:r>
             <w:r>
               <w:rPr>
@@ -4055,6 +4283,15 @@
                 <w:szCs w:val="20"/>
                 <w:lang w:val="en-US"/>
               </w:rPr>
+              <w:t>6</w:t>
+            </w:r>
+            <w:r>
+              <w:rPr>
+                <w:rFonts w:cs="Arial"/>
+                <w:sz w:val="20"/>
+                <w:szCs w:val="20"/>
+                <w:lang w:val="en-US"/>
+              </w:rPr>
               <w:t>:00</w:t>
             </w:r>
           </w:p>
@@ -4075,7 +4312,15 @@
         <w:t>Tijdens s</w:t>
       </w:r>
       <w:r>
-        <w:t xml:space="preserve">chooluren zorgen de teamleden dat zij bereikbaar zijn, ook wanneer iemand vanuit huis werkt. Hiervoor gebruiken we communicatiekanalen Whatsapp, Github en Microsoft Teams. </w:t>
+        <w:t xml:space="preserve">chooluren zorgen de teamleden dat zij bereikbaar zijn, ook wanneer iemand vanuit huis werkt. Hiervoor gebruiken we communicatiekanalen Whatsapp, </w:t>
+      </w:r>
+      <w:proofErr w:type="spellStart"/>
+      <w:r>
+        <w:t>Github</w:t>
+      </w:r>
+      <w:proofErr w:type="spellEnd"/>
+      <w:r>
+        <w:t xml:space="preserve"> en Microsoft Teams. </w:t>
       </w:r>
     </w:p>
     <w:p>
@@ -4231,7 +4476,7 @@
           <w:rStyle w:val="Emphasis"/>
           <w:color w:val="FF0000"/>
         </w:rPr>
-        <w:t>Teamlid 1</w:t>
+        <w:t>Nathalie</w:t>
       </w:r>
       <w:r>
         <w:rPr>
@@ -4244,7 +4489,13 @@
         <w:rPr>
           <w:color w:val="FF0000"/>
         </w:rPr>
-        <w:t>Brononderzoeker</w:t>
+        <w:t>Bedrijfsman</w:t>
+      </w:r>
+      <w:r>
+        <w:rPr>
+          <w:color w:val="FF0000"/>
+        </w:rPr>
+        <w:tab/>
       </w:r>
       <w:r>
         <w:rPr>
@@ -4270,7 +4521,12 @@
           <w:color w:val="FF0000"/>
         </w:rPr>
         <w:tab/>
-        <w:t>Vormer</w:t>
+      </w:r>
+      <w:r>
+        <w:rPr>
+          <w:color w:val="FF0000"/>
+        </w:rPr>
+        <w:t>Voorzitter</w:t>
       </w:r>
     </w:p>
     <w:p>
@@ -4284,60 +4540,90 @@
           <w:rStyle w:val="Emphasis"/>
           <w:color w:val="FF0000"/>
         </w:rPr>
-        <w:t>Teamlid 2</w:t>
+        <w:t>Chris</w:t>
       </w:r>
       <w:r>
         <w:rPr>
           <w:rStyle w:val="Emphasis"/>
           <w:color w:val="FF0000"/>
         </w:rPr>
-        <w:tab/>
-      </w:r>
-      <w:r>
-        <w:rPr>
-          <w:color w:val="FF0000"/>
-        </w:rPr>
-        <w:t>Bedrijfsman</w:t>
-      </w:r>
-      <w:r>
-        <w:rPr>
-          <w:color w:val="FF0000"/>
-        </w:rPr>
-        <w:tab/>
-      </w:r>
-      <w:r>
-        <w:rPr>
-          <w:color w:val="FF0000"/>
-        </w:rPr>
-        <w:tab/>
-        <w:t>Groepswerker</w:t>
-      </w:r>
-      <w:r>
-        <w:rPr>
-          <w:color w:val="FF0000"/>
-        </w:rPr>
-        <w:tab/>
-      </w:r>
-      <w:r>
-        <w:rPr>
-          <w:color w:val="FF0000"/>
-        </w:rPr>
-        <w:tab/>
-        <w:t>Zorgdrager </w:t>
-      </w:r>
-    </w:p>
-    <w:p>
-      <w:pPr>
-        <w:rPr>
-          <w:color w:val="FF0000"/>
-        </w:rPr>
-      </w:pPr>
+        <w:t xml:space="preserve"> </w:t>
+      </w:r>
       <w:r>
         <w:rPr>
           <w:rStyle w:val="Emphasis"/>
           <w:color w:val="FF0000"/>
         </w:rPr>
-        <w:t>Teamlid 3</w:t>
+        <w:tab/>
+      </w:r>
+      <w:r>
+        <w:rPr>
+          <w:rStyle w:val="Emphasis"/>
+          <w:color w:val="FF0000"/>
+        </w:rPr>
+        <w:tab/>
+      </w:r>
+      <w:r>
+        <w:rPr>
+          <w:color w:val="FF0000"/>
+        </w:rPr>
+        <w:t>Bedrijfsman</w:t>
+      </w:r>
+      <w:r>
+        <w:rPr>
+          <w:color w:val="FF0000"/>
+        </w:rPr>
+        <w:tab/>
+      </w:r>
+      <w:r>
+        <w:rPr>
+          <w:color w:val="FF0000"/>
+        </w:rPr>
+        <w:tab/>
+      </w:r>
+      <w:r>
+        <w:rPr>
+          <w:color w:val="FF0000"/>
+        </w:rPr>
+        <w:t>Monitor</w:t>
+      </w:r>
+      <w:r>
+        <w:rPr>
+          <w:color w:val="FF0000"/>
+        </w:rPr>
+        <w:tab/>
+      </w:r>
+      <w:r>
+        <w:rPr>
+          <w:color w:val="FF0000"/>
+        </w:rPr>
+        <w:tab/>
+      </w:r>
+      <w:r>
+        <w:rPr>
+          <w:color w:val="FF0000"/>
+        </w:rPr>
+        <w:t>Brononderzoeker</w:t>
+      </w:r>
+      <w:r>
+        <w:rPr>
+          <w:color w:val="FF0000"/>
+        </w:rPr>
+        <w:t> </w:t>
+      </w:r>
+    </w:p>
+    <w:p>
+      <w:pPr>
+        <w:rPr>
+          <w:color w:val="FF0000"/>
+        </w:rPr>
+      </w:pPr>
+      <w:r>
+        <w:rPr>
+          <w:rStyle w:val="Emphasis"/>
+          <w:color w:val="FF0000"/>
+        </w:rPr>
+        <w:t>Connor</w:t>
       </w:r>
       <w:r>
         <w:rPr>
@@ -4387,14 +4673,16 @@
           <w:color w:val="FF0000"/>
         </w:rPr>
       </w:pPr>
+      <w:proofErr w:type="spellStart"/>
       <w:r>
         <w:rPr>
           <w:rStyle w:val="Emphasis"/>
           <w:color w:val="FF0000"/>
         </w:rPr>
         <w:lastRenderedPageBreak/>
-        <w:t>Teamlid 4</w:t>
-      </w:r>
+        <w:t>Maiwand</w:t>
+      </w:r>
+      <w:proofErr w:type="spellEnd"/>
       <w:r>
         <w:rPr>
           <w:rStyle w:val="Emphasis"/>
@@ -4495,7 +4783,15 @@
     </w:p>
     <w:p>
       <w:r>
-        <w:t xml:space="preserve">Notulist — Maiwand: </w:t>
+        <w:t xml:space="preserve">Notulist — </w:t>
+      </w:r>
+      <w:proofErr w:type="spellStart"/>
+      <w:r>
+        <w:t>Maiwand</w:t>
+      </w:r>
+      <w:proofErr w:type="spellEnd"/>
+      <w:r>
+        <w:t xml:space="preserve">: </w:t>
       </w:r>
     </w:p>
     <w:p>
@@ -4542,7 +4838,23 @@
     </w:p>
     <w:p>
       <w:r>
-        <w:t xml:space="preserve">Bij vertrek van een projectlid worden de taken verdeeld over de resterende leden. Indien nodig wordt gestemd over wie de vrijgenomen rol overneemt. </w:t>
+        <w:t xml:space="preserve">Bij vertrek van een </w:t>
+      </w:r>
+      <w:proofErr w:type="spellStart"/>
+      <w:r>
+        <w:t>projectlid</w:t>
+      </w:r>
+      <w:proofErr w:type="spellEnd"/>
+      <w:r>
+        <w:t xml:space="preserve"> worden de taken verdeeld over de resterende leden. Indien nodig wordt gestemd over wie de </w:t>
+      </w:r>
+      <w:proofErr w:type="spellStart"/>
+      <w:r>
+        <w:t>vrijgenomen</w:t>
+      </w:r>
+      <w:proofErr w:type="spellEnd"/>
+      <w:r>
+        <w:t xml:space="preserve"> rol overneemt. </w:t>
       </w:r>
     </w:p>
     <w:p>
@@ -4588,19 +4900,61 @@
         <w:rPr>
           <w:rFonts w:cs="Arial"/>
         </w:rPr>
-        <w:t>Binnen het team communiceren wij face-to-face tijdens lessen, via</w:t>
-      </w:r>
+        <w:t>Binnen het team communiceren wij face-</w:t>
+      </w:r>
+      <w:proofErr w:type="spellStart"/>
       <w:r>
         <w:rPr>
           <w:rFonts w:cs="Arial"/>
         </w:rPr>
-        <w:t xml:space="preserve"> Whatsapp, Github en indien er sprake is van digitaal overleg Microsoft Teams. Projectbestanden worden opgeslagen </w:t>
-      </w:r>
+        <w:t>to</w:t>
+      </w:r>
+      <w:proofErr w:type="spellEnd"/>
       <w:r>
         <w:rPr>
           <w:rFonts w:cs="Arial"/>
         </w:rPr>
-        <w:t>in Github. Tijdens een wekelijks overleg, gedurende of tussen de lessen in, bespreken wij de voortgang, mogelijke knelpunten en hoe de samenwerking verloopt.</w:t>
+        <w:t>-face tijdens lessen, via</w:t>
+      </w:r>
+      <w:r>
+        <w:rPr>
+          <w:rFonts w:cs="Arial"/>
+        </w:rPr>
+        <w:t xml:space="preserve"> Whatsapp, </w:t>
+      </w:r>
+      <w:proofErr w:type="spellStart"/>
+      <w:r>
+        <w:rPr>
+          <w:rFonts w:cs="Arial"/>
+        </w:rPr>
+        <w:t>Github</w:t>
+      </w:r>
+      <w:proofErr w:type="spellEnd"/>
+      <w:r>
+        <w:rPr>
+          <w:rFonts w:cs="Arial"/>
+        </w:rPr>
+        <w:t xml:space="preserve"> en indien er sprake is van digitaal overleg Microsoft Teams. Projectbestanden worden opgeslagen </w:t>
+      </w:r>
+      <w:r>
+        <w:rPr>
+          <w:rFonts w:cs="Arial"/>
+        </w:rPr>
+        <w:t xml:space="preserve">in </w:t>
+      </w:r>
+      <w:proofErr w:type="spellStart"/>
+      <w:r>
+        <w:rPr>
+          <w:rFonts w:cs="Arial"/>
+        </w:rPr>
+        <w:t>Github</w:t>
+      </w:r>
+      <w:proofErr w:type="spellEnd"/>
+      <w:r>
+        <w:rPr>
+          <w:rFonts w:cs="Arial"/>
+        </w:rPr>
+        <w:t>. Tijdens een wekelijks overleg, gedurende of tussen de lessen in, bespreken wij de voortgang, mogelijke knelpunten en hoe de samenwerking verloopt.</w:t>
       </w:r>
     </w:p>
     <w:p>
@@ -4670,7 +5024,23 @@
     </w:p>
     <w:p>
       <w:r>
-        <w:t xml:space="preserve">Overleg vindt plaats tijdens de lessen. Wij verwachten dat er dan voldoende tijd is om de voortgang, taakverdeling en knelpunten te bespreken. Als dit niet voldoende blijkt, plannen wij in overleg een extra vergadering. Ieder projectlid kan hiervoor een verzoek doen. Tijdens de vergaderingen legt Maiwand de notulen vast. </w:t>
+        <w:t xml:space="preserve">Overleg vindt plaats tijdens de lessen. Wij verwachten dat er dan voldoende tijd is om de voortgang, taakverdeling en knelpunten te bespreken. Als dit niet voldoende blijkt, plannen wij in overleg een extra vergadering. Ieder </w:t>
+      </w:r>
+      <w:proofErr w:type="spellStart"/>
+      <w:r>
+        <w:t>projectlid</w:t>
+      </w:r>
+      <w:proofErr w:type="spellEnd"/>
+      <w:r>
+        <w:t xml:space="preserve"> kan hiervoor een verzoek doen. Tijdens de vergaderingen legt </w:t>
+      </w:r>
+      <w:proofErr w:type="spellStart"/>
+      <w:r>
+        <w:t>Maiwand</w:t>
+      </w:r>
+      <w:proofErr w:type="spellEnd"/>
+      <w:r>
+        <w:t xml:space="preserve"> de notulen vast. </w:t>
       </w:r>
     </w:p>
     <w:p>
@@ -4708,7 +5078,23 @@
         </w:rPr>
       </w:pPr>
       <w:r>
-        <w:t>Bij meningsverschillen zoeken we naar een compromis. De projectleider zorgt dat dit besluit duidelijk wordt vastgelukt. Lukt het de projectgroep niet om tot een compomis te komen, vragen wij de docent om begeleiding.</w:t>
+        <w:t xml:space="preserve">Bij meningsverschillen zoeken we naar een compromis. De projectleider zorgt dat dit besluit duidelijk wordt </w:t>
+      </w:r>
+      <w:proofErr w:type="spellStart"/>
+      <w:r>
+        <w:t>vastgelukt</w:t>
+      </w:r>
+      <w:proofErr w:type="spellEnd"/>
+      <w:r>
+        <w:t xml:space="preserve">. Lukt het de projectgroep niet om tot een </w:t>
+      </w:r>
+      <w:proofErr w:type="spellStart"/>
+      <w:r>
+        <w:t>compomis</w:t>
+      </w:r>
+      <w:proofErr w:type="spellEnd"/>
+      <w:r>
+        <w:t xml:space="preserve"> te komen, vragen wij de docent om begeleiding.</w:t>
       </w:r>
     </w:p>
     <w:p>
@@ -4855,6 +5241,7 @@
                 <w:i/>
               </w:rPr>
             </w:pPr>
+            <w:proofErr w:type="spellStart"/>
             <w:r>
               <w:rPr>
                 <w:rFonts w:cs="Arial"/>
@@ -4862,6 +5249,7 @@
               </w:rPr>
               <w:t>Verdana</w:t>
             </w:r>
+            <w:proofErr w:type="spellEnd"/>
           </w:p>
         </w:tc>
       </w:tr>
@@ -5417,7 +5805,15 @@
     </w:p>
     <w:p>
       <w:r>
-        <w:t>Documenten worden tijdens het project opgeslagen en bewerkt in Word (.docx). De definitieve versie wordt als PDF ingeleverd, tenzij de opdracht een ander bestandsformaat voorschrijft.</w:t>
+        <w:t>Documenten worden tijdens het project opgeslagen en bewerkt in Word (.</w:t>
+      </w:r>
+      <w:proofErr w:type="spellStart"/>
+      <w:r>
+        <w:t>docx</w:t>
+      </w:r>
+      <w:proofErr w:type="spellEnd"/>
+      <w:r>
+        <w:t>). De definitieve versie wordt als PDF ingeleverd, tenzij de opdracht een ander bestandsformaat voorschrijft.</w:t>
       </w:r>
     </w:p>
     <w:p/>
@@ -5438,7 +5834,23 @@
     </w:p>
     <w:p>
       <w:r>
-        <w:t>Voor versiebeheer van het project gebruikt de groep Github. Wijzigingen aan de technische uitwerking moeten volgens het samenwerkingscontract door een ander projectlid worden goedgekeurd voordat ze worden samengevoegd.</w:t>
+        <w:t xml:space="preserve">Voor versiebeheer van het project gebruikt de groep </w:t>
+      </w:r>
+      <w:proofErr w:type="spellStart"/>
+      <w:r>
+        <w:t>Github</w:t>
+      </w:r>
+      <w:proofErr w:type="spellEnd"/>
+      <w:r>
+        <w:t xml:space="preserve">. Wijzigingen aan de technische uitwerking moeten volgens het samenwerkingscontract door een ander </w:t>
+      </w:r>
+      <w:proofErr w:type="spellStart"/>
+      <w:r>
+        <w:t>projectlid</w:t>
+      </w:r>
+      <w:proofErr w:type="spellEnd"/>
+      <w:r>
+        <w:t xml:space="preserve"> worden goedgekeurd voordat ze worden samengevoegd.</w:t>
       </w:r>
     </w:p>
     <w:p>
@@ -5492,7 +5904,15 @@
         </w:numPr>
       </w:pPr>
       <w:r>
-        <w:t>Analyse, advies en uitvoerbaar PoC-ontwerp: week 5, vrijdag om 15.00 uur.</w:t>
+        <w:t xml:space="preserve">Analyse, advies en uitvoerbaar </w:t>
+      </w:r>
+      <w:proofErr w:type="spellStart"/>
+      <w:r>
+        <w:t>PoC</w:t>
+      </w:r>
+      <w:proofErr w:type="spellEnd"/>
+      <w:r>
+        <w:t>-ontwerp: week 5, vrijdag om 15.00 uur.</w:t>
       </w:r>
     </w:p>
     <w:p>
@@ -5521,7 +5941,15 @@
     </w:p>
     <w:p>
       <w:r>
-        <w:t xml:space="preserve">Ieder groepslid is zelf verantwoordelijk voor het tijdig inleveren van de opdrachten in diens persoonlijke Moodle omgeving. </w:t>
+        <w:t xml:space="preserve">Ieder groepslid is zelf verantwoordelijk voor het tijdig inleveren van de opdrachten in diens persoonlijke </w:t>
+      </w:r>
+      <w:proofErr w:type="spellStart"/>
+      <w:r>
+        <w:t>Moodle</w:t>
+      </w:r>
+      <w:proofErr w:type="spellEnd"/>
+      <w:r>
+        <w:t xml:space="preserve"> omgeving. </w:t>
       </w:r>
     </w:p>
     <w:p>
@@ -6024,7 +6452,15 @@
           </w:tcPr>
           <w:p>
             <w:r>
-              <w:t>Problemen met Azure-omgeving</w:t>
+              <w:t xml:space="preserve">Problemen met </w:t>
+            </w:r>
+            <w:proofErr w:type="spellStart"/>
+            <w:r>
+              <w:t>Azure</w:t>
+            </w:r>
+            <w:proofErr w:type="spellEnd"/>
+            <w:r>
+              <w:t>-omgeving</w:t>
             </w:r>
           </w:p>
         </w:tc>
@@ -6252,7 +6688,15 @@
           </w:tcPr>
           <w:p>
             <w:r>
-              <w:t>SQL-injectie tests, dataclassificatie, PvA inleveren</w:t>
+              <w:t xml:space="preserve">SQL-injectie tests, dataclassificatie, </w:t>
+            </w:r>
+            <w:proofErr w:type="spellStart"/>
+            <w:r>
+              <w:t>PvA</w:t>
+            </w:r>
+            <w:proofErr w:type="spellEnd"/>
+            <w:r>
+              <w:t xml:space="preserve"> inleveren</w:t>
             </w:r>
           </w:p>
         </w:tc>
@@ -6348,8 +6792,13 @@
           </w:tcPr>
           <w:p>
             <w:r>
-              <w:t>Implementatie SOLL in Azure</w:t>
-            </w:r>
+              <w:t xml:space="preserve">Implementatie SOLL in </w:t>
+            </w:r>
+            <w:proofErr w:type="spellStart"/>
+            <w:r>
+              <w:t>Azure</w:t>
+            </w:r>
+            <w:proofErr w:type="spellEnd"/>
           </w:p>
         </w:tc>
       </w:tr>
@@ -6379,7 +6828,15 @@
           </w:tcPr>
           <w:p>
             <w:r>
-              <w:t>Testen, logging controleren, verbeteringen doorvoeren</w:t>
+              <w:t xml:space="preserve">Testen, </w:t>
+            </w:r>
+            <w:proofErr w:type="spellStart"/>
+            <w:r>
+              <w:t>logging</w:t>
+            </w:r>
+            <w:proofErr w:type="spellEnd"/>
+            <w:r>
+              <w:t xml:space="preserve"> controleren, verbeteringen doorvoeren</w:t>
             </w:r>
           </w:p>
         </w:tc>
@@ -6514,7 +6971,63 @@
         <w:rPr>
           <w:rFonts w:ascii="Avenir Next LT Pro" w:hAnsi="Avenir Next LT Pro"/>
         </w:rPr>
-        <w:t>Gebruik van Microsoft Azure for Students (gratis credits)</w:t>
+        <w:t xml:space="preserve">Gebruik van Microsoft </w:t>
+      </w:r>
+      <w:proofErr w:type="spellStart"/>
+      <w:r>
+        <w:rPr>
+          <w:rFonts w:ascii="Avenir Next LT Pro" w:hAnsi="Avenir Next LT Pro"/>
+        </w:rPr>
+        <w:t>Azure</w:t>
+      </w:r>
+      <w:proofErr w:type="spellEnd"/>
+      <w:r>
+        <w:rPr>
+          <w:rFonts w:ascii="Avenir Next LT Pro" w:hAnsi="Avenir Next LT Pro"/>
+        </w:rPr>
+        <w:t xml:space="preserve"> </w:t>
+      </w:r>
+      <w:proofErr w:type="spellStart"/>
+      <w:r>
+        <w:rPr>
+          <w:rFonts w:ascii="Avenir Next LT Pro" w:hAnsi="Avenir Next LT Pro"/>
+        </w:rPr>
+        <w:t>for</w:t>
+      </w:r>
+      <w:proofErr w:type="spellEnd"/>
+      <w:r>
+        <w:rPr>
+          <w:rFonts w:ascii="Avenir Next LT Pro" w:hAnsi="Avenir Next LT Pro"/>
+        </w:rPr>
+        <w:t xml:space="preserve"> </w:t>
+      </w:r>
+      <w:proofErr w:type="spellStart"/>
+      <w:r>
+        <w:rPr>
+          <w:rFonts w:ascii="Avenir Next LT Pro" w:hAnsi="Avenir Next LT Pro"/>
+        </w:rPr>
+        <w:t>Students</w:t>
+      </w:r>
+      <w:proofErr w:type="spellEnd"/>
+      <w:r>
+        <w:rPr>
+          <w:rFonts w:ascii="Avenir Next LT Pro" w:hAnsi="Avenir Next LT Pro"/>
+        </w:rPr>
+        <w:t xml:space="preserve"> (gratis </w:t>
+      </w:r>
+      <w:proofErr w:type="spellStart"/>
+      <w:r>
+        <w:rPr>
+          <w:rFonts w:ascii="Avenir Next LT Pro" w:hAnsi="Avenir Next LT Pro"/>
+        </w:rPr>
+        <w:t>credits</w:t>
+      </w:r>
+      <w:proofErr w:type="spellEnd"/>
+      <w:r>
+        <w:rPr>
+          <w:rFonts w:ascii="Avenir Next LT Pro" w:hAnsi="Avenir Next LT Pro"/>
+        </w:rPr>
+        <w:t>)</w:t>
       </w:r>
     </w:p>
     <w:p>
@@ -6534,7 +7047,23 @@
           <w:rFonts w:ascii="Avenir Next LT Pro" w:hAnsi="Avenir Next LT Pro"/>
           <w:lang w:val="en-US"/>
         </w:rPr>
-        <w:t>Open-source IDS zoals Snort of Suricata</w:t>
+        <w:t xml:space="preserve">Open-source IDS </w:t>
+      </w:r>
+      <w:proofErr w:type="spellStart"/>
+      <w:r>
+        <w:rPr>
+          <w:rFonts w:ascii="Avenir Next LT Pro" w:hAnsi="Avenir Next LT Pro"/>
+          <w:lang w:val="en-US"/>
+        </w:rPr>
+        <w:t>zoals</w:t>
+      </w:r>
+      <w:proofErr w:type="spellEnd"/>
+      <w:r>
+        <w:rPr>
+          <w:rFonts w:ascii="Avenir Next LT Pro" w:hAnsi="Avenir Next LT Pro"/>
+          <w:lang w:val="en-US"/>
+        </w:rPr>
+        <w:t xml:space="preserve"> Snort of Suricata</w:t>
       </w:r>
     </w:p>
     <w:p>
@@ -6590,8 +7119,17 @@
           <w:rFonts w:ascii="Avenir Next LT Pro" w:hAnsi="Avenir Next LT Pro"/>
           <w:lang w:val="en-US"/>
         </w:rPr>
-        <w:t>Software: Visual Studio Code, OWASP tools, SQLi-testtools</w:t>
-      </w:r>
+        <w:t>Software: Visual Studio Code, OWASP tools, SQLi-</w:t>
+      </w:r>
+      <w:proofErr w:type="spellStart"/>
+      <w:r>
+        <w:rPr>
+          <w:rFonts w:ascii="Avenir Next LT Pro" w:hAnsi="Avenir Next LT Pro"/>
+          <w:lang w:val="en-US"/>
+        </w:rPr>
+        <w:t>testtools</w:t>
+      </w:r>
+      <w:proofErr w:type="spellEnd"/>
     </w:p>
     <w:p>
       <w:pPr>
@@ -6935,7 +7473,7 @@
             </wp:anchor>
           </w:drawing>
         </mc:Choice>
-        <mc:Fallback xmlns:a="http://schemas.openxmlformats.org/drawingml/2006/main" xmlns:pic="http://schemas.openxmlformats.org/drawingml/2006/picture" xmlns:a14="http://schemas.microsoft.com/office/drawing/2010/main">
+        <mc:Fallback xmlns:a14="http://schemas.microsoft.com/office/drawing/2010/main" xmlns:pic="http://schemas.openxmlformats.org/drawingml/2006/picture" xmlns:a="http://schemas.openxmlformats.org/drawingml/2006/main">
           <w:pict w14:anchorId="1CADCD6F">
             <v:group id="Groep 102" style="position:absolute;margin-left:-1in;margin-top:-29.55pt;width:595.25pt;height:835.05pt;z-index:-251657216" coordsize="75596,106051" coordorigin=",186" o:spid="_x0000_s1026" w14:anchorId="0FC57937" o:gfxdata="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">
               <v:shapetype id="_x0000_t75" coordsize="21600,21600" filled="f" stroked="f" o:spt="75" o:preferrelative="t" path="m@4@5l@4@11@9@11@9@5xe">
@@ -9355,6 +9893,7 @@
   <w:style w:type="character" w:default="1" w:styleId="DefaultParagraphFont">
     <w:name w:val="Default Paragraph Font"/>
     <w:uiPriority w:val="1"/>
+    <w:semiHidden/>
     <w:unhideWhenUsed/>
   </w:style>
   <w:style w:type="table" w:default="1" w:styleId="TableNormal">
@@ -9829,7 +10368,7 @@
     <w:charset w:val="00"/>
     <w:family w:val="swiss"/>
     <w:pitch w:val="variable"/>
-    <w:sig w:usb0="E4002EFF" w:usb1="C200247B" w:usb2="00000009" w:usb3="00000000" w:csb0="000001FF" w:csb1="00000000"/>
+    <w:sig w:usb0="E4002EFF" w:usb1="C000247B" w:usb2="00000009" w:usb3="00000000" w:csb0="000001FF" w:csb1="00000000"/>
   </w:font>
   <w:font w:name="Avenir Next LT Pro">
     <w:altName w:val="Calibri"/>
@@ -9871,7 +10410,7 @@
     <w:charset w:val="00"/>
     <w:family w:val="swiss"/>
     <w:pitch w:val="variable"/>
-    <w:sig w:usb0="00000003" w:usb1="02000000" w:usb2="08000000" w:usb3="00000000" w:csb0="00000001" w:csb1="00000000"/>
+    <w:sig w:usb0="00000003" w:usb1="02000000" w:usb2="00000000" w:usb3="00000000" w:csb0="00000001" w:csb1="00000000"/>
   </w:font>
   <w:font w:name="Verdana">
     <w:panose1 w:val="020B0604030504040204"/>
@@ -9916,8 +10455,10 @@
     <w:rsid w:val="002A272A"/>
     <w:rsid w:val="00371805"/>
     <w:rsid w:val="004829CB"/>
+    <w:rsid w:val="004B75D5"/>
     <w:rsid w:val="004F54BB"/>
     <w:rsid w:val="007D1596"/>
+    <w:rsid w:val="007E79EC"/>
     <w:rsid w:val="008D20A3"/>
     <w:rsid w:val="00946403"/>
     <w:rsid w:val="00DD5D19"/>
@@ -9938,7 +10479,7 @@
   <w:themeFontLang w:val="nl-NL"/>
   <w:clrSchemeMapping w:bg1="light1" w:t1="dark1" w:bg2="light2" w:t2="dark2" w:accent1="accent1" w:accent2="accent2" w:accent3="accent3" w:accent4="accent4" w:accent5="accent5" w:accent6="accent6" w:hyperlink="hyperlink" w:followedHyperlink="followedHyperlink"/>
   <w:decimalSymbol w:val=","/>
-  <w:listSeparator w:val=";"/>
+  <w:listSeparator w:val=","/>
   <w15:chartTrackingRefBased/>
 </w:settings>
 </file>
@@ -10699,14 +11240,210 @@
 </file>
 
 <file path=customXml/item3.xml><?xml version="1.0" encoding="utf-8"?>
-<p:properties xmlns:p="http://schemas.microsoft.com/office/2006/metadata/properties" xmlns:xsi="http://www.w3.org/2001/XMLSchema-instance" xmlns:pc="http://schemas.microsoft.com/office/infopath/2007/PartnerControls">
-  <documentManagement>
-    <lcf76f155ced4ddcb4097134ff3c332f xmlns="70093741-41eb-4420-bf3d-ff9555ef2a33">
-      <Terms xmlns="http://schemas.microsoft.com/office/infopath/2007/PartnerControls"/>
-    </lcf76f155ced4ddcb4097134ff3c332f>
-    <TaxCatchAll xmlns="8e0d46a4-c7d4-472b-9541-810c49191871" xsi:nil="true"/>
-  </documentManagement>
-</p:properties>
+<ct:contentTypeSchema xmlns:ct="http://schemas.microsoft.com/office/2006/metadata/contentType" xmlns:ma="http://schemas.microsoft.com/office/2006/metadata/properties/metaAttributes" ct:_="" ma:_="" ma:contentTypeName="Document" ma:contentTypeID="0x0101009AEE7C0E3FC1AF49AE2D21952FC004E7" ma:contentTypeVersion="13" ma:contentTypeDescription="Een nieuw document maken." ma:contentTypeScope="" ma:versionID="960b10dc37b0d3729643b1edbc9ea311">
+  <xsd:schema xmlns:xsd="http://www.w3.org/2001/XMLSchema" xmlns:xs="http://www.w3.org/2001/XMLSchema" xmlns:p="http://schemas.microsoft.com/office/2006/metadata/properties" xmlns:ns2="70093741-41eb-4420-bf3d-ff9555ef2a33" xmlns:ns3="8e0d46a4-c7d4-472b-9541-810c49191871" targetNamespace="http://schemas.microsoft.com/office/2006/metadata/properties" ma:root="true" ma:fieldsID="8470fe0247e22942882bacf7112b3079" ns2:_="" ns3:_="">
+    <xsd:import namespace="70093741-41eb-4420-bf3d-ff9555ef2a33"/>
+    <xsd:import namespace="8e0d46a4-c7d4-472b-9541-810c49191871"/>
+    <xsd:element name="properties">
+      <xsd:complexType>
+        <xsd:sequence>
+          <xsd:element name="documentManagement">
+            <xsd:complexType>
+              <xsd:all>
+                <xsd:element ref="ns2:MediaServiceMetadata" minOccurs="0"/>
+                <xsd:element ref="ns2:MediaServiceFastMetadata" minOccurs="0"/>
+                <xsd:element ref="ns2:MediaServiceSearchProperties" minOccurs="0"/>
+                <xsd:element ref="ns2:MediaServiceDateTaken" minOccurs="0"/>
+                <xsd:element ref="ns2:MediaServiceGenerationTime" minOccurs="0"/>
+                <xsd:element ref="ns2:MediaServiceEventHashCode" minOccurs="0"/>
+                <xsd:element ref="ns2:MediaLengthInSeconds" minOccurs="0"/>
+                <xsd:element ref="ns2:lcf76f155ced4ddcb4097134ff3c332f" minOccurs="0"/>
+                <xsd:element ref="ns3:TaxCatchAll" minOccurs="0"/>
+                <xsd:element ref="ns2:MediaServiceOCR" minOccurs="0"/>
+                <xsd:element ref="ns2:MediaServiceBillingMetadata" minOccurs="0"/>
+                <xsd:element ref="ns2:MediaServiceLocation" minOccurs="0"/>
+              </xsd:all>
+            </xsd:complexType>
+          </xsd:element>
+        </xsd:sequence>
+      </xsd:complexType>
+    </xsd:element>
+  </xsd:schema>
+  <xsd:schema xmlns:xsd="http://www.w3.org/2001/XMLSchema" xmlns:xs="http://www.w3.org/2001/XMLSchema" xmlns:dms="http://schemas.microsoft.com/office/2006/documentManagement/types" xmlns:pc="http://schemas.microsoft.com/office/infopath/2007/PartnerControls" targetNamespace="70093741-41eb-4420-bf3d-ff9555ef2a33" elementFormDefault="qualified">
+    <xsd:import namespace="http://schemas.microsoft.com/office/2006/documentManagement/types"/>
+    <xsd:import namespace="http://schemas.microsoft.com/office/infopath/2007/PartnerControls"/>
+    <xsd:element name="MediaServiceMetadata" ma:index="8" nillable="true" ma:displayName="MediaServiceMetadata" ma:hidden="true" ma:internalName="MediaServiceMetadata" ma:readOnly="true">
+      <xsd:simpleType>
+        <xsd:restriction base="dms:Note"/>
+      </xsd:simpleType>
+    </xsd:element>
+    <xsd:element name="MediaServiceFastMetadata" ma:index="9" nillable="true" ma:displayName="MediaServiceFastMetadata" ma:hidden="true" ma:internalName="MediaServiceFastMetadata" ma:readOnly="true">
+      <xsd:simpleType>
+        <xsd:restriction base="dms:Note"/>
+      </xsd:simpleType>
+    </xsd:element>
+    <xsd:element name="MediaServiceSearchProperties" ma:index="10" nillable="true" ma:displayName="MediaServiceSearchProperties" ma:hidden="true" ma:internalName="MediaServiceSearchProperties" ma:readOnly="true">
+      <xsd:simpleType>
+        <xsd:restriction base="dms:Note"/>
+      </xsd:simpleType>
+    </xsd:element>
+    <xsd:element name="MediaServiceDateTaken" ma:index="11" nillable="true" ma:displayName="MediaServiceDateTaken" ma:hidden="true" ma:indexed="true" ma:internalName="MediaServiceDateTaken" ma:readOnly="true">
+      <xsd:simpleType>
+        <xsd:restriction base="dms:Text"/>
+      </xsd:simpleType>
+    </xsd:element>
+    <xsd:element name="MediaServiceGenerationTime" ma:index="12" nillable="true" ma:displayName="MediaServiceGenerationTime" ma:hidden="true" ma:internalName="MediaServiceGenerationTime" ma:readOnly="true">
+      <xsd:simpleType>
+        <xsd:restriction base="dms:Text"/>
+      </xsd:simpleType>
+    </xsd:element>
+    <xsd:element name="MediaServiceEventHashCode" ma:index="13" nillable="true" ma:displayName="MediaServiceEventHashCode" ma:hidden="true" ma:internalName="MediaServiceEventHashCode" ma:readOnly="true">
+      <xsd:simpleType>
+        <xsd:restriction base="dms:Text"/>
+      </xsd:simpleType>
+    </xsd:element>
+    <xsd:element name="MediaLengthInSeconds" ma:index="14" nillable="true" ma:displayName="MediaLengthInSeconds" ma:hidden="true" ma:internalName="MediaLengthInSeconds" ma:readOnly="true">
+      <xsd:simpleType>
+        <xsd:restriction base="dms:Unknown"/>
+      </xsd:simpleType>
+    </xsd:element>
+    <xsd:element name="lcf76f155ced4ddcb4097134ff3c332f" ma:index="16" nillable="true" ma:taxonomy="true" ma:internalName="lcf76f155ced4ddcb4097134ff3c332f" ma:taxonomyFieldName="MediaServiceImageTags" ma:displayName="Afbeeldingtags" ma:readOnly="false" ma:fieldId="{5cf76f15-5ced-4ddc-b409-7134ff3c332f}" ma:taxonomyMulti="true" ma:sspId="5bd69f14-2b9f-433c-9887-fccfa466e118" ma:termSetId="09814cd3-568e-fe90-9814-8d621ff8fb84" ma:anchorId="fba54fb3-c3e1-fe81-a776-ca4b69148c4d" ma:open="true" ma:isKeyword="false">
+      <xsd:complexType>
+        <xsd:sequence>
+          <xsd:element ref="pc:Terms" minOccurs="0" maxOccurs="1"/>
+        </xsd:sequence>
+      </xsd:complexType>
+    </xsd:element>
+    <xsd:element name="MediaServiceOCR" ma:index="18" nillable="true" ma:displayName="Extracted Text" ma:internalName="MediaServiceOCR" ma:readOnly="true">
+      <xsd:simpleType>
+        <xsd:restriction base="dms:Note">
+          <xsd:maxLength value="255"/>
+        </xsd:restriction>
+      </xsd:simpleType>
+    </xsd:element>
+    <xsd:element name="MediaServiceBillingMetadata" ma:index="19" nillable="true" ma:displayName="MediaServiceBillingMetadata" ma:hidden="true" ma:internalName="MediaServiceBillingMetadata" ma:readOnly="true">
+      <xsd:simpleType>
+        <xsd:restriction base="dms:Note"/>
+      </xsd:simpleType>
+    </xsd:element>
+    <xsd:element name="MediaServiceLocation" ma:index="20" nillable="true" ma:displayName="Location" ma:description="" ma:indexed="true" ma:internalName="MediaServiceLocation" ma:readOnly="true">
+      <xsd:simpleType>
+        <xsd:restriction base="dms:Text"/>
+      </xsd:simpleType>
+    </xsd:element>
+  </xsd:schema>
+  <xsd:schema xmlns:xsd="http://www.w3.org/2001/XMLSchema" xmlns:xs="http://www.w3.org/2001/XMLSchema" xmlns:dms="http://schemas.microsoft.com/office/2006/documentManagement/types" xmlns:pc="http://schemas.microsoft.com/office/infopath/2007/PartnerControls" targetNamespace="8e0d46a4-c7d4-472b-9541-810c49191871" elementFormDefault="qualified">
+    <xsd:import namespace="http://schemas.microsoft.com/office/2006/documentManagement/types"/>
+    <xsd:import namespace="http://schemas.microsoft.com/office/infopath/2007/PartnerControls"/>
+    <xsd:element name="TaxCatchAll" ma:index="17" nillable="true" ma:displayName="Taxonomy Catch All Column" ma:hidden="true" ma:list="{c8ab18b9-6097-49a0-8cf1-8fd8c6c84254}" ma:internalName="TaxCatchAll" ma:showField="CatchAllData" ma:web="8e0d46a4-c7d4-472b-9541-810c49191871">
+      <xsd:complexType>
+        <xsd:complexContent>
+          <xsd:extension base="dms:MultiChoiceLookup">
+            <xsd:sequence>
+              <xsd:element name="Value" type="dms:Lookup" maxOccurs="unbounded" minOccurs="0" nillable="true"/>
+            </xsd:sequence>
+          </xsd:extension>
+        </xsd:complexContent>
+      </xsd:complexType>
+    </xsd:element>
+  </xsd:schema>
+  <xsd:schema xmlns="http://schemas.openxmlformats.org/package/2006/metadata/core-properties" xmlns:xsd="http://www.w3.org/2001/XMLSchema" xmlns:xsi="http://www.w3.org/2001/XMLSchema-instance" xmlns:dc="http://purl.org/dc/elements/1.1/" xmlns:dcterms="http://purl.org/dc/terms/" xmlns:odoc="http://schemas.microsoft.com/internal/obd" targetNamespace="http://schemas.openxmlformats.org/package/2006/metadata/core-properties" elementFormDefault="qualified" attributeFormDefault="unqualified" blockDefault="#all">
+    <xsd:import namespace="http://purl.org/dc/elements/1.1/" schemaLocation="http://dublincore.org/schemas/xmls/qdc/2003/04/02/dc.xsd"/>
+    <xsd:import namespace="http://purl.org/dc/terms/" schemaLocation="http://dublincore.org/schemas/xmls/qdc/2003/04/02/dcterms.xsd"/>
+    <xsd:element name="coreProperties" type="CT_coreProperties"/>
+    <xsd:complexType name="CT_coreProperties">
+      <xsd:all>
+        <xsd:element ref="dc:creator" minOccurs="0" maxOccurs="1"/>
+        <xsd:element ref="dcterms:created" minOccurs="0" maxOccurs="1"/>
+        <xsd:element ref="dc:identifier" minOccurs="0" maxOccurs="1"/>
+        <xsd:element name="contentType" minOccurs="0" maxOccurs="1" type="xsd:string" ma:index="0" ma:displayName="Inhoudstype"/>
+        <xsd:element ref="dc:title" minOccurs="0" maxOccurs="1" ma:index="4" ma:displayName="Titel"/>
+        <xsd:element ref="dc:subject" minOccurs="0" maxOccurs="1"/>
+        <xsd:element ref="dc:description" minOccurs="0" maxOccurs="1"/>
+        <xsd:element name="keywords" minOccurs="0" maxOccurs="1" type="xsd:string"/>
+        <xsd:element ref="dc:language" minOccurs="0" maxOccurs="1"/>
+        <xsd:element name="category" minOccurs="0" maxOccurs="1" type="xsd:string"/>
+        <xsd:element name="version" minOccurs="0" maxOccurs="1" type="xsd:string"/>
+        <xsd:element name="revision" minOccurs="0" maxOccurs="1" type="xsd:string">
+          <xsd:annotation>
+            <xsd:documentation>
+                        This value indicates the number of saves or revisions. The application is responsible for updating this value after each revision.
+                    </xsd:documentation>
+          </xsd:annotation>
+        </xsd:element>
+        <xsd:element name="lastModifiedBy" minOccurs="0" maxOccurs="1" type="xsd:string"/>
+        <xsd:element ref="dcterms:modified" minOccurs="0" maxOccurs="1"/>
+        <xsd:element name="contentStatus" minOccurs="0" maxOccurs="1" type="xsd:string"/>
+      </xsd:all>
+    </xsd:complexType>
+  </xsd:schema>
+  <xs:schema xmlns:pc="http://schemas.microsoft.com/office/infopath/2007/PartnerControls" xmlns:xs="http://www.w3.org/2001/XMLSchema" targetNamespace="http://schemas.microsoft.com/office/infopath/2007/PartnerControls" elementFormDefault="qualified" attributeFormDefault="unqualified">
+    <xs:element name="Person">
+      <xs:complexType>
+        <xs:sequence>
+          <xs:element ref="pc:DisplayName" minOccurs="0"/>
+          <xs:element ref="pc:AccountId" minOccurs="0"/>
+          <xs:element ref="pc:AccountType" minOccurs="0"/>
+        </xs:sequence>
+      </xs:complexType>
+    </xs:element>
+    <xs:element name="DisplayName" type="xs:string"/>
+    <xs:element name="AccountId" type="xs:string"/>
+    <xs:element name="AccountType" type="xs:string"/>
+    <xs:element name="BDCAssociatedEntity">
+      <xs:complexType>
+        <xs:sequence>
+          <xs:element ref="pc:BDCEntity" minOccurs="0" maxOccurs="unbounded"/>
+        </xs:sequence>
+        <xs:attribute ref="pc:EntityNamespace"/>
+        <xs:attribute ref="pc:EntityName"/>
+        <xs:attribute ref="pc:SystemInstanceName"/>
+        <xs:attribute ref="pc:AssociationName"/>
+      </xs:complexType>
+    </xs:element>
+    <xs:attribute name="EntityNamespace" type="xs:string"/>
+    <xs:attribute name="EntityName" type="xs:string"/>
+    <xs:attribute name="SystemInstanceName" type="xs:string"/>
+    <xs:attribute name="AssociationName" type="xs:string"/>
+    <xs:element name="BDCEntity">
+      <xs:complexType>
+        <xs:sequence>
+          <xs:element ref="pc:EntityDisplayName" minOccurs="0"/>
+          <xs:element ref="pc:EntityInstanceReference" minOccurs="0"/>
+          <xs:element ref="pc:EntityId1" minOccurs="0"/>
+          <xs:element ref="pc:EntityId2" minOccurs="0"/>
+          <xs:element ref="pc:EntityId3" minOccurs="0"/>
+          <xs:element ref="pc:EntityId4" minOccurs="0"/>
+          <xs:element ref="pc:EntityId5" minOccurs="0"/>
+        </xs:sequence>
+      </xs:complexType>
+    </xs:element>
+    <xs:element name="EntityDisplayName" type="xs:string"/>
+    <xs:element name="EntityInstanceReference" type="xs:string"/>
+    <xs:element name="EntityId1" type="xs:string"/>
+    <xs:element name="EntityId2" type="xs:string"/>
+    <xs:element name="EntityId3" type="xs:string"/>
+    <xs:element name="EntityId4" type="xs:string"/>
+    <xs:element name="EntityId5" type="xs:string"/>
+    <xs:element name="Terms">
+      <xs:complexType>
+        <xs:sequence>
+          <xs:element ref="pc:TermInfo" minOccurs="0" maxOccurs="unbounded"/>
+        </xs:sequence>
+      </xs:complexType>
+    </xs:element>
+    <xs:element name="TermInfo">
+      <xs:complexType>
+        <xs:sequence>
+          <xs:element ref="pc:TermName" minOccurs="0"/>
+          <xs:element ref="pc:TermId" minOccurs="0"/>
+        </xs:sequence>
+      </xs:complexType>
+    </xs:element>
+    <xs:element name="TermName" type="xs:string"/>
+    <xs:element name="TermId" type="xs:string"/>
+  </xs:schema>
+</ct:contentTypeSchema>
 </file>
 
 <file path=customXml/item4.xml><?xml version="1.0" encoding="utf-8"?>
@@ -11090,210 +11827,14 @@
 </file>
 
 <file path=customXml/item5.xml><?xml version="1.0" encoding="utf-8"?>
-<ct:contentTypeSchema xmlns:ct="http://schemas.microsoft.com/office/2006/metadata/contentType" xmlns:ma="http://schemas.microsoft.com/office/2006/metadata/properties/metaAttributes" ct:_="" ma:_="" ma:contentTypeName="Document" ma:contentTypeID="0x0101009AEE7C0E3FC1AF49AE2D21952FC004E7" ma:contentTypeVersion="13" ma:contentTypeDescription="Een nieuw document maken." ma:contentTypeScope="" ma:versionID="960b10dc37b0d3729643b1edbc9ea311">
-  <xsd:schema xmlns:xsd="http://www.w3.org/2001/XMLSchema" xmlns:xs="http://www.w3.org/2001/XMLSchema" xmlns:p="http://schemas.microsoft.com/office/2006/metadata/properties" xmlns:ns2="70093741-41eb-4420-bf3d-ff9555ef2a33" xmlns:ns3="8e0d46a4-c7d4-472b-9541-810c49191871" targetNamespace="http://schemas.microsoft.com/office/2006/metadata/properties" ma:root="true" ma:fieldsID="8470fe0247e22942882bacf7112b3079" ns2:_="" ns3:_="">
-    <xsd:import namespace="70093741-41eb-4420-bf3d-ff9555ef2a33"/>
-    <xsd:import namespace="8e0d46a4-c7d4-472b-9541-810c49191871"/>
-    <xsd:element name="properties">
-      <xsd:complexType>
-        <xsd:sequence>
-          <xsd:element name="documentManagement">
-            <xsd:complexType>
-              <xsd:all>
-                <xsd:element ref="ns2:MediaServiceMetadata" minOccurs="0"/>
-                <xsd:element ref="ns2:MediaServiceFastMetadata" minOccurs="0"/>
-                <xsd:element ref="ns2:MediaServiceSearchProperties" minOccurs="0"/>
-                <xsd:element ref="ns2:MediaServiceDateTaken" minOccurs="0"/>
-                <xsd:element ref="ns2:MediaServiceGenerationTime" minOccurs="0"/>
-                <xsd:element ref="ns2:MediaServiceEventHashCode" minOccurs="0"/>
-                <xsd:element ref="ns2:MediaLengthInSeconds" minOccurs="0"/>
-                <xsd:element ref="ns2:lcf76f155ced4ddcb4097134ff3c332f" minOccurs="0"/>
-                <xsd:element ref="ns3:TaxCatchAll" minOccurs="0"/>
-                <xsd:element ref="ns2:MediaServiceOCR" minOccurs="0"/>
-                <xsd:element ref="ns2:MediaServiceBillingMetadata" minOccurs="0"/>
-                <xsd:element ref="ns2:MediaServiceLocation" minOccurs="0"/>
-              </xsd:all>
-            </xsd:complexType>
-          </xsd:element>
-        </xsd:sequence>
-      </xsd:complexType>
-    </xsd:element>
-  </xsd:schema>
-  <xsd:schema xmlns:xsd="http://www.w3.org/2001/XMLSchema" xmlns:xs="http://www.w3.org/2001/XMLSchema" xmlns:dms="http://schemas.microsoft.com/office/2006/documentManagement/types" xmlns:pc="http://schemas.microsoft.com/office/infopath/2007/PartnerControls" targetNamespace="70093741-41eb-4420-bf3d-ff9555ef2a33" elementFormDefault="qualified">
-    <xsd:import namespace="http://schemas.microsoft.com/office/2006/documentManagement/types"/>
-    <xsd:import namespace="http://schemas.microsoft.com/office/infopath/2007/PartnerControls"/>
-    <xsd:element name="MediaServiceMetadata" ma:index="8" nillable="true" ma:displayName="MediaServiceMetadata" ma:hidden="true" ma:internalName="MediaServiceMetadata" ma:readOnly="true">
-      <xsd:simpleType>
-        <xsd:restriction base="dms:Note"/>
-      </xsd:simpleType>
-    </xsd:element>
-    <xsd:element name="MediaServiceFastMetadata" ma:index="9" nillable="true" ma:displayName="MediaServiceFastMetadata" ma:hidden="true" ma:internalName="MediaServiceFastMetadata" ma:readOnly="true">
-      <xsd:simpleType>
-        <xsd:restriction base="dms:Note"/>
-      </xsd:simpleType>
-    </xsd:element>
-    <xsd:element name="MediaServiceSearchProperties" ma:index="10" nillable="true" ma:displayName="MediaServiceSearchProperties" ma:hidden="true" ma:internalName="MediaServiceSearchProperties" ma:readOnly="true">
-      <xsd:simpleType>
-        <xsd:restriction base="dms:Note"/>
-      </xsd:simpleType>
-    </xsd:element>
-    <xsd:element name="MediaServiceDateTaken" ma:index="11" nillable="true" ma:displayName="MediaServiceDateTaken" ma:hidden="true" ma:indexed="true" ma:internalName="MediaServiceDateTaken" ma:readOnly="true">
-      <xsd:simpleType>
-        <xsd:restriction base="dms:Text"/>
-      </xsd:simpleType>
-    </xsd:element>
-    <xsd:element name="MediaServiceGenerationTime" ma:index="12" nillable="true" ma:displayName="MediaServiceGenerationTime" ma:hidden="true" ma:internalName="MediaServiceGenerationTime" ma:readOnly="true">
-      <xsd:simpleType>
-        <xsd:restriction base="dms:Text"/>
-      </xsd:simpleType>
-    </xsd:element>
-    <xsd:element name="MediaServiceEventHashCode" ma:index="13" nillable="true" ma:displayName="MediaServiceEventHashCode" ma:hidden="true" ma:internalName="MediaServiceEventHashCode" ma:readOnly="true">
-      <xsd:simpleType>
-        <xsd:restriction base="dms:Text"/>
-      </xsd:simpleType>
-    </xsd:element>
-    <xsd:element name="MediaLengthInSeconds" ma:index="14" nillable="true" ma:displayName="MediaLengthInSeconds" ma:hidden="true" ma:internalName="MediaLengthInSeconds" ma:readOnly="true">
-      <xsd:simpleType>
-        <xsd:restriction base="dms:Unknown"/>
-      </xsd:simpleType>
-    </xsd:element>
-    <xsd:element name="lcf76f155ced4ddcb4097134ff3c332f" ma:index="16" nillable="true" ma:taxonomy="true" ma:internalName="lcf76f155ced4ddcb4097134ff3c332f" ma:taxonomyFieldName="MediaServiceImageTags" ma:displayName="Afbeeldingtags" ma:readOnly="false" ma:fieldId="{5cf76f15-5ced-4ddc-b409-7134ff3c332f}" ma:taxonomyMulti="true" ma:sspId="5bd69f14-2b9f-433c-9887-fccfa466e118" ma:termSetId="09814cd3-568e-fe90-9814-8d621ff8fb84" ma:anchorId="fba54fb3-c3e1-fe81-a776-ca4b69148c4d" ma:open="true" ma:isKeyword="false">
-      <xsd:complexType>
-        <xsd:sequence>
-          <xsd:element ref="pc:Terms" minOccurs="0" maxOccurs="1"/>
-        </xsd:sequence>
-      </xsd:complexType>
-    </xsd:element>
-    <xsd:element name="MediaServiceOCR" ma:index="18" nillable="true" ma:displayName="Extracted Text" ma:internalName="MediaServiceOCR" ma:readOnly="true">
-      <xsd:simpleType>
-        <xsd:restriction base="dms:Note">
-          <xsd:maxLength value="255"/>
-        </xsd:restriction>
-      </xsd:simpleType>
-    </xsd:element>
-    <xsd:element name="MediaServiceBillingMetadata" ma:index="19" nillable="true" ma:displayName="MediaServiceBillingMetadata" ma:hidden="true" ma:internalName="MediaServiceBillingMetadata" ma:readOnly="true">
-      <xsd:simpleType>
-        <xsd:restriction base="dms:Note"/>
-      </xsd:simpleType>
-    </xsd:element>
-    <xsd:element name="MediaServiceLocation" ma:index="20" nillable="true" ma:displayName="Location" ma:description="" ma:indexed="true" ma:internalName="MediaServiceLocation" ma:readOnly="true">
-      <xsd:simpleType>
-        <xsd:restriction base="dms:Text"/>
-      </xsd:simpleType>
-    </xsd:element>
-  </xsd:schema>
-  <xsd:schema xmlns:xsd="http://www.w3.org/2001/XMLSchema" xmlns:xs="http://www.w3.org/2001/XMLSchema" xmlns:dms="http://schemas.microsoft.com/office/2006/documentManagement/types" xmlns:pc="http://schemas.microsoft.com/office/infopath/2007/PartnerControls" targetNamespace="8e0d46a4-c7d4-472b-9541-810c49191871" elementFormDefault="qualified">
-    <xsd:import namespace="http://schemas.microsoft.com/office/2006/documentManagement/types"/>
-    <xsd:import namespace="http://schemas.microsoft.com/office/infopath/2007/PartnerControls"/>
-    <xsd:element name="TaxCatchAll" ma:index="17" nillable="true" ma:displayName="Taxonomy Catch All Column" ma:hidden="true" ma:list="{c8ab18b9-6097-49a0-8cf1-8fd8c6c84254}" ma:internalName="TaxCatchAll" ma:showField="CatchAllData" ma:web="8e0d46a4-c7d4-472b-9541-810c49191871">
-      <xsd:complexType>
-        <xsd:complexContent>
-          <xsd:extension base="dms:MultiChoiceLookup">
-            <xsd:sequence>
-              <xsd:element name="Value" type="dms:Lookup" maxOccurs="unbounded" minOccurs="0" nillable="true"/>
-            </xsd:sequence>
-          </xsd:extension>
-        </xsd:complexContent>
-      </xsd:complexType>
-    </xsd:element>
-  </xsd:schema>
-  <xsd:schema xmlns="http://schemas.openxmlformats.org/package/2006/metadata/core-properties" xmlns:xsd="http://www.w3.org/2001/XMLSchema" xmlns:xsi="http://www.w3.org/2001/XMLSchema-instance" xmlns:dc="http://purl.org/dc/elements/1.1/" xmlns:dcterms="http://purl.org/dc/terms/" xmlns:odoc="http://schemas.microsoft.com/internal/obd" targetNamespace="http://schemas.openxmlformats.org/package/2006/metadata/core-properties" elementFormDefault="qualified" attributeFormDefault="unqualified" blockDefault="#all">
-    <xsd:import namespace="http://purl.org/dc/elements/1.1/" schemaLocation="http://dublincore.org/schemas/xmls/qdc/2003/04/02/dc.xsd"/>
-    <xsd:import namespace="http://purl.org/dc/terms/" schemaLocation="http://dublincore.org/schemas/xmls/qdc/2003/04/02/dcterms.xsd"/>
-    <xsd:element name="coreProperties" type="CT_coreProperties"/>
-    <xsd:complexType name="CT_coreProperties">
-      <xsd:all>
-        <xsd:element ref="dc:creator" minOccurs="0" maxOccurs="1"/>
-        <xsd:element ref="dcterms:created" minOccurs="0" maxOccurs="1"/>
-        <xsd:element ref="dc:identifier" minOccurs="0" maxOccurs="1"/>
-        <xsd:element name="contentType" minOccurs="0" maxOccurs="1" type="xsd:string" ma:index="0" ma:displayName="Inhoudstype"/>
-        <xsd:element ref="dc:title" minOccurs="0" maxOccurs="1" ma:index="4" ma:displayName="Titel"/>
-        <xsd:element ref="dc:subject" minOccurs="0" maxOccurs="1"/>
-        <xsd:element ref="dc:description" minOccurs="0" maxOccurs="1"/>
-        <xsd:element name="keywords" minOccurs="0" maxOccurs="1" type="xsd:string"/>
-        <xsd:element ref="dc:language" minOccurs="0" maxOccurs="1"/>
-        <xsd:element name="category" minOccurs="0" maxOccurs="1" type="xsd:string"/>
-        <xsd:element name="version" minOccurs="0" maxOccurs="1" type="xsd:string"/>
-        <xsd:element name="revision" minOccurs="0" maxOccurs="1" type="xsd:string">
-          <xsd:annotation>
-            <xsd:documentation>
-                        This value indicates the number of saves or revisions. The application is responsible for updating this value after each revision.
-                    </xsd:documentation>
-          </xsd:annotation>
-        </xsd:element>
-        <xsd:element name="lastModifiedBy" minOccurs="0" maxOccurs="1" type="xsd:string"/>
-        <xsd:element ref="dcterms:modified" minOccurs="0" maxOccurs="1"/>
-        <xsd:element name="contentStatus" minOccurs="0" maxOccurs="1" type="xsd:string"/>
-      </xsd:all>
-    </xsd:complexType>
-  </xsd:schema>
-  <xs:schema xmlns:pc="http://schemas.microsoft.com/office/infopath/2007/PartnerControls" xmlns:xs="http://www.w3.org/2001/XMLSchema" targetNamespace="http://schemas.microsoft.com/office/infopath/2007/PartnerControls" elementFormDefault="qualified" attributeFormDefault="unqualified">
-    <xs:element name="Person">
-      <xs:complexType>
-        <xs:sequence>
-          <xs:element ref="pc:DisplayName" minOccurs="0"/>
-          <xs:element ref="pc:AccountId" minOccurs="0"/>
-          <xs:element ref="pc:AccountType" minOccurs="0"/>
-        </xs:sequence>
-      </xs:complexType>
-    </xs:element>
-    <xs:element name="DisplayName" type="xs:string"/>
-    <xs:element name="AccountId" type="xs:string"/>
-    <xs:element name="AccountType" type="xs:string"/>
-    <xs:element name="BDCAssociatedEntity">
-      <xs:complexType>
-        <xs:sequence>
-          <xs:element ref="pc:BDCEntity" minOccurs="0" maxOccurs="unbounded"/>
-        </xs:sequence>
-        <xs:attribute ref="pc:EntityNamespace"/>
-        <xs:attribute ref="pc:EntityName"/>
-        <xs:attribute ref="pc:SystemInstanceName"/>
-        <xs:attribute ref="pc:AssociationName"/>
-      </xs:complexType>
-    </xs:element>
-    <xs:attribute name="EntityNamespace" type="xs:string"/>
-    <xs:attribute name="EntityName" type="xs:string"/>
-    <xs:attribute name="SystemInstanceName" type="xs:string"/>
-    <xs:attribute name="AssociationName" type="xs:string"/>
-    <xs:element name="BDCEntity">
-      <xs:complexType>
-        <xs:sequence>
-          <xs:element ref="pc:EntityDisplayName" minOccurs="0"/>
-          <xs:element ref="pc:EntityInstanceReference" minOccurs="0"/>
-          <xs:element ref="pc:EntityId1" minOccurs="0"/>
-          <xs:element ref="pc:EntityId2" minOccurs="0"/>
-          <xs:element ref="pc:EntityId3" minOccurs="0"/>
-          <xs:element ref="pc:EntityId4" minOccurs="0"/>
-          <xs:element ref="pc:EntityId5" minOccurs="0"/>
-        </xs:sequence>
-      </xs:complexType>
-    </xs:element>
-    <xs:element name="EntityDisplayName" type="xs:string"/>
-    <xs:element name="EntityInstanceReference" type="xs:string"/>
-    <xs:element name="EntityId1" type="xs:string"/>
-    <xs:element name="EntityId2" type="xs:string"/>
-    <xs:element name="EntityId3" type="xs:string"/>
-    <xs:element name="EntityId4" type="xs:string"/>
-    <xs:element name="EntityId5" type="xs:string"/>
-    <xs:element name="Terms">
-      <xs:complexType>
-        <xs:sequence>
-          <xs:element ref="pc:TermInfo" minOccurs="0" maxOccurs="unbounded"/>
-        </xs:sequence>
-      </xs:complexType>
-    </xs:element>
-    <xs:element name="TermInfo">
-      <xs:complexType>
-        <xs:sequence>
-          <xs:element ref="pc:TermName" minOccurs="0"/>
-          <xs:element ref="pc:TermId" minOccurs="0"/>
-        </xs:sequence>
-      </xs:complexType>
-    </xs:element>
-    <xs:element name="TermName" type="xs:string"/>
-    <xs:element name="TermId" type="xs:string"/>
-  </xs:schema>
-</ct:contentTypeSchema>
+<p:properties xmlns:p="http://schemas.microsoft.com/office/2006/metadata/properties" xmlns:xsi="http://www.w3.org/2001/XMLSchema-instance" xmlns:pc="http://schemas.microsoft.com/office/infopath/2007/PartnerControls">
+  <documentManagement>
+    <lcf76f155ced4ddcb4097134ff3c332f xmlns="70093741-41eb-4420-bf3d-ff9555ef2a33">
+      <Terms xmlns="http://schemas.microsoft.com/office/infopath/2007/PartnerControls"/>
+    </lcf76f155ced4ddcb4097134ff3c332f>
+    <TaxCatchAll xmlns="8e0d46a4-c7d4-472b-9541-810c49191871" xsi:nil="true"/>
+  </documentManagement>
+</p:properties>
 </file>
 
 <file path=customXml/itemProps1.xml><?xml version="1.0" encoding="utf-8"?>
@@ -11313,25 +11854,6 @@
 </file>
 
 <file path=customXml/itemProps3.xml><?xml version="1.0" encoding="utf-8"?>
-<ds:datastoreItem xmlns:ds="http://schemas.openxmlformats.org/officeDocument/2006/customXml" ds:itemID="{AFA79D07-4CBE-44F8-96D9-EF1619A15533}">
-  <ds:schemaRefs>
-    <ds:schemaRef ds:uri="http://schemas.microsoft.com/office/2006/metadata/properties"/>
-    <ds:schemaRef ds:uri="http://schemas.microsoft.com/office/infopath/2007/PartnerControls"/>
-    <ds:schemaRef ds:uri="70093741-41eb-4420-bf3d-ff9555ef2a33"/>
-    <ds:schemaRef ds:uri="8e0d46a4-c7d4-472b-9541-810c49191871"/>
-  </ds:schemaRefs>
-</ds:datastoreItem>
-</file>
-
-<file path=customXml/itemProps4.xml><?xml version="1.0" encoding="utf-8"?>
-<ds:datastoreItem xmlns:ds="http://schemas.openxmlformats.org/officeDocument/2006/customXml" ds:itemID="{A78D1BFD-FB21-4E94-A897-6F9CD570B4EA}">
-  <ds:schemaRefs>
-    <ds:schemaRef ds:uri="http://schemas.openxmlformats.org/officeDocument/2006/bibliography"/>
-  </ds:schemaRefs>
-</ds:datastoreItem>
-</file>
-
-<file path=customXml/itemProps5.xml><?xml version="1.0" encoding="utf-8"?>
 <ds:datastoreItem xmlns:ds="http://schemas.openxmlformats.org/officeDocument/2006/customXml" ds:itemID="{1D334DBD-E327-428E-966E-5E0935AA8778}">
   <ds:schemaRefs>
     <ds:schemaRef ds:uri="http://schemas.microsoft.com/office/2006/metadata/contentType"/>
@@ -11348,4 +11870,23 @@
     <ds:schemaRef ds:uri="http://schemas.microsoft.com/internal/obd"/>
   </ds:schemaRefs>
 </ds:datastoreItem>
+</file>
+
+<file path=customXml/itemProps4.xml><?xml version="1.0" encoding="utf-8"?>
+<ds:datastoreItem xmlns:ds="http://schemas.openxmlformats.org/officeDocument/2006/customXml" ds:itemID="{A78D1BFD-FB21-4E94-A897-6F9CD570B4EA}">
+  <ds:schemaRefs>
+    <ds:schemaRef ds:uri="http://schemas.openxmlformats.org/officeDocument/2006/bibliography"/>
+  </ds:schemaRefs>
+</ds:datastoreItem>
+</file>
+
+<file path=customXml/itemProps5.xml><?xml version="1.0" encoding="utf-8"?>
+<ds:datastoreItem xmlns:ds="http://schemas.openxmlformats.org/officeDocument/2006/customXml" ds:itemID="{AFA79D07-4CBE-44F8-96D9-EF1619A15533}">
+  <ds:schemaRefs>
+    <ds:schemaRef ds:uri="http://schemas.microsoft.com/office/2006/metadata/properties"/>
+    <ds:schemaRef ds:uri="http://schemas.microsoft.com/office/infopath/2007/PartnerControls"/>
+    <ds:schemaRef ds:uri="70093741-41eb-4420-bf3d-ff9555ef2a33"/>
+    <ds:schemaRef ds:uri="8e0d46a4-c7d4-472b-9541-810c49191871"/>
+  </ds:schemaRefs>
+</ds:datastoreItem>
 </file>
</xml_diff>

<commit_message>
Added Belbin role for Connor.
</commit_message>
<xml_diff>
--- a/ZKOO3_PvA.docx
+++ b/ZKOO3_PvA.docx
@@ -545,27 +545,7 @@
           <w:sz w:val="24"/>
           <w:szCs w:val="24"/>
         </w:rPr>
-        <w:t xml:space="preserve">Module Data </w:t>
-      </w:r>
-      <w:proofErr w:type="spellStart"/>
-      <w:r>
-        <w:rPr>
-          <w:b/>
-          <w:bCs/>
-          <w:sz w:val="24"/>
-          <w:szCs w:val="24"/>
-        </w:rPr>
-        <w:t>Protection</w:t>
-      </w:r>
-      <w:proofErr w:type="spellEnd"/>
-      <w:r>
-        <w:rPr>
-          <w:b/>
-          <w:bCs/>
-          <w:sz w:val="24"/>
-          <w:szCs w:val="24"/>
-        </w:rPr>
-        <w:t xml:space="preserve"> Leerjaar 2 blok 1</w:t>
+        <w:t>Module Data Protection Leerjaar 2 blok 1</w:t>
       </w:r>
     </w:p>
     <w:p>
@@ -1718,28 +1698,18 @@
       <w:r>
         <w:t xml:space="preserve">De opdrachtgever </w:t>
       </w:r>
-      <w:proofErr w:type="spellStart"/>
       <w:r>
         <w:t>Aan</w:t>
       </w:r>
       <w:r>
-        <w:t>ZKOO</w:t>
-      </w:r>
-      <w:proofErr w:type="spellEnd"/>
-      <w:r>
-        <w:t xml:space="preserve"> (Zorg</w:t>
+        <w:t>ZKOO (Zorg</w:t>
       </w:r>
       <w:r>
         <w:t xml:space="preserve"> </w:t>
       </w:r>
       <w:r>
-        <w:t xml:space="preserve">Kwaliteit </w:t>
-      </w:r>
-      <w:proofErr w:type="spellStart"/>
-      <w:r>
-        <w:t>Ondersteunings</w:t>
-      </w:r>
-      <w:proofErr w:type="spellEnd"/>
+        <w:t>Kwaliteit Ondersteunings</w:t>
+      </w:r>
       <w:r>
         <w:t xml:space="preserve"> </w:t>
       </w:r>
@@ -1989,16 +1959,8 @@
         <w:rPr>
           <w:rFonts w:ascii="Avenir Next LT Pro" w:hAnsi="Avenir Next LT Pro"/>
         </w:rPr>
-        <w:t xml:space="preserve">Toegangsbeheer en </w:t>
-      </w:r>
-      <w:proofErr w:type="spellStart"/>
-      <w:r>
-        <w:rPr>
-          <w:rFonts w:ascii="Avenir Next LT Pro" w:hAnsi="Avenir Next LT Pro"/>
-        </w:rPr>
-        <w:t>logging</w:t>
-      </w:r>
-      <w:proofErr w:type="spellEnd"/>
+        <w:t>Toegangsbeheer en logging</w:t>
+      </w:r>
     </w:p>
     <w:p>
       <w:pPr>
@@ -2020,23 +1982,7 @@
     </w:p>
     <w:p>
       <w:r>
-        <w:t xml:space="preserve">ZKOO werkt met moderne </w:t>
-      </w:r>
-      <w:proofErr w:type="spellStart"/>
-      <w:r>
-        <w:t>cloudomgevingen</w:t>
-      </w:r>
-      <w:proofErr w:type="spellEnd"/>
-      <w:r>
-        <w:t xml:space="preserve"> (Microsoft </w:t>
-      </w:r>
-      <w:proofErr w:type="spellStart"/>
-      <w:r>
-        <w:t>Azure</w:t>
-      </w:r>
-      <w:proofErr w:type="spellEnd"/>
-      <w:r>
-        <w:t>) om schaalbaarheid, beschikbaarheid en beveiliging te garanderen.</w:t>
+        <w:t>ZKOO werkt met moderne cloudomgevingen (Microsoft Azure) om schaalbaarheid, beschikbaarheid en beveiliging te garanderen.</w:t>
       </w:r>
     </w:p>
     <w:p>
@@ -2107,15 +2053,7 @@
         <w:t xml:space="preserve"> d</w:t>
       </w:r>
       <w:r>
-        <w:t xml:space="preserve">oor een versneld traject naar Microsoft </w:t>
-      </w:r>
-      <w:proofErr w:type="spellStart"/>
-      <w:r>
-        <w:t>Azure</w:t>
-      </w:r>
-      <w:proofErr w:type="spellEnd"/>
-      <w:r>
-        <w:t xml:space="preserve"> kritieke ICT-componenten onvoldoende beveiligd. Een databeveiligingsbeleid ontbreekt, toegangscontroles zijn niet duidelijk ingericht, en wetgeving zoals de AVG wordt mogelijk geschonden. </w:t>
+        <w:t xml:space="preserve">oor een versneld traject naar Microsoft Azure kritieke ICT-componenten onvoldoende beveiligd. Een databeveiligingsbeleid ontbreekt, toegangscontroles zijn niet duidelijk ingericht, en wetgeving zoals de AVG wordt mogelijk geschonden. </w:t>
       </w:r>
     </w:p>
     <w:p>
@@ -2181,15 +2119,7 @@
         <w:t>de</w:t>
       </w:r>
       <w:r>
-        <w:t xml:space="preserve"> </w:t>
-      </w:r>
-      <w:proofErr w:type="spellStart"/>
-      <w:r>
-        <w:t>cloudomgeving</w:t>
-      </w:r>
-      <w:proofErr w:type="spellEnd"/>
-      <w:r>
-        <w:t xml:space="preserve"> </w:t>
+        <w:t xml:space="preserve"> cloudomgeving </w:t>
       </w:r>
       <w:r>
         <w:t xml:space="preserve">van de klant van ZKOO </w:t>
@@ -2221,21 +2151,7 @@
         <w:rPr>
           <w:rFonts w:ascii="Avenir Next LT Pro" w:hAnsi="Avenir Next LT Pro"/>
         </w:rPr>
-        <w:t xml:space="preserve">De bestaande </w:t>
-      </w:r>
-      <w:proofErr w:type="spellStart"/>
-      <w:r>
-        <w:rPr>
-          <w:rFonts w:ascii="Avenir Next LT Pro" w:hAnsi="Avenir Next LT Pro"/>
-        </w:rPr>
-        <w:t>cloudomgeving</w:t>
-      </w:r>
-      <w:proofErr w:type="spellEnd"/>
-      <w:r>
-        <w:rPr>
-          <w:rFonts w:ascii="Avenir Next LT Pro" w:hAnsi="Avenir Next LT Pro"/>
-        </w:rPr>
-        <w:t xml:space="preserve"> (IST) </w:t>
+        <w:t xml:space="preserve">De bestaande cloudomgeving (IST) </w:t>
       </w:r>
       <w:r>
         <w:rPr>
@@ -2331,21 +2247,7 @@
         <w:rPr>
           <w:rFonts w:ascii="Avenir Next LT Pro" w:hAnsi="Avenir Next LT Pro"/>
         </w:rPr>
-        <w:t xml:space="preserve"> binnen Microsoft </w:t>
-      </w:r>
-      <w:proofErr w:type="spellStart"/>
-      <w:r>
-        <w:rPr>
-          <w:rFonts w:ascii="Avenir Next LT Pro" w:hAnsi="Avenir Next LT Pro"/>
-        </w:rPr>
-        <w:t>Azure</w:t>
-      </w:r>
-      <w:proofErr w:type="spellEnd"/>
-      <w:r>
-        <w:rPr>
-          <w:rFonts w:ascii="Avenir Next LT Pro" w:hAnsi="Avenir Next LT Pro"/>
-        </w:rPr>
-        <w:t>.</w:t>
+        <w:t xml:space="preserve"> binnen Microsoft Azure.</w:t>
       </w:r>
     </w:p>
     <w:p>
@@ -2517,11 +2419,9 @@
             <w:hideMark/>
           </w:tcPr>
           <w:p>
-            <w:proofErr w:type="spellStart"/>
             <w:r>
               <w:t>PvA</w:t>
             </w:r>
-            <w:proofErr w:type="spellEnd"/>
           </w:p>
         </w:tc>
         <w:tc>
@@ -2563,14 +2463,12 @@
             <w:hideMark/>
           </w:tcPr>
           <w:p>
-            <w:proofErr w:type="spellStart"/>
             <w:r>
               <w:t>Advies</w:t>
             </w:r>
             <w:r>
               <w:t>+ontwerp</w:t>
             </w:r>
-            <w:proofErr w:type="spellEnd"/>
           </w:p>
         </w:tc>
         <w:tc>
@@ -2638,13 +2536,8 @@
               <w:t>individuele CGI-toets</w:t>
             </w:r>
             <w:r>
-              <w:t xml:space="preserve"> in </w:t>
-            </w:r>
-            <w:proofErr w:type="spellStart"/>
-            <w:r>
-              <w:t>Azure</w:t>
-            </w:r>
-            <w:proofErr w:type="spellEnd"/>
+              <w:t xml:space="preserve"> in Azure</w:t>
+            </w:r>
           </w:p>
         </w:tc>
       </w:tr>
@@ -2711,21 +2604,7 @@
         <w:rPr>
           <w:rFonts w:ascii="Avenir Next LT Pro" w:hAnsi="Avenir Next LT Pro"/>
         </w:rPr>
-        <w:t xml:space="preserve">Analyse van bestaande (gesimuleerde) </w:t>
-      </w:r>
-      <w:proofErr w:type="spellStart"/>
-      <w:r>
-        <w:rPr>
-          <w:rFonts w:ascii="Avenir Next LT Pro" w:hAnsi="Avenir Next LT Pro"/>
-        </w:rPr>
-        <w:t>cloudomgeving</w:t>
-      </w:r>
-      <w:proofErr w:type="spellEnd"/>
-      <w:r>
-        <w:rPr>
-          <w:rFonts w:ascii="Avenir Next LT Pro" w:hAnsi="Avenir Next LT Pro"/>
-        </w:rPr>
-        <w:t>.</w:t>
+        <w:t>Analyse van bestaande (gesimuleerde) cloudomgeving.</w:t>
       </w:r>
     </w:p>
     <w:p>
@@ -2761,21 +2640,7 @@
         <w:rPr>
           <w:rFonts w:ascii="Avenir Next LT Pro" w:hAnsi="Avenir Next LT Pro"/>
         </w:rPr>
-        <w:t xml:space="preserve">Beveiligingsontwerp m.b.t. netwerksegmentatie, toegangsbeheer, dataclassificatie, </w:t>
-      </w:r>
-      <w:proofErr w:type="spellStart"/>
-      <w:r>
-        <w:rPr>
-          <w:rFonts w:ascii="Avenir Next LT Pro" w:hAnsi="Avenir Next LT Pro"/>
-        </w:rPr>
-        <w:t>logging</w:t>
-      </w:r>
-      <w:proofErr w:type="spellEnd"/>
-      <w:r>
-        <w:rPr>
-          <w:rFonts w:ascii="Avenir Next LT Pro" w:hAnsi="Avenir Next LT Pro"/>
-        </w:rPr>
-        <w:t>, en veilig beheer.</w:t>
+        <w:t>Beveiligingsontwerp m.b.t. netwerksegmentatie, toegangsbeheer, dataclassificatie, logging, en veilig beheer.</w:t>
       </w:r>
     </w:p>
     <w:p>
@@ -2793,21 +2658,7 @@
         <w:rPr>
           <w:rFonts w:ascii="Avenir Next LT Pro" w:hAnsi="Avenir Next LT Pro"/>
         </w:rPr>
-        <w:t xml:space="preserve">Implementatie binnen </w:t>
-      </w:r>
-      <w:proofErr w:type="spellStart"/>
-      <w:r>
-        <w:rPr>
-          <w:rFonts w:ascii="Avenir Next LT Pro" w:hAnsi="Avenir Next LT Pro"/>
-        </w:rPr>
-        <w:t>Azure-resourcegroup</w:t>
-      </w:r>
-      <w:proofErr w:type="spellEnd"/>
-      <w:r>
-        <w:rPr>
-          <w:rFonts w:ascii="Avenir Next LT Pro" w:hAnsi="Avenir Next LT Pro"/>
-        </w:rPr>
-        <w:t>.</w:t>
+        <w:t>Implementatie binnen Azure-resourcegroup.</w:t>
       </w:r>
     </w:p>
     <w:p>
@@ -2833,21 +2684,7 @@
         <w:rPr>
           <w:rFonts w:ascii="Avenir Next LT Pro" w:hAnsi="Avenir Next LT Pro"/>
         </w:rPr>
-        <w:t xml:space="preserve">Migratie van </w:t>
-      </w:r>
-      <w:proofErr w:type="spellStart"/>
-      <w:r>
-        <w:rPr>
-          <w:rFonts w:ascii="Avenir Next LT Pro" w:hAnsi="Avenir Next LT Pro"/>
-        </w:rPr>
-        <w:t>legacy</w:t>
-      </w:r>
-      <w:proofErr w:type="spellEnd"/>
-      <w:r>
-        <w:rPr>
-          <w:rFonts w:ascii="Avenir Next LT Pro" w:hAnsi="Avenir Next LT Pro"/>
-        </w:rPr>
-        <w:t>-systemen.</w:t>
+        <w:t>Migratie van legacy-systemen.</w:t>
       </w:r>
     </w:p>
     <w:p>
@@ -3012,19 +2849,11 @@
           <w:rFonts w:ascii="Avenir Next LT Pro" w:hAnsi="Avenir Next LT Pro"/>
         </w:rPr>
       </w:pPr>
-      <w:proofErr w:type="spellStart"/>
       <w:r>
         <w:rPr>
           <w:rFonts w:ascii="Avenir Next LT Pro" w:hAnsi="Avenir Next LT Pro"/>
         </w:rPr>
-        <w:t>PvA</w:t>
-      </w:r>
-      <w:proofErr w:type="spellEnd"/>
-      <w:r>
-        <w:rPr>
-          <w:rFonts w:ascii="Avenir Next LT Pro" w:hAnsi="Avenir Next LT Pro"/>
-        </w:rPr>
-        <w:t xml:space="preserve"> </w:t>
+        <w:t xml:space="preserve">PvA </w:t>
       </w:r>
       <w:r>
         <w:rPr>
@@ -3166,30 +2995,8 @@
         <w:rPr>
           <w:rFonts w:ascii="Avenir Next LT Pro" w:hAnsi="Avenir Next LT Pro"/>
         </w:rPr>
-        <w:t xml:space="preserve">Inrichten beveiligde </w:t>
-      </w:r>
-      <w:proofErr w:type="spellStart"/>
-      <w:r>
-        <w:rPr>
-          <w:rFonts w:ascii="Avenir Next LT Pro" w:hAnsi="Avenir Next LT Pro"/>
-        </w:rPr>
-        <w:t>cloudomgeving</w:t>
-      </w:r>
-      <w:proofErr w:type="spellEnd"/>
-      <w:r>
-        <w:rPr>
-          <w:rFonts w:ascii="Avenir Next LT Pro" w:hAnsi="Avenir Next LT Pro"/>
-        </w:rPr>
-        <w:t xml:space="preserve"> in </w:t>
-      </w:r>
-      <w:proofErr w:type="spellStart"/>
-      <w:r>
-        <w:rPr>
-          <w:rFonts w:ascii="Avenir Next LT Pro" w:hAnsi="Avenir Next LT Pro"/>
-        </w:rPr>
-        <w:t>Azure</w:t>
-      </w:r>
-      <w:proofErr w:type="spellEnd"/>
+        <w:t>Inrichten beveiligde cloudomgeving in Azure</w:t>
+      </w:r>
     </w:p>
     <w:p>
       <w:pPr>
@@ -3206,21 +3013,7 @@
         <w:rPr>
           <w:rFonts w:ascii="Avenir Next LT Pro" w:hAnsi="Avenir Next LT Pro"/>
         </w:rPr>
-        <w:t xml:space="preserve">Configuratie van firewalls, IDS, </w:t>
-      </w:r>
-      <w:proofErr w:type="spellStart"/>
-      <w:r>
-        <w:rPr>
-          <w:rFonts w:ascii="Avenir Next LT Pro" w:hAnsi="Avenir Next LT Pro"/>
-        </w:rPr>
-        <w:t>VPN’s</w:t>
-      </w:r>
-      <w:proofErr w:type="spellEnd"/>
-      <w:r>
-        <w:rPr>
-          <w:rFonts w:ascii="Avenir Next LT Pro" w:hAnsi="Avenir Next LT Pro"/>
-        </w:rPr>
-        <w:t>, toegangscontrole</w:t>
+        <w:t>Configuratie van firewalls, IDS, VPN’s, toegangscontrole</w:t>
       </w:r>
     </w:p>
     <w:p>
@@ -3252,19 +3045,11 @@
           <w:rFonts w:ascii="Avenir Next LT Pro" w:hAnsi="Avenir Next LT Pro"/>
         </w:rPr>
       </w:pPr>
-      <w:proofErr w:type="spellStart"/>
       <w:r>
         <w:rPr>
           <w:rFonts w:ascii="Avenir Next LT Pro" w:hAnsi="Avenir Next LT Pro"/>
         </w:rPr>
-        <w:t>Logging</w:t>
-      </w:r>
-      <w:proofErr w:type="spellEnd"/>
-      <w:r>
-        <w:rPr>
-          <w:rFonts w:ascii="Avenir Next LT Pro" w:hAnsi="Avenir Next LT Pro"/>
-        </w:rPr>
-        <w:t xml:space="preserve"> en monitoring activeren</w:t>
+        <w:t>Logging en monitoring activeren</w:t>
       </w:r>
     </w:p>
     <w:p>
@@ -3415,15 +3200,7 @@
         <w:t xml:space="preserve">Onze missie is als team samen te werken aan het verbeteren </w:t>
       </w:r>
       <w:r>
-        <w:t xml:space="preserve">van gegevensbescherming binnen de </w:t>
-      </w:r>
-      <w:proofErr w:type="spellStart"/>
-      <w:r>
-        <w:t>Azure</w:t>
-      </w:r>
-      <w:proofErr w:type="spellEnd"/>
-      <w:r>
-        <w:t xml:space="preserve">-omgeving van ZKOO. Hierbij staan een eerlijke taakverdeling, open communicatie en verantwoordelijkheid voor ieders eigen werk hoog in het vaandel. </w:t>
+        <w:t xml:space="preserve">van gegevensbescherming binnen de Azure-omgeving van ZKOO. Hierbij staan een eerlijke taakverdeling, open communicatie en verantwoordelijkheid voor ieders eigen werk hoog in het vaandel. </w:t>
       </w:r>
     </w:p>
     <w:p>
@@ -3434,15 +3211,7 @@
         </w:rPr>
       </w:pPr>
       <w:r>
-        <w:t xml:space="preserve">De visie die wij als team dragen is het opleveren van een onderbouwd advies en een werkende </w:t>
-      </w:r>
-      <w:proofErr w:type="spellStart"/>
-      <w:r>
-        <w:t>Proof</w:t>
-      </w:r>
-      <w:proofErr w:type="spellEnd"/>
-      <w:r>
-        <w:t xml:space="preserve"> of Concept. Hiermee laten we zien hoe de onderzochte beveiligingsrisico’s beperkt kunnen worden. </w:t>
+        <w:t xml:space="preserve">De visie die wij als team dragen is het opleveren van een onderbouwd advies en een werkende Proof of Concept. Hiermee laten we zien hoe de onderzochte beveiligingsrisico’s beperkt kunnen worden. </w:t>
       </w:r>
     </w:p>
     <w:p>
@@ -3555,7 +3324,6 @@
                 <w:lang w:val="es-ES_tradnl"/>
               </w:rPr>
             </w:pPr>
-            <w:proofErr w:type="spellStart"/>
             <w:r>
               <w:rPr>
                 <w:rFonts w:cs="Arial"/>
@@ -3565,7 +3333,6 @@
               </w:rPr>
               <w:t>E-mail</w:t>
             </w:r>
-            <w:proofErr w:type="spellEnd"/>
           </w:p>
         </w:tc>
         <w:tc>
@@ -3584,7 +3351,6 @@
                 <w:lang w:val="de-DE"/>
               </w:rPr>
             </w:pPr>
-            <w:proofErr w:type="spellStart"/>
             <w:r>
               <w:rPr>
                 <w:rFonts w:cs="Arial"/>
@@ -3594,7 +3360,6 @@
               </w:rPr>
               <w:t>Beschikbaarheid</w:t>
             </w:r>
-            <w:proofErr w:type="spellEnd"/>
           </w:p>
         </w:tc>
       </w:tr>
@@ -3733,19 +3498,8 @@
                 <w:szCs w:val="20"/>
                 <w:lang w:val="en-US"/>
               </w:rPr>
-              <w:t xml:space="preserve">Ma t/m </w:t>
-            </w:r>
-            <w:proofErr w:type="spellStart"/>
-            <w:r>
-              <w:rPr>
-                <w:rFonts w:cs="Arial"/>
-                <w:sz w:val="20"/>
-                <w:szCs w:val="20"/>
-                <w:lang w:val="en-US"/>
-              </w:rPr>
-              <w:t>Vr</w:t>
-            </w:r>
-            <w:proofErr w:type="spellEnd"/>
+              <w:t>Ma t/m Vr</w:t>
+            </w:r>
             <w:r>
               <w:rPr>
                 <w:rFonts w:cs="Arial"/>
@@ -3908,19 +3662,8 @@
                 <w:szCs w:val="20"/>
                 <w:lang w:val="en-US"/>
               </w:rPr>
-              <w:t xml:space="preserve">Ma t/m </w:t>
-            </w:r>
-            <w:proofErr w:type="spellStart"/>
-            <w:r>
-              <w:rPr>
-                <w:rFonts w:cs="Arial"/>
-                <w:sz w:val="20"/>
-                <w:szCs w:val="20"/>
-                <w:lang w:val="en-US"/>
-              </w:rPr>
-              <w:t>Vr</w:t>
-            </w:r>
-            <w:proofErr w:type="spellEnd"/>
+              <w:t>Ma t/m Vr</w:t>
+            </w:r>
             <w:r>
               <w:rPr>
                 <w:rFonts w:cs="Arial"/>
@@ -4065,19 +3808,8 @@
                 <w:szCs w:val="20"/>
                 <w:lang w:val="en-US"/>
               </w:rPr>
-              <w:t xml:space="preserve">Ma t/m </w:t>
-            </w:r>
-            <w:proofErr w:type="spellStart"/>
-            <w:r>
-              <w:rPr>
-                <w:rFonts w:cs="Arial"/>
-                <w:sz w:val="20"/>
-                <w:szCs w:val="20"/>
-                <w:lang w:val="en-US"/>
-              </w:rPr>
-              <w:t>Vr</w:t>
-            </w:r>
-            <w:proofErr w:type="spellEnd"/>
+              <w:t>Ma t/m Vr</w:t>
+            </w:r>
             <w:r>
               <w:rPr>
                 <w:rFonts w:cs="Arial"/>
@@ -4245,9 +3977,8 @@
                 <w:szCs w:val="20"/>
                 <w:lang w:val="en-US"/>
               </w:rPr>
-              <w:t xml:space="preserve">Ma t/m </w:t>
-            </w:r>
-            <w:proofErr w:type="spellStart"/>
+              <w:t>Ma t/m Vr</w:t>
+            </w:r>
             <w:r>
               <w:rPr>
                 <w:rFonts w:cs="Arial"/>
@@ -4255,9 +3986,8 @@
                 <w:szCs w:val="20"/>
                 <w:lang w:val="en-US"/>
               </w:rPr>
-              <w:t>Vr</w:t>
-            </w:r>
-            <w:proofErr w:type="spellEnd"/>
+              <w:t>:</w:t>
+            </w:r>
             <w:r>
               <w:rPr>
                 <w:rFonts w:cs="Arial"/>
@@ -4265,7 +3995,7 @@
                 <w:szCs w:val="20"/>
                 <w:lang w:val="en-US"/>
               </w:rPr>
-              <w:t>:</w:t>
+              <w:t xml:space="preserve"> 9:00 – 1</w:t>
             </w:r>
             <w:r>
               <w:rPr>
@@ -4274,7 +4004,7 @@
                 <w:szCs w:val="20"/>
                 <w:lang w:val="en-US"/>
               </w:rPr>
-              <w:t xml:space="preserve"> 9:00 – 1</w:t>
+              <w:t>6</w:t>
             </w:r>
             <w:r>
               <w:rPr>
@@ -4283,15 +4013,6 @@
                 <w:szCs w:val="20"/>
                 <w:lang w:val="en-US"/>
               </w:rPr>
-              <w:t>6</w:t>
-            </w:r>
-            <w:r>
-              <w:rPr>
-                <w:rFonts w:cs="Arial"/>
-                <w:sz w:val="20"/>
-                <w:szCs w:val="20"/>
-                <w:lang w:val="en-US"/>
-              </w:rPr>
               <w:t>:00</w:t>
             </w:r>
           </w:p>
@@ -4312,15 +4033,7 @@
         <w:t>Tijdens s</w:t>
       </w:r>
       <w:r>
-        <w:t xml:space="preserve">chooluren zorgen de teamleden dat zij bereikbaar zijn, ook wanneer iemand vanuit huis werkt. Hiervoor gebruiken we communicatiekanalen Whatsapp, </w:t>
-      </w:r>
-      <w:proofErr w:type="spellStart"/>
-      <w:r>
-        <w:t>Github</w:t>
-      </w:r>
-      <w:proofErr w:type="spellEnd"/>
-      <w:r>
-        <w:t xml:space="preserve"> en Microsoft Teams. </w:t>
+        <w:t xml:space="preserve">chooluren zorgen de teamleden dat zij bereikbaar zijn, ook wanneer iemand vanuit huis werkt. Hiervoor gebruiken we communicatiekanalen Whatsapp, Github en Microsoft Teams. </w:t>
       </w:r>
     </w:p>
     <w:p>
@@ -4636,7 +4349,7 @@
         <w:rPr>
           <w:color w:val="FF0000"/>
         </w:rPr>
-        <w:t>Bedrijfsman</w:t>
+        <w:t>Specialist</w:t>
       </w:r>
       <w:r>
         <w:rPr>
@@ -4649,12 +4362,17 @@
           <w:color w:val="FF0000"/>
         </w:rPr>
         <w:tab/>
-        <w:t>Voorzitter</w:t>
       </w:r>
       <w:r>
         <w:rPr>
           <w:color w:val="FF0000"/>
         </w:rPr>
+        <w:t>Monitor</w:t>
+      </w:r>
+      <w:r>
+        <w:rPr>
+          <w:color w:val="FF0000"/>
+        </w:rPr>
         <w:tab/>
       </w:r>
       <w:r>
@@ -4662,7 +4380,12 @@
           <w:color w:val="FF0000"/>
         </w:rPr>
         <w:tab/>
-        <w:t>Vormer</w:t>
+      </w:r>
+      <w:r>
+        <w:rPr>
+          <w:color w:val="FF0000"/>
+        </w:rPr>
+        <w:t>Brononderzoeker</w:t>
       </w:r>
     </w:p>
     <w:p>
@@ -4673,7 +4396,6 @@
           <w:color w:val="FF0000"/>
         </w:rPr>
       </w:pPr>
-      <w:proofErr w:type="spellStart"/>
       <w:r>
         <w:rPr>
           <w:rStyle w:val="Emphasis"/>
@@ -4682,7 +4404,6 @@
         <w:lastRenderedPageBreak/>
         <w:t>Maiwand</w:t>
       </w:r>
-      <w:proofErr w:type="spellEnd"/>
       <w:r>
         <w:rPr>
           <w:rStyle w:val="Emphasis"/>
@@ -4783,15 +4504,7 @@
     </w:p>
     <w:p>
       <w:r>
-        <w:t xml:space="preserve">Notulist — </w:t>
-      </w:r>
-      <w:proofErr w:type="spellStart"/>
-      <w:r>
-        <w:t>Maiwand</w:t>
-      </w:r>
-      <w:proofErr w:type="spellEnd"/>
-      <w:r>
-        <w:t xml:space="preserve">: </w:t>
+        <w:t xml:space="preserve">Notulist — Maiwand: </w:t>
       </w:r>
     </w:p>
     <w:p>
@@ -4838,23 +4551,7 @@
     </w:p>
     <w:p>
       <w:r>
-        <w:t xml:space="preserve">Bij vertrek van een </w:t>
-      </w:r>
-      <w:proofErr w:type="spellStart"/>
-      <w:r>
-        <w:t>projectlid</w:t>
-      </w:r>
-      <w:proofErr w:type="spellEnd"/>
-      <w:r>
-        <w:t xml:space="preserve"> worden de taken verdeeld over de resterende leden. Indien nodig wordt gestemd over wie de </w:t>
-      </w:r>
-      <w:proofErr w:type="spellStart"/>
-      <w:r>
-        <w:t>vrijgenomen</w:t>
-      </w:r>
-      <w:proofErr w:type="spellEnd"/>
-      <w:r>
-        <w:t xml:space="preserve"> rol overneemt. </w:t>
+        <w:t xml:space="preserve">Bij vertrek van een projectlid worden de taken verdeeld over de resterende leden. Indien nodig wordt gestemd over wie de vrijgenomen rol overneemt. </w:t>
       </w:r>
     </w:p>
     <w:p>
@@ -4900,61 +4597,19 @@
         <w:rPr>
           <w:rFonts w:cs="Arial"/>
         </w:rPr>
-        <w:t>Binnen het team communiceren wij face-</w:t>
-      </w:r>
-      <w:proofErr w:type="spellStart"/>
+        <w:t>Binnen het team communiceren wij face-to-face tijdens lessen, via</w:t>
+      </w:r>
       <w:r>
         <w:rPr>
           <w:rFonts w:cs="Arial"/>
         </w:rPr>
-        <w:t>to</w:t>
-      </w:r>
-      <w:proofErr w:type="spellEnd"/>
+        <w:t xml:space="preserve"> Whatsapp, Github en indien er sprake is van digitaal overleg Microsoft Teams. Projectbestanden worden opgeslagen </w:t>
+      </w:r>
       <w:r>
         <w:rPr>
           <w:rFonts w:cs="Arial"/>
         </w:rPr>
-        <w:t>-face tijdens lessen, via</w:t>
-      </w:r>
-      <w:r>
-        <w:rPr>
-          <w:rFonts w:cs="Arial"/>
-        </w:rPr>
-        <w:t xml:space="preserve"> Whatsapp, </w:t>
-      </w:r>
-      <w:proofErr w:type="spellStart"/>
-      <w:r>
-        <w:rPr>
-          <w:rFonts w:cs="Arial"/>
-        </w:rPr>
-        <w:t>Github</w:t>
-      </w:r>
-      <w:proofErr w:type="spellEnd"/>
-      <w:r>
-        <w:rPr>
-          <w:rFonts w:cs="Arial"/>
-        </w:rPr>
-        <w:t xml:space="preserve"> en indien er sprake is van digitaal overleg Microsoft Teams. Projectbestanden worden opgeslagen </w:t>
-      </w:r>
-      <w:r>
-        <w:rPr>
-          <w:rFonts w:cs="Arial"/>
-        </w:rPr>
-        <w:t xml:space="preserve">in </w:t>
-      </w:r>
-      <w:proofErr w:type="spellStart"/>
-      <w:r>
-        <w:rPr>
-          <w:rFonts w:cs="Arial"/>
-        </w:rPr>
-        <w:t>Github</w:t>
-      </w:r>
-      <w:proofErr w:type="spellEnd"/>
-      <w:r>
-        <w:rPr>
-          <w:rFonts w:cs="Arial"/>
-        </w:rPr>
-        <w:t>. Tijdens een wekelijks overleg, gedurende of tussen de lessen in, bespreken wij de voortgang, mogelijke knelpunten en hoe de samenwerking verloopt.</w:t>
+        <w:t>in Github. Tijdens een wekelijks overleg, gedurende of tussen de lessen in, bespreken wij de voortgang, mogelijke knelpunten en hoe de samenwerking verloopt.</w:t>
       </w:r>
     </w:p>
     <w:p>
@@ -5024,23 +4679,7 @@
     </w:p>
     <w:p>
       <w:r>
-        <w:t xml:space="preserve">Overleg vindt plaats tijdens de lessen. Wij verwachten dat er dan voldoende tijd is om de voortgang, taakverdeling en knelpunten te bespreken. Als dit niet voldoende blijkt, plannen wij in overleg een extra vergadering. Ieder </w:t>
-      </w:r>
-      <w:proofErr w:type="spellStart"/>
-      <w:r>
-        <w:t>projectlid</w:t>
-      </w:r>
-      <w:proofErr w:type="spellEnd"/>
-      <w:r>
-        <w:t xml:space="preserve"> kan hiervoor een verzoek doen. Tijdens de vergaderingen legt </w:t>
-      </w:r>
-      <w:proofErr w:type="spellStart"/>
-      <w:r>
-        <w:t>Maiwand</w:t>
-      </w:r>
-      <w:proofErr w:type="spellEnd"/>
-      <w:r>
-        <w:t xml:space="preserve"> de notulen vast. </w:t>
+        <w:t xml:space="preserve">Overleg vindt plaats tijdens de lessen. Wij verwachten dat er dan voldoende tijd is om de voortgang, taakverdeling en knelpunten te bespreken. Als dit niet voldoende blijkt, plannen wij in overleg een extra vergadering. Ieder projectlid kan hiervoor een verzoek doen. Tijdens de vergaderingen legt Maiwand de notulen vast. </w:t>
       </w:r>
     </w:p>
     <w:p>
@@ -5078,23 +4717,7 @@
         </w:rPr>
       </w:pPr>
       <w:r>
-        <w:t xml:space="preserve">Bij meningsverschillen zoeken we naar een compromis. De projectleider zorgt dat dit besluit duidelijk wordt </w:t>
-      </w:r>
-      <w:proofErr w:type="spellStart"/>
-      <w:r>
-        <w:t>vastgelukt</w:t>
-      </w:r>
-      <w:proofErr w:type="spellEnd"/>
-      <w:r>
-        <w:t xml:space="preserve">. Lukt het de projectgroep niet om tot een </w:t>
-      </w:r>
-      <w:proofErr w:type="spellStart"/>
-      <w:r>
-        <w:t>compomis</w:t>
-      </w:r>
-      <w:proofErr w:type="spellEnd"/>
-      <w:r>
-        <w:t xml:space="preserve"> te komen, vragen wij de docent om begeleiding.</w:t>
+        <w:t>Bij meningsverschillen zoeken we naar een compromis. De projectleider zorgt dat dit besluit duidelijk wordt vastgelukt. Lukt het de projectgroep niet om tot een compomis te komen, vragen wij de docent om begeleiding.</w:t>
       </w:r>
     </w:p>
     <w:p>
@@ -5241,7 +4864,6 @@
                 <w:i/>
               </w:rPr>
             </w:pPr>
-            <w:proofErr w:type="spellStart"/>
             <w:r>
               <w:rPr>
                 <w:rFonts w:cs="Arial"/>
@@ -5249,7 +4871,6 @@
               </w:rPr>
               <w:t>Verdana</w:t>
             </w:r>
-            <w:proofErr w:type="spellEnd"/>
           </w:p>
         </w:tc>
       </w:tr>
@@ -5805,15 +5426,7 @@
     </w:p>
     <w:p>
       <w:r>
-        <w:t>Documenten worden tijdens het project opgeslagen en bewerkt in Word (.</w:t>
-      </w:r>
-      <w:proofErr w:type="spellStart"/>
-      <w:r>
-        <w:t>docx</w:t>
-      </w:r>
-      <w:proofErr w:type="spellEnd"/>
-      <w:r>
-        <w:t>). De definitieve versie wordt als PDF ingeleverd, tenzij de opdracht een ander bestandsformaat voorschrijft.</w:t>
+        <w:t>Documenten worden tijdens het project opgeslagen en bewerkt in Word (.docx). De definitieve versie wordt als PDF ingeleverd, tenzij de opdracht een ander bestandsformaat voorschrijft.</w:t>
       </w:r>
     </w:p>
     <w:p/>
@@ -5834,23 +5447,7 @@
     </w:p>
     <w:p>
       <w:r>
-        <w:t xml:space="preserve">Voor versiebeheer van het project gebruikt de groep </w:t>
-      </w:r>
-      <w:proofErr w:type="spellStart"/>
-      <w:r>
-        <w:t>Github</w:t>
-      </w:r>
-      <w:proofErr w:type="spellEnd"/>
-      <w:r>
-        <w:t xml:space="preserve">. Wijzigingen aan de technische uitwerking moeten volgens het samenwerkingscontract door een ander </w:t>
-      </w:r>
-      <w:proofErr w:type="spellStart"/>
-      <w:r>
-        <w:t>projectlid</w:t>
-      </w:r>
-      <w:proofErr w:type="spellEnd"/>
-      <w:r>
-        <w:t xml:space="preserve"> worden goedgekeurd voordat ze worden samengevoegd.</w:t>
+        <w:t>Voor versiebeheer van het project gebruikt de groep Github. Wijzigingen aan de technische uitwerking moeten volgens het samenwerkingscontract door een ander projectlid worden goedgekeurd voordat ze worden samengevoegd.</w:t>
       </w:r>
     </w:p>
     <w:p>
@@ -5904,15 +5501,7 @@
         </w:numPr>
       </w:pPr>
       <w:r>
-        <w:t xml:space="preserve">Analyse, advies en uitvoerbaar </w:t>
-      </w:r>
-      <w:proofErr w:type="spellStart"/>
-      <w:r>
-        <w:t>PoC</w:t>
-      </w:r>
-      <w:proofErr w:type="spellEnd"/>
-      <w:r>
-        <w:t>-ontwerp: week 5, vrijdag om 15.00 uur.</w:t>
+        <w:t>Analyse, advies en uitvoerbaar PoC-ontwerp: week 5, vrijdag om 15.00 uur.</w:t>
       </w:r>
     </w:p>
     <w:p>
@@ -5941,15 +5530,7 @@
     </w:p>
     <w:p>
       <w:r>
-        <w:t xml:space="preserve">Ieder groepslid is zelf verantwoordelijk voor het tijdig inleveren van de opdrachten in diens persoonlijke </w:t>
-      </w:r>
-      <w:proofErr w:type="spellStart"/>
-      <w:r>
-        <w:t>Moodle</w:t>
-      </w:r>
-      <w:proofErr w:type="spellEnd"/>
-      <w:r>
-        <w:t xml:space="preserve"> omgeving. </w:t>
+        <w:t xml:space="preserve">Ieder groepslid is zelf verantwoordelijk voor het tijdig inleveren van de opdrachten in diens persoonlijke Moodle omgeving. </w:t>
       </w:r>
     </w:p>
     <w:p>
@@ -6452,15 +6033,7 @@
           </w:tcPr>
           <w:p>
             <w:r>
-              <w:t xml:space="preserve">Problemen met </w:t>
-            </w:r>
-            <w:proofErr w:type="spellStart"/>
-            <w:r>
-              <w:t>Azure</w:t>
-            </w:r>
-            <w:proofErr w:type="spellEnd"/>
-            <w:r>
-              <w:t>-omgeving</w:t>
+              <w:t>Problemen met Azure-omgeving</w:t>
             </w:r>
           </w:p>
         </w:tc>
@@ -6688,15 +6261,7 @@
           </w:tcPr>
           <w:p>
             <w:r>
-              <w:t xml:space="preserve">SQL-injectie tests, dataclassificatie, </w:t>
-            </w:r>
-            <w:proofErr w:type="spellStart"/>
-            <w:r>
-              <w:t>PvA</w:t>
-            </w:r>
-            <w:proofErr w:type="spellEnd"/>
-            <w:r>
-              <w:t xml:space="preserve"> inleveren</w:t>
+              <w:t>SQL-injectie tests, dataclassificatie, PvA inleveren</w:t>
             </w:r>
           </w:p>
         </w:tc>
@@ -6792,13 +6357,8 @@
           </w:tcPr>
           <w:p>
             <w:r>
-              <w:t xml:space="preserve">Implementatie SOLL in </w:t>
-            </w:r>
-            <w:proofErr w:type="spellStart"/>
-            <w:r>
-              <w:t>Azure</w:t>
-            </w:r>
-            <w:proofErr w:type="spellEnd"/>
+              <w:t>Implementatie SOLL in Azure</w:t>
+            </w:r>
           </w:p>
         </w:tc>
       </w:tr>
@@ -6828,15 +6388,7 @@
           </w:tcPr>
           <w:p>
             <w:r>
-              <w:t xml:space="preserve">Testen, </w:t>
-            </w:r>
-            <w:proofErr w:type="spellStart"/>
-            <w:r>
-              <w:t>logging</w:t>
-            </w:r>
-            <w:proofErr w:type="spellEnd"/>
-            <w:r>
-              <w:t xml:space="preserve"> controleren, verbeteringen doorvoeren</w:t>
+              <w:t>Testen, logging controleren, verbeteringen doorvoeren</w:t>
             </w:r>
           </w:p>
         </w:tc>
@@ -6971,63 +6523,7 @@
         <w:rPr>
           <w:rFonts w:ascii="Avenir Next LT Pro" w:hAnsi="Avenir Next LT Pro"/>
         </w:rPr>
-        <w:t xml:space="preserve">Gebruik van Microsoft </w:t>
-      </w:r>
-      <w:proofErr w:type="spellStart"/>
-      <w:r>
-        <w:rPr>
-          <w:rFonts w:ascii="Avenir Next LT Pro" w:hAnsi="Avenir Next LT Pro"/>
-        </w:rPr>
-        <w:t>Azure</w:t>
-      </w:r>
-      <w:proofErr w:type="spellEnd"/>
-      <w:r>
-        <w:rPr>
-          <w:rFonts w:ascii="Avenir Next LT Pro" w:hAnsi="Avenir Next LT Pro"/>
-        </w:rPr>
-        <w:t xml:space="preserve"> </w:t>
-      </w:r>
-      <w:proofErr w:type="spellStart"/>
-      <w:r>
-        <w:rPr>
-          <w:rFonts w:ascii="Avenir Next LT Pro" w:hAnsi="Avenir Next LT Pro"/>
-        </w:rPr>
-        <w:t>for</w:t>
-      </w:r>
-      <w:proofErr w:type="spellEnd"/>
-      <w:r>
-        <w:rPr>
-          <w:rFonts w:ascii="Avenir Next LT Pro" w:hAnsi="Avenir Next LT Pro"/>
-        </w:rPr>
-        <w:t xml:space="preserve"> </w:t>
-      </w:r>
-      <w:proofErr w:type="spellStart"/>
-      <w:r>
-        <w:rPr>
-          <w:rFonts w:ascii="Avenir Next LT Pro" w:hAnsi="Avenir Next LT Pro"/>
-        </w:rPr>
-        <w:t>Students</w:t>
-      </w:r>
-      <w:proofErr w:type="spellEnd"/>
-      <w:r>
-        <w:rPr>
-          <w:rFonts w:ascii="Avenir Next LT Pro" w:hAnsi="Avenir Next LT Pro"/>
-        </w:rPr>
-        <w:t xml:space="preserve"> (gratis </w:t>
-      </w:r>
-      <w:proofErr w:type="spellStart"/>
-      <w:r>
-        <w:rPr>
-          <w:rFonts w:ascii="Avenir Next LT Pro" w:hAnsi="Avenir Next LT Pro"/>
-        </w:rPr>
-        <w:t>credits</w:t>
-      </w:r>
-      <w:proofErr w:type="spellEnd"/>
-      <w:r>
-        <w:rPr>
-          <w:rFonts w:ascii="Avenir Next LT Pro" w:hAnsi="Avenir Next LT Pro"/>
-        </w:rPr>
-        <w:t>)</w:t>
+        <w:t>Gebruik van Microsoft Azure for Students (gratis credits)</w:t>
       </w:r>
     </w:p>
     <w:p>
@@ -7047,23 +6543,7 @@
           <w:rFonts w:ascii="Avenir Next LT Pro" w:hAnsi="Avenir Next LT Pro"/>
           <w:lang w:val="en-US"/>
         </w:rPr>
-        <w:t xml:space="preserve">Open-source IDS </w:t>
-      </w:r>
-      <w:proofErr w:type="spellStart"/>
-      <w:r>
-        <w:rPr>
-          <w:rFonts w:ascii="Avenir Next LT Pro" w:hAnsi="Avenir Next LT Pro"/>
-          <w:lang w:val="en-US"/>
-        </w:rPr>
-        <w:t>zoals</w:t>
-      </w:r>
-      <w:proofErr w:type="spellEnd"/>
-      <w:r>
-        <w:rPr>
-          <w:rFonts w:ascii="Avenir Next LT Pro" w:hAnsi="Avenir Next LT Pro"/>
-          <w:lang w:val="en-US"/>
-        </w:rPr>
-        <w:t xml:space="preserve"> Snort of Suricata</w:t>
+        <w:t>Open-source IDS zoals Snort of Suricata</w:t>
       </w:r>
     </w:p>
     <w:p>
@@ -7119,17 +6599,8 @@
           <w:rFonts w:ascii="Avenir Next LT Pro" w:hAnsi="Avenir Next LT Pro"/>
           <w:lang w:val="en-US"/>
         </w:rPr>
-        <w:t>Software: Visual Studio Code, OWASP tools, SQLi-</w:t>
-      </w:r>
-      <w:proofErr w:type="spellStart"/>
-      <w:r>
-        <w:rPr>
-          <w:rFonts w:ascii="Avenir Next LT Pro" w:hAnsi="Avenir Next LT Pro"/>
-          <w:lang w:val="en-US"/>
-        </w:rPr>
-        <w:t>testtools</w:t>
-      </w:r>
-      <w:proofErr w:type="spellEnd"/>
+        <w:t>Software: Visual Studio Code, OWASP tools, SQLi-testtools</w:t>
+      </w:r>
     </w:p>
     <w:p>
       <w:pPr>
@@ -7473,7 +6944,7 @@
             </wp:anchor>
           </w:drawing>
         </mc:Choice>
-        <mc:Fallback xmlns:a14="http://schemas.microsoft.com/office/drawing/2010/main" xmlns:pic="http://schemas.openxmlformats.org/drawingml/2006/picture" xmlns:a="http://schemas.openxmlformats.org/drawingml/2006/main">
+        <mc:Fallback xmlns:a="http://schemas.openxmlformats.org/drawingml/2006/main" xmlns:pic="http://schemas.openxmlformats.org/drawingml/2006/picture" xmlns:a14="http://schemas.microsoft.com/office/drawing/2010/main">
           <w:pict w14:anchorId="1CADCD6F">
             <v:group id="Groep 102" style="position:absolute;margin-left:-1in;margin-top:-29.55pt;width:595.25pt;height:835.05pt;z-index:-251657216" coordsize="75596,106051" coordorigin=",186" o:spid="_x0000_s1026" w14:anchorId="0FC57937" o:gfxdata="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">
               <v:shapetype id="_x0000_t75" coordsize="21600,21600" filled="f" stroked="f" o:spt="75" o:preferrelative="t" path="m@4@5l@4@11@9@11@9@5xe">
@@ -10451,6 +9922,7 @@
   </w:compat>
   <w:rsids>
     <w:rsidRoot w:val="007D1596"/>
+    <w:rsid w:val="00044AFF"/>
     <w:rsid w:val="00247E2B"/>
     <w:rsid w:val="002A272A"/>
     <w:rsid w:val="00371805"/>
@@ -10459,6 +9931,7 @@
     <w:rsid w:val="004F54BB"/>
     <w:rsid w:val="007D1596"/>
     <w:rsid w:val="007E79EC"/>
+    <w:rsid w:val="008D0D90"/>
     <w:rsid w:val="008D20A3"/>
     <w:rsid w:val="00946403"/>
     <w:rsid w:val="00DD5D19"/>
@@ -11240,210 +10713,14 @@
 </file>
 
 <file path=customXml/item3.xml><?xml version="1.0" encoding="utf-8"?>
-<ct:contentTypeSchema xmlns:ct="http://schemas.microsoft.com/office/2006/metadata/contentType" xmlns:ma="http://schemas.microsoft.com/office/2006/metadata/properties/metaAttributes" ct:_="" ma:_="" ma:contentTypeName="Document" ma:contentTypeID="0x0101009AEE7C0E3FC1AF49AE2D21952FC004E7" ma:contentTypeVersion="13" ma:contentTypeDescription="Een nieuw document maken." ma:contentTypeScope="" ma:versionID="960b10dc37b0d3729643b1edbc9ea311">
-  <xsd:schema xmlns:xsd="http://www.w3.org/2001/XMLSchema" xmlns:xs="http://www.w3.org/2001/XMLSchema" xmlns:p="http://schemas.microsoft.com/office/2006/metadata/properties" xmlns:ns2="70093741-41eb-4420-bf3d-ff9555ef2a33" xmlns:ns3="8e0d46a4-c7d4-472b-9541-810c49191871" targetNamespace="http://schemas.microsoft.com/office/2006/metadata/properties" ma:root="true" ma:fieldsID="8470fe0247e22942882bacf7112b3079" ns2:_="" ns3:_="">
-    <xsd:import namespace="70093741-41eb-4420-bf3d-ff9555ef2a33"/>
-    <xsd:import namespace="8e0d46a4-c7d4-472b-9541-810c49191871"/>
-    <xsd:element name="properties">
-      <xsd:complexType>
-        <xsd:sequence>
-          <xsd:element name="documentManagement">
-            <xsd:complexType>
-              <xsd:all>
-                <xsd:element ref="ns2:MediaServiceMetadata" minOccurs="0"/>
-                <xsd:element ref="ns2:MediaServiceFastMetadata" minOccurs="0"/>
-                <xsd:element ref="ns2:MediaServiceSearchProperties" minOccurs="0"/>
-                <xsd:element ref="ns2:MediaServiceDateTaken" minOccurs="0"/>
-                <xsd:element ref="ns2:MediaServiceGenerationTime" minOccurs="0"/>
-                <xsd:element ref="ns2:MediaServiceEventHashCode" minOccurs="0"/>
-                <xsd:element ref="ns2:MediaLengthInSeconds" minOccurs="0"/>
-                <xsd:element ref="ns2:lcf76f155ced4ddcb4097134ff3c332f" minOccurs="0"/>
-                <xsd:element ref="ns3:TaxCatchAll" minOccurs="0"/>
-                <xsd:element ref="ns2:MediaServiceOCR" minOccurs="0"/>
-                <xsd:element ref="ns2:MediaServiceBillingMetadata" minOccurs="0"/>
-                <xsd:element ref="ns2:MediaServiceLocation" minOccurs="0"/>
-              </xsd:all>
-            </xsd:complexType>
-          </xsd:element>
-        </xsd:sequence>
-      </xsd:complexType>
-    </xsd:element>
-  </xsd:schema>
-  <xsd:schema xmlns:xsd="http://www.w3.org/2001/XMLSchema" xmlns:xs="http://www.w3.org/2001/XMLSchema" xmlns:dms="http://schemas.microsoft.com/office/2006/documentManagement/types" xmlns:pc="http://schemas.microsoft.com/office/infopath/2007/PartnerControls" targetNamespace="70093741-41eb-4420-bf3d-ff9555ef2a33" elementFormDefault="qualified">
-    <xsd:import namespace="http://schemas.microsoft.com/office/2006/documentManagement/types"/>
-    <xsd:import namespace="http://schemas.microsoft.com/office/infopath/2007/PartnerControls"/>
-    <xsd:element name="MediaServiceMetadata" ma:index="8" nillable="true" ma:displayName="MediaServiceMetadata" ma:hidden="true" ma:internalName="MediaServiceMetadata" ma:readOnly="true">
-      <xsd:simpleType>
-        <xsd:restriction base="dms:Note"/>
-      </xsd:simpleType>
-    </xsd:element>
-    <xsd:element name="MediaServiceFastMetadata" ma:index="9" nillable="true" ma:displayName="MediaServiceFastMetadata" ma:hidden="true" ma:internalName="MediaServiceFastMetadata" ma:readOnly="true">
-      <xsd:simpleType>
-        <xsd:restriction base="dms:Note"/>
-      </xsd:simpleType>
-    </xsd:element>
-    <xsd:element name="MediaServiceSearchProperties" ma:index="10" nillable="true" ma:displayName="MediaServiceSearchProperties" ma:hidden="true" ma:internalName="MediaServiceSearchProperties" ma:readOnly="true">
-      <xsd:simpleType>
-        <xsd:restriction base="dms:Note"/>
-      </xsd:simpleType>
-    </xsd:element>
-    <xsd:element name="MediaServiceDateTaken" ma:index="11" nillable="true" ma:displayName="MediaServiceDateTaken" ma:hidden="true" ma:indexed="true" ma:internalName="MediaServiceDateTaken" ma:readOnly="true">
-      <xsd:simpleType>
-        <xsd:restriction base="dms:Text"/>
-      </xsd:simpleType>
-    </xsd:element>
-    <xsd:element name="MediaServiceGenerationTime" ma:index="12" nillable="true" ma:displayName="MediaServiceGenerationTime" ma:hidden="true" ma:internalName="MediaServiceGenerationTime" ma:readOnly="true">
-      <xsd:simpleType>
-        <xsd:restriction base="dms:Text"/>
-      </xsd:simpleType>
-    </xsd:element>
-    <xsd:element name="MediaServiceEventHashCode" ma:index="13" nillable="true" ma:displayName="MediaServiceEventHashCode" ma:hidden="true" ma:internalName="MediaServiceEventHashCode" ma:readOnly="true">
-      <xsd:simpleType>
-        <xsd:restriction base="dms:Text"/>
-      </xsd:simpleType>
-    </xsd:element>
-    <xsd:element name="MediaLengthInSeconds" ma:index="14" nillable="true" ma:displayName="MediaLengthInSeconds" ma:hidden="true" ma:internalName="MediaLengthInSeconds" ma:readOnly="true">
-      <xsd:simpleType>
-        <xsd:restriction base="dms:Unknown"/>
-      </xsd:simpleType>
-    </xsd:element>
-    <xsd:element name="lcf76f155ced4ddcb4097134ff3c332f" ma:index="16" nillable="true" ma:taxonomy="true" ma:internalName="lcf76f155ced4ddcb4097134ff3c332f" ma:taxonomyFieldName="MediaServiceImageTags" ma:displayName="Afbeeldingtags" ma:readOnly="false" ma:fieldId="{5cf76f15-5ced-4ddc-b409-7134ff3c332f}" ma:taxonomyMulti="true" ma:sspId="5bd69f14-2b9f-433c-9887-fccfa466e118" ma:termSetId="09814cd3-568e-fe90-9814-8d621ff8fb84" ma:anchorId="fba54fb3-c3e1-fe81-a776-ca4b69148c4d" ma:open="true" ma:isKeyword="false">
-      <xsd:complexType>
-        <xsd:sequence>
-          <xsd:element ref="pc:Terms" minOccurs="0" maxOccurs="1"/>
-        </xsd:sequence>
-      </xsd:complexType>
-    </xsd:element>
-    <xsd:element name="MediaServiceOCR" ma:index="18" nillable="true" ma:displayName="Extracted Text" ma:internalName="MediaServiceOCR" ma:readOnly="true">
-      <xsd:simpleType>
-        <xsd:restriction base="dms:Note">
-          <xsd:maxLength value="255"/>
-        </xsd:restriction>
-      </xsd:simpleType>
-    </xsd:element>
-    <xsd:element name="MediaServiceBillingMetadata" ma:index="19" nillable="true" ma:displayName="MediaServiceBillingMetadata" ma:hidden="true" ma:internalName="MediaServiceBillingMetadata" ma:readOnly="true">
-      <xsd:simpleType>
-        <xsd:restriction base="dms:Note"/>
-      </xsd:simpleType>
-    </xsd:element>
-    <xsd:element name="MediaServiceLocation" ma:index="20" nillable="true" ma:displayName="Location" ma:description="" ma:indexed="true" ma:internalName="MediaServiceLocation" ma:readOnly="true">
-      <xsd:simpleType>
-        <xsd:restriction base="dms:Text"/>
-      </xsd:simpleType>
-    </xsd:element>
-  </xsd:schema>
-  <xsd:schema xmlns:xsd="http://www.w3.org/2001/XMLSchema" xmlns:xs="http://www.w3.org/2001/XMLSchema" xmlns:dms="http://schemas.microsoft.com/office/2006/documentManagement/types" xmlns:pc="http://schemas.microsoft.com/office/infopath/2007/PartnerControls" targetNamespace="8e0d46a4-c7d4-472b-9541-810c49191871" elementFormDefault="qualified">
-    <xsd:import namespace="http://schemas.microsoft.com/office/2006/documentManagement/types"/>
-    <xsd:import namespace="http://schemas.microsoft.com/office/infopath/2007/PartnerControls"/>
-    <xsd:element name="TaxCatchAll" ma:index="17" nillable="true" ma:displayName="Taxonomy Catch All Column" ma:hidden="true" ma:list="{c8ab18b9-6097-49a0-8cf1-8fd8c6c84254}" ma:internalName="TaxCatchAll" ma:showField="CatchAllData" ma:web="8e0d46a4-c7d4-472b-9541-810c49191871">
-      <xsd:complexType>
-        <xsd:complexContent>
-          <xsd:extension base="dms:MultiChoiceLookup">
-            <xsd:sequence>
-              <xsd:element name="Value" type="dms:Lookup" maxOccurs="unbounded" minOccurs="0" nillable="true"/>
-            </xsd:sequence>
-          </xsd:extension>
-        </xsd:complexContent>
-      </xsd:complexType>
-    </xsd:element>
-  </xsd:schema>
-  <xsd:schema xmlns="http://schemas.openxmlformats.org/package/2006/metadata/core-properties" xmlns:xsd="http://www.w3.org/2001/XMLSchema" xmlns:xsi="http://www.w3.org/2001/XMLSchema-instance" xmlns:dc="http://purl.org/dc/elements/1.1/" xmlns:dcterms="http://purl.org/dc/terms/" xmlns:odoc="http://schemas.microsoft.com/internal/obd" targetNamespace="http://schemas.openxmlformats.org/package/2006/metadata/core-properties" elementFormDefault="qualified" attributeFormDefault="unqualified" blockDefault="#all">
-    <xsd:import namespace="http://purl.org/dc/elements/1.1/" schemaLocation="http://dublincore.org/schemas/xmls/qdc/2003/04/02/dc.xsd"/>
-    <xsd:import namespace="http://purl.org/dc/terms/" schemaLocation="http://dublincore.org/schemas/xmls/qdc/2003/04/02/dcterms.xsd"/>
-    <xsd:element name="coreProperties" type="CT_coreProperties"/>
-    <xsd:complexType name="CT_coreProperties">
-      <xsd:all>
-        <xsd:element ref="dc:creator" minOccurs="0" maxOccurs="1"/>
-        <xsd:element ref="dcterms:created" minOccurs="0" maxOccurs="1"/>
-        <xsd:element ref="dc:identifier" minOccurs="0" maxOccurs="1"/>
-        <xsd:element name="contentType" minOccurs="0" maxOccurs="1" type="xsd:string" ma:index="0" ma:displayName="Inhoudstype"/>
-        <xsd:element ref="dc:title" minOccurs="0" maxOccurs="1" ma:index="4" ma:displayName="Titel"/>
-        <xsd:element ref="dc:subject" minOccurs="0" maxOccurs="1"/>
-        <xsd:element ref="dc:description" minOccurs="0" maxOccurs="1"/>
-        <xsd:element name="keywords" minOccurs="0" maxOccurs="1" type="xsd:string"/>
-        <xsd:element ref="dc:language" minOccurs="0" maxOccurs="1"/>
-        <xsd:element name="category" minOccurs="0" maxOccurs="1" type="xsd:string"/>
-        <xsd:element name="version" minOccurs="0" maxOccurs="1" type="xsd:string"/>
-        <xsd:element name="revision" minOccurs="0" maxOccurs="1" type="xsd:string">
-          <xsd:annotation>
-            <xsd:documentation>
-                        This value indicates the number of saves or revisions. The application is responsible for updating this value after each revision.
-                    </xsd:documentation>
-          </xsd:annotation>
-        </xsd:element>
-        <xsd:element name="lastModifiedBy" minOccurs="0" maxOccurs="1" type="xsd:string"/>
-        <xsd:element ref="dcterms:modified" minOccurs="0" maxOccurs="1"/>
-        <xsd:element name="contentStatus" minOccurs="0" maxOccurs="1" type="xsd:string"/>
-      </xsd:all>
-    </xsd:complexType>
-  </xsd:schema>
-  <xs:schema xmlns:pc="http://schemas.microsoft.com/office/infopath/2007/PartnerControls" xmlns:xs="http://www.w3.org/2001/XMLSchema" targetNamespace="http://schemas.microsoft.com/office/infopath/2007/PartnerControls" elementFormDefault="qualified" attributeFormDefault="unqualified">
-    <xs:element name="Person">
-      <xs:complexType>
-        <xs:sequence>
-          <xs:element ref="pc:DisplayName" minOccurs="0"/>
-          <xs:element ref="pc:AccountId" minOccurs="0"/>
-          <xs:element ref="pc:AccountType" minOccurs="0"/>
-        </xs:sequence>
-      </xs:complexType>
-    </xs:element>
-    <xs:element name="DisplayName" type="xs:string"/>
-    <xs:element name="AccountId" type="xs:string"/>
-    <xs:element name="AccountType" type="xs:string"/>
-    <xs:element name="BDCAssociatedEntity">
-      <xs:complexType>
-        <xs:sequence>
-          <xs:element ref="pc:BDCEntity" minOccurs="0" maxOccurs="unbounded"/>
-        </xs:sequence>
-        <xs:attribute ref="pc:EntityNamespace"/>
-        <xs:attribute ref="pc:EntityName"/>
-        <xs:attribute ref="pc:SystemInstanceName"/>
-        <xs:attribute ref="pc:AssociationName"/>
-      </xs:complexType>
-    </xs:element>
-    <xs:attribute name="EntityNamespace" type="xs:string"/>
-    <xs:attribute name="EntityName" type="xs:string"/>
-    <xs:attribute name="SystemInstanceName" type="xs:string"/>
-    <xs:attribute name="AssociationName" type="xs:string"/>
-    <xs:element name="BDCEntity">
-      <xs:complexType>
-        <xs:sequence>
-          <xs:element ref="pc:EntityDisplayName" minOccurs="0"/>
-          <xs:element ref="pc:EntityInstanceReference" minOccurs="0"/>
-          <xs:element ref="pc:EntityId1" minOccurs="0"/>
-          <xs:element ref="pc:EntityId2" minOccurs="0"/>
-          <xs:element ref="pc:EntityId3" minOccurs="0"/>
-          <xs:element ref="pc:EntityId4" minOccurs="0"/>
-          <xs:element ref="pc:EntityId5" minOccurs="0"/>
-        </xs:sequence>
-      </xs:complexType>
-    </xs:element>
-    <xs:element name="EntityDisplayName" type="xs:string"/>
-    <xs:element name="EntityInstanceReference" type="xs:string"/>
-    <xs:element name="EntityId1" type="xs:string"/>
-    <xs:element name="EntityId2" type="xs:string"/>
-    <xs:element name="EntityId3" type="xs:string"/>
-    <xs:element name="EntityId4" type="xs:string"/>
-    <xs:element name="EntityId5" type="xs:string"/>
-    <xs:element name="Terms">
-      <xs:complexType>
-        <xs:sequence>
-          <xs:element ref="pc:TermInfo" minOccurs="0" maxOccurs="unbounded"/>
-        </xs:sequence>
-      </xs:complexType>
-    </xs:element>
-    <xs:element name="TermInfo">
-      <xs:complexType>
-        <xs:sequence>
-          <xs:element ref="pc:TermName" minOccurs="0"/>
-          <xs:element ref="pc:TermId" minOccurs="0"/>
-        </xs:sequence>
-      </xs:complexType>
-    </xs:element>
-    <xs:element name="TermName" type="xs:string"/>
-    <xs:element name="TermId" type="xs:string"/>
-  </xs:schema>
-</ct:contentTypeSchema>
+<p:properties xmlns:p="http://schemas.microsoft.com/office/2006/metadata/properties" xmlns:xsi="http://www.w3.org/2001/XMLSchema-instance" xmlns:pc="http://schemas.microsoft.com/office/infopath/2007/PartnerControls">
+  <documentManagement>
+    <lcf76f155ced4ddcb4097134ff3c332f xmlns="70093741-41eb-4420-bf3d-ff9555ef2a33">
+      <Terms xmlns="http://schemas.microsoft.com/office/infopath/2007/PartnerControls"/>
+    </lcf76f155ced4ddcb4097134ff3c332f>
+    <TaxCatchAll xmlns="8e0d46a4-c7d4-472b-9541-810c49191871" xsi:nil="true"/>
+  </documentManagement>
+</p:properties>
 </file>
 
 <file path=customXml/item4.xml><?xml version="1.0" encoding="utf-8"?>
@@ -11827,14 +11104,210 @@
 </file>
 
 <file path=customXml/item5.xml><?xml version="1.0" encoding="utf-8"?>
-<p:properties xmlns:p="http://schemas.microsoft.com/office/2006/metadata/properties" xmlns:xsi="http://www.w3.org/2001/XMLSchema-instance" xmlns:pc="http://schemas.microsoft.com/office/infopath/2007/PartnerControls">
-  <documentManagement>
-    <lcf76f155ced4ddcb4097134ff3c332f xmlns="70093741-41eb-4420-bf3d-ff9555ef2a33">
-      <Terms xmlns="http://schemas.microsoft.com/office/infopath/2007/PartnerControls"/>
-    </lcf76f155ced4ddcb4097134ff3c332f>
-    <TaxCatchAll xmlns="8e0d46a4-c7d4-472b-9541-810c49191871" xsi:nil="true"/>
-  </documentManagement>
-</p:properties>
+<ct:contentTypeSchema xmlns:ct="http://schemas.microsoft.com/office/2006/metadata/contentType" xmlns:ma="http://schemas.microsoft.com/office/2006/metadata/properties/metaAttributes" ct:_="" ma:_="" ma:contentTypeName="Document" ma:contentTypeID="0x0101009AEE7C0E3FC1AF49AE2D21952FC004E7" ma:contentTypeVersion="13" ma:contentTypeDescription="Een nieuw document maken." ma:contentTypeScope="" ma:versionID="960b10dc37b0d3729643b1edbc9ea311">
+  <xsd:schema xmlns:xsd="http://www.w3.org/2001/XMLSchema" xmlns:xs="http://www.w3.org/2001/XMLSchema" xmlns:p="http://schemas.microsoft.com/office/2006/metadata/properties" xmlns:ns2="70093741-41eb-4420-bf3d-ff9555ef2a33" xmlns:ns3="8e0d46a4-c7d4-472b-9541-810c49191871" targetNamespace="http://schemas.microsoft.com/office/2006/metadata/properties" ma:root="true" ma:fieldsID="8470fe0247e22942882bacf7112b3079" ns2:_="" ns3:_="">
+    <xsd:import namespace="70093741-41eb-4420-bf3d-ff9555ef2a33"/>
+    <xsd:import namespace="8e0d46a4-c7d4-472b-9541-810c49191871"/>
+    <xsd:element name="properties">
+      <xsd:complexType>
+        <xsd:sequence>
+          <xsd:element name="documentManagement">
+            <xsd:complexType>
+              <xsd:all>
+                <xsd:element ref="ns2:MediaServiceMetadata" minOccurs="0"/>
+                <xsd:element ref="ns2:MediaServiceFastMetadata" minOccurs="0"/>
+                <xsd:element ref="ns2:MediaServiceSearchProperties" minOccurs="0"/>
+                <xsd:element ref="ns2:MediaServiceDateTaken" minOccurs="0"/>
+                <xsd:element ref="ns2:MediaServiceGenerationTime" minOccurs="0"/>
+                <xsd:element ref="ns2:MediaServiceEventHashCode" minOccurs="0"/>
+                <xsd:element ref="ns2:MediaLengthInSeconds" minOccurs="0"/>
+                <xsd:element ref="ns2:lcf76f155ced4ddcb4097134ff3c332f" minOccurs="0"/>
+                <xsd:element ref="ns3:TaxCatchAll" minOccurs="0"/>
+                <xsd:element ref="ns2:MediaServiceOCR" minOccurs="0"/>
+                <xsd:element ref="ns2:MediaServiceBillingMetadata" minOccurs="0"/>
+                <xsd:element ref="ns2:MediaServiceLocation" minOccurs="0"/>
+              </xsd:all>
+            </xsd:complexType>
+          </xsd:element>
+        </xsd:sequence>
+      </xsd:complexType>
+    </xsd:element>
+  </xsd:schema>
+  <xsd:schema xmlns:xsd="http://www.w3.org/2001/XMLSchema" xmlns:xs="http://www.w3.org/2001/XMLSchema" xmlns:dms="http://schemas.microsoft.com/office/2006/documentManagement/types" xmlns:pc="http://schemas.microsoft.com/office/infopath/2007/PartnerControls" targetNamespace="70093741-41eb-4420-bf3d-ff9555ef2a33" elementFormDefault="qualified">
+    <xsd:import namespace="http://schemas.microsoft.com/office/2006/documentManagement/types"/>
+    <xsd:import namespace="http://schemas.microsoft.com/office/infopath/2007/PartnerControls"/>
+    <xsd:element name="MediaServiceMetadata" ma:index="8" nillable="true" ma:displayName="MediaServiceMetadata" ma:hidden="true" ma:internalName="MediaServiceMetadata" ma:readOnly="true">
+      <xsd:simpleType>
+        <xsd:restriction base="dms:Note"/>
+      </xsd:simpleType>
+    </xsd:element>
+    <xsd:element name="MediaServiceFastMetadata" ma:index="9" nillable="true" ma:displayName="MediaServiceFastMetadata" ma:hidden="true" ma:internalName="MediaServiceFastMetadata" ma:readOnly="true">
+      <xsd:simpleType>
+        <xsd:restriction base="dms:Note"/>
+      </xsd:simpleType>
+    </xsd:element>
+    <xsd:element name="MediaServiceSearchProperties" ma:index="10" nillable="true" ma:displayName="MediaServiceSearchProperties" ma:hidden="true" ma:internalName="MediaServiceSearchProperties" ma:readOnly="true">
+      <xsd:simpleType>
+        <xsd:restriction base="dms:Note"/>
+      </xsd:simpleType>
+    </xsd:element>
+    <xsd:element name="MediaServiceDateTaken" ma:index="11" nillable="true" ma:displayName="MediaServiceDateTaken" ma:hidden="true" ma:indexed="true" ma:internalName="MediaServiceDateTaken" ma:readOnly="true">
+      <xsd:simpleType>
+        <xsd:restriction base="dms:Text"/>
+      </xsd:simpleType>
+    </xsd:element>
+    <xsd:element name="MediaServiceGenerationTime" ma:index="12" nillable="true" ma:displayName="MediaServiceGenerationTime" ma:hidden="true" ma:internalName="MediaServiceGenerationTime" ma:readOnly="true">
+      <xsd:simpleType>
+        <xsd:restriction base="dms:Text"/>
+      </xsd:simpleType>
+    </xsd:element>
+    <xsd:element name="MediaServiceEventHashCode" ma:index="13" nillable="true" ma:displayName="MediaServiceEventHashCode" ma:hidden="true" ma:internalName="MediaServiceEventHashCode" ma:readOnly="true">
+      <xsd:simpleType>
+        <xsd:restriction base="dms:Text"/>
+      </xsd:simpleType>
+    </xsd:element>
+    <xsd:element name="MediaLengthInSeconds" ma:index="14" nillable="true" ma:displayName="MediaLengthInSeconds" ma:hidden="true" ma:internalName="MediaLengthInSeconds" ma:readOnly="true">
+      <xsd:simpleType>
+        <xsd:restriction base="dms:Unknown"/>
+      </xsd:simpleType>
+    </xsd:element>
+    <xsd:element name="lcf76f155ced4ddcb4097134ff3c332f" ma:index="16" nillable="true" ma:taxonomy="true" ma:internalName="lcf76f155ced4ddcb4097134ff3c332f" ma:taxonomyFieldName="MediaServiceImageTags" ma:displayName="Afbeeldingtags" ma:readOnly="false" ma:fieldId="{5cf76f15-5ced-4ddc-b409-7134ff3c332f}" ma:taxonomyMulti="true" ma:sspId="5bd69f14-2b9f-433c-9887-fccfa466e118" ma:termSetId="09814cd3-568e-fe90-9814-8d621ff8fb84" ma:anchorId="fba54fb3-c3e1-fe81-a776-ca4b69148c4d" ma:open="true" ma:isKeyword="false">
+      <xsd:complexType>
+        <xsd:sequence>
+          <xsd:element ref="pc:Terms" minOccurs="0" maxOccurs="1"/>
+        </xsd:sequence>
+      </xsd:complexType>
+    </xsd:element>
+    <xsd:element name="MediaServiceOCR" ma:index="18" nillable="true" ma:displayName="Extracted Text" ma:internalName="MediaServiceOCR" ma:readOnly="true">
+      <xsd:simpleType>
+        <xsd:restriction base="dms:Note">
+          <xsd:maxLength value="255"/>
+        </xsd:restriction>
+      </xsd:simpleType>
+    </xsd:element>
+    <xsd:element name="MediaServiceBillingMetadata" ma:index="19" nillable="true" ma:displayName="MediaServiceBillingMetadata" ma:hidden="true" ma:internalName="MediaServiceBillingMetadata" ma:readOnly="true">
+      <xsd:simpleType>
+        <xsd:restriction base="dms:Note"/>
+      </xsd:simpleType>
+    </xsd:element>
+    <xsd:element name="MediaServiceLocation" ma:index="20" nillable="true" ma:displayName="Location" ma:description="" ma:indexed="true" ma:internalName="MediaServiceLocation" ma:readOnly="true">
+      <xsd:simpleType>
+        <xsd:restriction base="dms:Text"/>
+      </xsd:simpleType>
+    </xsd:element>
+  </xsd:schema>
+  <xsd:schema xmlns:xsd="http://www.w3.org/2001/XMLSchema" xmlns:xs="http://www.w3.org/2001/XMLSchema" xmlns:dms="http://schemas.microsoft.com/office/2006/documentManagement/types" xmlns:pc="http://schemas.microsoft.com/office/infopath/2007/PartnerControls" targetNamespace="8e0d46a4-c7d4-472b-9541-810c49191871" elementFormDefault="qualified">
+    <xsd:import namespace="http://schemas.microsoft.com/office/2006/documentManagement/types"/>
+    <xsd:import namespace="http://schemas.microsoft.com/office/infopath/2007/PartnerControls"/>
+    <xsd:element name="TaxCatchAll" ma:index="17" nillable="true" ma:displayName="Taxonomy Catch All Column" ma:hidden="true" ma:list="{c8ab18b9-6097-49a0-8cf1-8fd8c6c84254}" ma:internalName="TaxCatchAll" ma:showField="CatchAllData" ma:web="8e0d46a4-c7d4-472b-9541-810c49191871">
+      <xsd:complexType>
+        <xsd:complexContent>
+          <xsd:extension base="dms:MultiChoiceLookup">
+            <xsd:sequence>
+              <xsd:element name="Value" type="dms:Lookup" maxOccurs="unbounded" minOccurs="0" nillable="true"/>
+            </xsd:sequence>
+          </xsd:extension>
+        </xsd:complexContent>
+      </xsd:complexType>
+    </xsd:element>
+  </xsd:schema>
+  <xsd:schema xmlns="http://schemas.openxmlformats.org/package/2006/metadata/core-properties" xmlns:xsd="http://www.w3.org/2001/XMLSchema" xmlns:xsi="http://www.w3.org/2001/XMLSchema-instance" xmlns:dc="http://purl.org/dc/elements/1.1/" xmlns:dcterms="http://purl.org/dc/terms/" xmlns:odoc="http://schemas.microsoft.com/internal/obd" targetNamespace="http://schemas.openxmlformats.org/package/2006/metadata/core-properties" elementFormDefault="qualified" attributeFormDefault="unqualified" blockDefault="#all">
+    <xsd:import namespace="http://purl.org/dc/elements/1.1/" schemaLocation="http://dublincore.org/schemas/xmls/qdc/2003/04/02/dc.xsd"/>
+    <xsd:import namespace="http://purl.org/dc/terms/" schemaLocation="http://dublincore.org/schemas/xmls/qdc/2003/04/02/dcterms.xsd"/>
+    <xsd:element name="coreProperties" type="CT_coreProperties"/>
+    <xsd:complexType name="CT_coreProperties">
+      <xsd:all>
+        <xsd:element ref="dc:creator" minOccurs="0" maxOccurs="1"/>
+        <xsd:element ref="dcterms:created" minOccurs="0" maxOccurs="1"/>
+        <xsd:element ref="dc:identifier" minOccurs="0" maxOccurs="1"/>
+        <xsd:element name="contentType" minOccurs="0" maxOccurs="1" type="xsd:string" ma:index="0" ma:displayName="Inhoudstype"/>
+        <xsd:element ref="dc:title" minOccurs="0" maxOccurs="1" ma:index="4" ma:displayName="Titel"/>
+        <xsd:element ref="dc:subject" minOccurs="0" maxOccurs="1"/>
+        <xsd:element ref="dc:description" minOccurs="0" maxOccurs="1"/>
+        <xsd:element name="keywords" minOccurs="0" maxOccurs="1" type="xsd:string"/>
+        <xsd:element ref="dc:language" minOccurs="0" maxOccurs="1"/>
+        <xsd:element name="category" minOccurs="0" maxOccurs="1" type="xsd:string"/>
+        <xsd:element name="version" minOccurs="0" maxOccurs="1" type="xsd:string"/>
+        <xsd:element name="revision" minOccurs="0" maxOccurs="1" type="xsd:string">
+          <xsd:annotation>
+            <xsd:documentation>
+                        This value indicates the number of saves or revisions. The application is responsible for updating this value after each revision.
+                    </xsd:documentation>
+          </xsd:annotation>
+        </xsd:element>
+        <xsd:element name="lastModifiedBy" minOccurs="0" maxOccurs="1" type="xsd:string"/>
+        <xsd:element ref="dcterms:modified" minOccurs="0" maxOccurs="1"/>
+        <xsd:element name="contentStatus" minOccurs="0" maxOccurs="1" type="xsd:string"/>
+      </xsd:all>
+    </xsd:complexType>
+  </xsd:schema>
+  <xs:schema xmlns:pc="http://schemas.microsoft.com/office/infopath/2007/PartnerControls" xmlns:xs="http://www.w3.org/2001/XMLSchema" targetNamespace="http://schemas.microsoft.com/office/infopath/2007/PartnerControls" elementFormDefault="qualified" attributeFormDefault="unqualified">
+    <xs:element name="Person">
+      <xs:complexType>
+        <xs:sequence>
+          <xs:element ref="pc:DisplayName" minOccurs="0"/>
+          <xs:element ref="pc:AccountId" minOccurs="0"/>
+          <xs:element ref="pc:AccountType" minOccurs="0"/>
+        </xs:sequence>
+      </xs:complexType>
+    </xs:element>
+    <xs:element name="DisplayName" type="xs:string"/>
+    <xs:element name="AccountId" type="xs:string"/>
+    <xs:element name="AccountType" type="xs:string"/>
+    <xs:element name="BDCAssociatedEntity">
+      <xs:complexType>
+        <xs:sequence>
+          <xs:element ref="pc:BDCEntity" minOccurs="0" maxOccurs="unbounded"/>
+        </xs:sequence>
+        <xs:attribute ref="pc:EntityNamespace"/>
+        <xs:attribute ref="pc:EntityName"/>
+        <xs:attribute ref="pc:SystemInstanceName"/>
+        <xs:attribute ref="pc:AssociationName"/>
+      </xs:complexType>
+    </xs:element>
+    <xs:attribute name="EntityNamespace" type="xs:string"/>
+    <xs:attribute name="EntityName" type="xs:string"/>
+    <xs:attribute name="SystemInstanceName" type="xs:string"/>
+    <xs:attribute name="AssociationName" type="xs:string"/>
+    <xs:element name="BDCEntity">
+      <xs:complexType>
+        <xs:sequence>
+          <xs:element ref="pc:EntityDisplayName" minOccurs="0"/>
+          <xs:element ref="pc:EntityInstanceReference" minOccurs="0"/>
+          <xs:element ref="pc:EntityId1" minOccurs="0"/>
+          <xs:element ref="pc:EntityId2" minOccurs="0"/>
+          <xs:element ref="pc:EntityId3" minOccurs="0"/>
+          <xs:element ref="pc:EntityId4" minOccurs="0"/>
+          <xs:element ref="pc:EntityId5" minOccurs="0"/>
+        </xs:sequence>
+      </xs:complexType>
+    </xs:element>
+    <xs:element name="EntityDisplayName" type="xs:string"/>
+    <xs:element name="EntityInstanceReference" type="xs:string"/>
+    <xs:element name="EntityId1" type="xs:string"/>
+    <xs:element name="EntityId2" type="xs:string"/>
+    <xs:element name="EntityId3" type="xs:string"/>
+    <xs:element name="EntityId4" type="xs:string"/>
+    <xs:element name="EntityId5" type="xs:string"/>
+    <xs:element name="Terms">
+      <xs:complexType>
+        <xs:sequence>
+          <xs:element ref="pc:TermInfo" minOccurs="0" maxOccurs="unbounded"/>
+        </xs:sequence>
+      </xs:complexType>
+    </xs:element>
+    <xs:element name="TermInfo">
+      <xs:complexType>
+        <xs:sequence>
+          <xs:element ref="pc:TermName" minOccurs="0"/>
+          <xs:element ref="pc:TermId" minOccurs="0"/>
+        </xs:sequence>
+      </xs:complexType>
+    </xs:element>
+    <xs:element name="TermName" type="xs:string"/>
+    <xs:element name="TermId" type="xs:string"/>
+  </xs:schema>
+</ct:contentTypeSchema>
 </file>
 
 <file path=customXml/itemProps1.xml><?xml version="1.0" encoding="utf-8"?>
@@ -11854,6 +11327,25 @@
 </file>
 
 <file path=customXml/itemProps3.xml><?xml version="1.0" encoding="utf-8"?>
+<ds:datastoreItem xmlns:ds="http://schemas.openxmlformats.org/officeDocument/2006/customXml" ds:itemID="{AFA79D07-4CBE-44F8-96D9-EF1619A15533}">
+  <ds:schemaRefs>
+    <ds:schemaRef ds:uri="http://schemas.microsoft.com/office/2006/metadata/properties"/>
+    <ds:schemaRef ds:uri="http://schemas.microsoft.com/office/infopath/2007/PartnerControls"/>
+    <ds:schemaRef ds:uri="70093741-41eb-4420-bf3d-ff9555ef2a33"/>
+    <ds:schemaRef ds:uri="8e0d46a4-c7d4-472b-9541-810c49191871"/>
+  </ds:schemaRefs>
+</ds:datastoreItem>
+</file>
+
+<file path=customXml/itemProps4.xml><?xml version="1.0" encoding="utf-8"?>
+<ds:datastoreItem xmlns:ds="http://schemas.openxmlformats.org/officeDocument/2006/customXml" ds:itemID="{A78D1BFD-FB21-4E94-A897-6F9CD570B4EA}">
+  <ds:schemaRefs>
+    <ds:schemaRef ds:uri="http://schemas.openxmlformats.org/officeDocument/2006/bibliography"/>
+  </ds:schemaRefs>
+</ds:datastoreItem>
+</file>
+
+<file path=customXml/itemProps5.xml><?xml version="1.0" encoding="utf-8"?>
 <ds:datastoreItem xmlns:ds="http://schemas.openxmlformats.org/officeDocument/2006/customXml" ds:itemID="{1D334DBD-E327-428E-966E-5E0935AA8778}">
   <ds:schemaRefs>
     <ds:schemaRef ds:uri="http://schemas.microsoft.com/office/2006/metadata/contentType"/>
@@ -11870,23 +11362,4 @@
     <ds:schemaRef ds:uri="http://schemas.microsoft.com/internal/obd"/>
   </ds:schemaRefs>
 </ds:datastoreItem>
-</file>
-
-<file path=customXml/itemProps4.xml><?xml version="1.0" encoding="utf-8"?>
-<ds:datastoreItem xmlns:ds="http://schemas.openxmlformats.org/officeDocument/2006/customXml" ds:itemID="{A78D1BFD-FB21-4E94-A897-6F9CD570B4EA}">
-  <ds:schemaRefs>
-    <ds:schemaRef ds:uri="http://schemas.openxmlformats.org/officeDocument/2006/bibliography"/>
-  </ds:schemaRefs>
-</ds:datastoreItem>
-</file>
-
-<file path=customXml/itemProps5.xml><?xml version="1.0" encoding="utf-8"?>
-<ds:datastoreItem xmlns:ds="http://schemas.openxmlformats.org/officeDocument/2006/customXml" ds:itemID="{AFA79D07-4CBE-44F8-96D9-EF1619A15533}">
-  <ds:schemaRefs>
-    <ds:schemaRef ds:uri="http://schemas.microsoft.com/office/2006/metadata/properties"/>
-    <ds:schemaRef ds:uri="http://schemas.microsoft.com/office/infopath/2007/PartnerControls"/>
-    <ds:schemaRef ds:uri="70093741-41eb-4420-bf3d-ff9555ef2a33"/>
-    <ds:schemaRef ds:uri="8e0d46a4-c7d4-472b-9541-810c49191871"/>
-  </ds:schemaRefs>
-</ds:datastoreItem>
 </file>
</xml_diff>

<commit_message>
Added Maiwant to Belbin roles.
</commit_message>
<xml_diff>
--- a/ZKOO3_PvA.docx
+++ b/ZKOO3_PvA.docx
@@ -4415,7 +4415,7 @@
         <w:rPr>
           <w:color w:val="FF0000"/>
         </w:rPr>
-        <w:t>Monitor</w:t>
+        <w:t>Plant</w:t>
       </w:r>
       <w:r>
         <w:rPr>
@@ -4428,12 +4428,17 @@
           <w:color w:val="FF0000"/>
         </w:rPr>
         <w:tab/>
-        <w:t>Bedrijfsman</w:t>
       </w:r>
       <w:r>
         <w:rPr>
           <w:color w:val="FF0000"/>
         </w:rPr>
+        <w:t>Voorzitter</w:t>
+      </w:r>
+      <w:r>
+        <w:rPr>
+          <w:color w:val="FF0000"/>
+        </w:rPr>
         <w:tab/>
       </w:r>
       <w:r>
@@ -4441,7 +4446,12 @@
           <w:color w:val="FF0000"/>
         </w:rPr>
         <w:tab/>
-        <w:t>Specialist</w:t>
+      </w:r>
+      <w:r>
+        <w:rPr>
+          <w:color w:val="FF0000"/>
+        </w:rPr>
+        <w:t>Brononderzoeker</w:t>
       </w:r>
     </w:p>
     <w:p>
@@ -6944,7 +6954,7 @@
             </wp:anchor>
           </w:drawing>
         </mc:Choice>
-        <mc:Fallback xmlns:a="http://schemas.openxmlformats.org/drawingml/2006/main" xmlns:pic="http://schemas.openxmlformats.org/drawingml/2006/picture" xmlns:a14="http://schemas.microsoft.com/office/drawing/2010/main">
+        <mc:Fallback xmlns:a14="http://schemas.microsoft.com/office/drawing/2010/main" xmlns:pic="http://schemas.openxmlformats.org/drawingml/2006/picture" xmlns:a="http://schemas.openxmlformats.org/drawingml/2006/main">
           <w:pict w14:anchorId="1CADCD6F">
             <v:group id="Groep 102" style="position:absolute;margin-left:-1in;margin-top:-29.55pt;width:595.25pt;height:835.05pt;z-index:-251657216" coordsize="75596,106051" coordorigin=",186" o:spid="_x0000_s1026" w14:anchorId="0FC57937" o:gfxdata="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">
               <v:shapetype id="_x0000_t75" coordsize="21600,21600" filled="f" stroked="f" o:spt="75" o:preferrelative="t" path="m@4@5l@4@11@9@11@9@5xe">
@@ -9929,11 +9939,13 @@
     <w:rsid w:val="004829CB"/>
     <w:rsid w:val="004B75D5"/>
     <w:rsid w:val="004F54BB"/>
+    <w:rsid w:val="00605C1F"/>
     <w:rsid w:val="007D1596"/>
     <w:rsid w:val="007E79EC"/>
     <w:rsid w:val="008D0D90"/>
     <w:rsid w:val="008D20A3"/>
     <w:rsid w:val="00946403"/>
+    <w:rsid w:val="00A745AF"/>
     <w:rsid w:val="00DD5D19"/>
   </w:rsids>
   <m:mathPr>
@@ -10713,14 +10725,210 @@
 </file>
 
 <file path=customXml/item3.xml><?xml version="1.0" encoding="utf-8"?>
-<p:properties xmlns:p="http://schemas.microsoft.com/office/2006/metadata/properties" xmlns:xsi="http://www.w3.org/2001/XMLSchema-instance" xmlns:pc="http://schemas.microsoft.com/office/infopath/2007/PartnerControls">
-  <documentManagement>
-    <lcf76f155ced4ddcb4097134ff3c332f xmlns="70093741-41eb-4420-bf3d-ff9555ef2a33">
-      <Terms xmlns="http://schemas.microsoft.com/office/infopath/2007/PartnerControls"/>
-    </lcf76f155ced4ddcb4097134ff3c332f>
-    <TaxCatchAll xmlns="8e0d46a4-c7d4-472b-9541-810c49191871" xsi:nil="true"/>
-  </documentManagement>
-</p:properties>
+<ct:contentTypeSchema xmlns:ct="http://schemas.microsoft.com/office/2006/metadata/contentType" xmlns:ma="http://schemas.microsoft.com/office/2006/metadata/properties/metaAttributes" ct:_="" ma:_="" ma:contentTypeName="Document" ma:contentTypeID="0x0101009AEE7C0E3FC1AF49AE2D21952FC004E7" ma:contentTypeVersion="13" ma:contentTypeDescription="Een nieuw document maken." ma:contentTypeScope="" ma:versionID="960b10dc37b0d3729643b1edbc9ea311">
+  <xsd:schema xmlns:xsd="http://www.w3.org/2001/XMLSchema" xmlns:xs="http://www.w3.org/2001/XMLSchema" xmlns:p="http://schemas.microsoft.com/office/2006/metadata/properties" xmlns:ns2="70093741-41eb-4420-bf3d-ff9555ef2a33" xmlns:ns3="8e0d46a4-c7d4-472b-9541-810c49191871" targetNamespace="http://schemas.microsoft.com/office/2006/metadata/properties" ma:root="true" ma:fieldsID="8470fe0247e22942882bacf7112b3079" ns2:_="" ns3:_="">
+    <xsd:import namespace="70093741-41eb-4420-bf3d-ff9555ef2a33"/>
+    <xsd:import namespace="8e0d46a4-c7d4-472b-9541-810c49191871"/>
+    <xsd:element name="properties">
+      <xsd:complexType>
+        <xsd:sequence>
+          <xsd:element name="documentManagement">
+            <xsd:complexType>
+              <xsd:all>
+                <xsd:element ref="ns2:MediaServiceMetadata" minOccurs="0"/>
+                <xsd:element ref="ns2:MediaServiceFastMetadata" minOccurs="0"/>
+                <xsd:element ref="ns2:MediaServiceSearchProperties" minOccurs="0"/>
+                <xsd:element ref="ns2:MediaServiceDateTaken" minOccurs="0"/>
+                <xsd:element ref="ns2:MediaServiceGenerationTime" minOccurs="0"/>
+                <xsd:element ref="ns2:MediaServiceEventHashCode" minOccurs="0"/>
+                <xsd:element ref="ns2:MediaLengthInSeconds" minOccurs="0"/>
+                <xsd:element ref="ns2:lcf76f155ced4ddcb4097134ff3c332f" minOccurs="0"/>
+                <xsd:element ref="ns3:TaxCatchAll" minOccurs="0"/>
+                <xsd:element ref="ns2:MediaServiceOCR" minOccurs="0"/>
+                <xsd:element ref="ns2:MediaServiceBillingMetadata" minOccurs="0"/>
+                <xsd:element ref="ns2:MediaServiceLocation" minOccurs="0"/>
+              </xsd:all>
+            </xsd:complexType>
+          </xsd:element>
+        </xsd:sequence>
+      </xsd:complexType>
+    </xsd:element>
+  </xsd:schema>
+  <xsd:schema xmlns:xsd="http://www.w3.org/2001/XMLSchema" xmlns:xs="http://www.w3.org/2001/XMLSchema" xmlns:dms="http://schemas.microsoft.com/office/2006/documentManagement/types" xmlns:pc="http://schemas.microsoft.com/office/infopath/2007/PartnerControls" targetNamespace="70093741-41eb-4420-bf3d-ff9555ef2a33" elementFormDefault="qualified">
+    <xsd:import namespace="http://schemas.microsoft.com/office/2006/documentManagement/types"/>
+    <xsd:import namespace="http://schemas.microsoft.com/office/infopath/2007/PartnerControls"/>
+    <xsd:element name="MediaServiceMetadata" ma:index="8" nillable="true" ma:displayName="MediaServiceMetadata" ma:hidden="true" ma:internalName="MediaServiceMetadata" ma:readOnly="true">
+      <xsd:simpleType>
+        <xsd:restriction base="dms:Note"/>
+      </xsd:simpleType>
+    </xsd:element>
+    <xsd:element name="MediaServiceFastMetadata" ma:index="9" nillable="true" ma:displayName="MediaServiceFastMetadata" ma:hidden="true" ma:internalName="MediaServiceFastMetadata" ma:readOnly="true">
+      <xsd:simpleType>
+        <xsd:restriction base="dms:Note"/>
+      </xsd:simpleType>
+    </xsd:element>
+    <xsd:element name="MediaServiceSearchProperties" ma:index="10" nillable="true" ma:displayName="MediaServiceSearchProperties" ma:hidden="true" ma:internalName="MediaServiceSearchProperties" ma:readOnly="true">
+      <xsd:simpleType>
+        <xsd:restriction base="dms:Note"/>
+      </xsd:simpleType>
+    </xsd:element>
+    <xsd:element name="MediaServiceDateTaken" ma:index="11" nillable="true" ma:displayName="MediaServiceDateTaken" ma:hidden="true" ma:indexed="true" ma:internalName="MediaServiceDateTaken" ma:readOnly="true">
+      <xsd:simpleType>
+        <xsd:restriction base="dms:Text"/>
+      </xsd:simpleType>
+    </xsd:element>
+    <xsd:element name="MediaServiceGenerationTime" ma:index="12" nillable="true" ma:displayName="MediaServiceGenerationTime" ma:hidden="true" ma:internalName="MediaServiceGenerationTime" ma:readOnly="true">
+      <xsd:simpleType>
+        <xsd:restriction base="dms:Text"/>
+      </xsd:simpleType>
+    </xsd:element>
+    <xsd:element name="MediaServiceEventHashCode" ma:index="13" nillable="true" ma:displayName="MediaServiceEventHashCode" ma:hidden="true" ma:internalName="MediaServiceEventHashCode" ma:readOnly="true">
+      <xsd:simpleType>
+        <xsd:restriction base="dms:Text"/>
+      </xsd:simpleType>
+    </xsd:element>
+    <xsd:element name="MediaLengthInSeconds" ma:index="14" nillable="true" ma:displayName="MediaLengthInSeconds" ma:hidden="true" ma:internalName="MediaLengthInSeconds" ma:readOnly="true">
+      <xsd:simpleType>
+        <xsd:restriction base="dms:Unknown"/>
+      </xsd:simpleType>
+    </xsd:element>
+    <xsd:element name="lcf76f155ced4ddcb4097134ff3c332f" ma:index="16" nillable="true" ma:taxonomy="true" ma:internalName="lcf76f155ced4ddcb4097134ff3c332f" ma:taxonomyFieldName="MediaServiceImageTags" ma:displayName="Afbeeldingtags" ma:readOnly="false" ma:fieldId="{5cf76f15-5ced-4ddc-b409-7134ff3c332f}" ma:taxonomyMulti="true" ma:sspId="5bd69f14-2b9f-433c-9887-fccfa466e118" ma:termSetId="09814cd3-568e-fe90-9814-8d621ff8fb84" ma:anchorId="fba54fb3-c3e1-fe81-a776-ca4b69148c4d" ma:open="true" ma:isKeyword="false">
+      <xsd:complexType>
+        <xsd:sequence>
+          <xsd:element ref="pc:Terms" minOccurs="0" maxOccurs="1"/>
+        </xsd:sequence>
+      </xsd:complexType>
+    </xsd:element>
+    <xsd:element name="MediaServiceOCR" ma:index="18" nillable="true" ma:displayName="Extracted Text" ma:internalName="MediaServiceOCR" ma:readOnly="true">
+      <xsd:simpleType>
+        <xsd:restriction base="dms:Note">
+          <xsd:maxLength value="255"/>
+        </xsd:restriction>
+      </xsd:simpleType>
+    </xsd:element>
+    <xsd:element name="MediaServiceBillingMetadata" ma:index="19" nillable="true" ma:displayName="MediaServiceBillingMetadata" ma:hidden="true" ma:internalName="MediaServiceBillingMetadata" ma:readOnly="true">
+      <xsd:simpleType>
+        <xsd:restriction base="dms:Note"/>
+      </xsd:simpleType>
+    </xsd:element>
+    <xsd:element name="MediaServiceLocation" ma:index="20" nillable="true" ma:displayName="Location" ma:description="" ma:indexed="true" ma:internalName="MediaServiceLocation" ma:readOnly="true">
+      <xsd:simpleType>
+        <xsd:restriction base="dms:Text"/>
+      </xsd:simpleType>
+    </xsd:element>
+  </xsd:schema>
+  <xsd:schema xmlns:xsd="http://www.w3.org/2001/XMLSchema" xmlns:xs="http://www.w3.org/2001/XMLSchema" xmlns:dms="http://schemas.microsoft.com/office/2006/documentManagement/types" xmlns:pc="http://schemas.microsoft.com/office/infopath/2007/PartnerControls" targetNamespace="8e0d46a4-c7d4-472b-9541-810c49191871" elementFormDefault="qualified">
+    <xsd:import namespace="http://schemas.microsoft.com/office/2006/documentManagement/types"/>
+    <xsd:import namespace="http://schemas.microsoft.com/office/infopath/2007/PartnerControls"/>
+    <xsd:element name="TaxCatchAll" ma:index="17" nillable="true" ma:displayName="Taxonomy Catch All Column" ma:hidden="true" ma:list="{c8ab18b9-6097-49a0-8cf1-8fd8c6c84254}" ma:internalName="TaxCatchAll" ma:showField="CatchAllData" ma:web="8e0d46a4-c7d4-472b-9541-810c49191871">
+      <xsd:complexType>
+        <xsd:complexContent>
+          <xsd:extension base="dms:MultiChoiceLookup">
+            <xsd:sequence>
+              <xsd:element name="Value" type="dms:Lookup" maxOccurs="unbounded" minOccurs="0" nillable="true"/>
+            </xsd:sequence>
+          </xsd:extension>
+        </xsd:complexContent>
+      </xsd:complexType>
+    </xsd:element>
+  </xsd:schema>
+  <xsd:schema xmlns="http://schemas.openxmlformats.org/package/2006/metadata/core-properties" xmlns:xsd="http://www.w3.org/2001/XMLSchema" xmlns:xsi="http://www.w3.org/2001/XMLSchema-instance" xmlns:dc="http://purl.org/dc/elements/1.1/" xmlns:dcterms="http://purl.org/dc/terms/" xmlns:odoc="http://schemas.microsoft.com/internal/obd" targetNamespace="http://schemas.openxmlformats.org/package/2006/metadata/core-properties" elementFormDefault="qualified" attributeFormDefault="unqualified" blockDefault="#all">
+    <xsd:import namespace="http://purl.org/dc/elements/1.1/" schemaLocation="http://dublincore.org/schemas/xmls/qdc/2003/04/02/dc.xsd"/>
+    <xsd:import namespace="http://purl.org/dc/terms/" schemaLocation="http://dublincore.org/schemas/xmls/qdc/2003/04/02/dcterms.xsd"/>
+    <xsd:element name="coreProperties" type="CT_coreProperties"/>
+    <xsd:complexType name="CT_coreProperties">
+      <xsd:all>
+        <xsd:element ref="dc:creator" minOccurs="0" maxOccurs="1"/>
+        <xsd:element ref="dcterms:created" minOccurs="0" maxOccurs="1"/>
+        <xsd:element ref="dc:identifier" minOccurs="0" maxOccurs="1"/>
+        <xsd:element name="contentType" minOccurs="0" maxOccurs="1" type="xsd:string" ma:index="0" ma:displayName="Inhoudstype"/>
+        <xsd:element ref="dc:title" minOccurs="0" maxOccurs="1" ma:index="4" ma:displayName="Titel"/>
+        <xsd:element ref="dc:subject" minOccurs="0" maxOccurs="1"/>
+        <xsd:element ref="dc:description" minOccurs="0" maxOccurs="1"/>
+        <xsd:element name="keywords" minOccurs="0" maxOccurs="1" type="xsd:string"/>
+        <xsd:element ref="dc:language" minOccurs="0" maxOccurs="1"/>
+        <xsd:element name="category" minOccurs="0" maxOccurs="1" type="xsd:string"/>
+        <xsd:element name="version" minOccurs="0" maxOccurs="1" type="xsd:string"/>
+        <xsd:element name="revision" minOccurs="0" maxOccurs="1" type="xsd:string">
+          <xsd:annotation>
+            <xsd:documentation>
+                        This value indicates the number of saves or revisions. The application is responsible for updating this value after each revision.
+                    </xsd:documentation>
+          </xsd:annotation>
+        </xsd:element>
+        <xsd:element name="lastModifiedBy" minOccurs="0" maxOccurs="1" type="xsd:string"/>
+        <xsd:element ref="dcterms:modified" minOccurs="0" maxOccurs="1"/>
+        <xsd:element name="contentStatus" minOccurs="0" maxOccurs="1" type="xsd:string"/>
+      </xsd:all>
+    </xsd:complexType>
+  </xsd:schema>
+  <xs:schema xmlns:pc="http://schemas.microsoft.com/office/infopath/2007/PartnerControls" xmlns:xs="http://www.w3.org/2001/XMLSchema" targetNamespace="http://schemas.microsoft.com/office/infopath/2007/PartnerControls" elementFormDefault="qualified" attributeFormDefault="unqualified">
+    <xs:element name="Person">
+      <xs:complexType>
+        <xs:sequence>
+          <xs:element ref="pc:DisplayName" minOccurs="0"/>
+          <xs:element ref="pc:AccountId" minOccurs="0"/>
+          <xs:element ref="pc:AccountType" minOccurs="0"/>
+        </xs:sequence>
+      </xs:complexType>
+    </xs:element>
+    <xs:element name="DisplayName" type="xs:string"/>
+    <xs:element name="AccountId" type="xs:string"/>
+    <xs:element name="AccountType" type="xs:string"/>
+    <xs:element name="BDCAssociatedEntity">
+      <xs:complexType>
+        <xs:sequence>
+          <xs:element ref="pc:BDCEntity" minOccurs="0" maxOccurs="unbounded"/>
+        </xs:sequence>
+        <xs:attribute ref="pc:EntityNamespace"/>
+        <xs:attribute ref="pc:EntityName"/>
+        <xs:attribute ref="pc:SystemInstanceName"/>
+        <xs:attribute ref="pc:AssociationName"/>
+      </xs:complexType>
+    </xs:element>
+    <xs:attribute name="EntityNamespace" type="xs:string"/>
+    <xs:attribute name="EntityName" type="xs:string"/>
+    <xs:attribute name="SystemInstanceName" type="xs:string"/>
+    <xs:attribute name="AssociationName" type="xs:string"/>
+    <xs:element name="BDCEntity">
+      <xs:complexType>
+        <xs:sequence>
+          <xs:element ref="pc:EntityDisplayName" minOccurs="0"/>
+          <xs:element ref="pc:EntityInstanceReference" minOccurs="0"/>
+          <xs:element ref="pc:EntityId1" minOccurs="0"/>
+          <xs:element ref="pc:EntityId2" minOccurs="0"/>
+          <xs:element ref="pc:EntityId3" minOccurs="0"/>
+          <xs:element ref="pc:EntityId4" minOccurs="0"/>
+          <xs:element ref="pc:EntityId5" minOccurs="0"/>
+        </xs:sequence>
+      </xs:complexType>
+    </xs:element>
+    <xs:element name="EntityDisplayName" type="xs:string"/>
+    <xs:element name="EntityInstanceReference" type="xs:string"/>
+    <xs:element name="EntityId1" type="xs:string"/>
+    <xs:element name="EntityId2" type="xs:string"/>
+    <xs:element name="EntityId3" type="xs:string"/>
+    <xs:element name="EntityId4" type="xs:string"/>
+    <xs:element name="EntityId5" type="xs:string"/>
+    <xs:element name="Terms">
+      <xs:complexType>
+        <xs:sequence>
+          <xs:element ref="pc:TermInfo" minOccurs="0" maxOccurs="unbounded"/>
+        </xs:sequence>
+      </xs:complexType>
+    </xs:element>
+    <xs:element name="TermInfo">
+      <xs:complexType>
+        <xs:sequence>
+          <xs:element ref="pc:TermName" minOccurs="0"/>
+          <xs:element ref="pc:TermId" minOccurs="0"/>
+        </xs:sequence>
+      </xs:complexType>
+    </xs:element>
+    <xs:element name="TermName" type="xs:string"/>
+    <xs:element name="TermId" type="xs:string"/>
+  </xs:schema>
+</ct:contentTypeSchema>
 </file>
 
 <file path=customXml/item4.xml><?xml version="1.0" encoding="utf-8"?>
@@ -11104,210 +11312,14 @@
 </file>
 
 <file path=customXml/item5.xml><?xml version="1.0" encoding="utf-8"?>
-<ct:contentTypeSchema xmlns:ct="http://schemas.microsoft.com/office/2006/metadata/contentType" xmlns:ma="http://schemas.microsoft.com/office/2006/metadata/properties/metaAttributes" ct:_="" ma:_="" ma:contentTypeName="Document" ma:contentTypeID="0x0101009AEE7C0E3FC1AF49AE2D21952FC004E7" ma:contentTypeVersion="13" ma:contentTypeDescription="Een nieuw document maken." ma:contentTypeScope="" ma:versionID="960b10dc37b0d3729643b1edbc9ea311">
-  <xsd:schema xmlns:xsd="http://www.w3.org/2001/XMLSchema" xmlns:xs="http://www.w3.org/2001/XMLSchema" xmlns:p="http://schemas.microsoft.com/office/2006/metadata/properties" xmlns:ns2="70093741-41eb-4420-bf3d-ff9555ef2a33" xmlns:ns3="8e0d46a4-c7d4-472b-9541-810c49191871" targetNamespace="http://schemas.microsoft.com/office/2006/metadata/properties" ma:root="true" ma:fieldsID="8470fe0247e22942882bacf7112b3079" ns2:_="" ns3:_="">
-    <xsd:import namespace="70093741-41eb-4420-bf3d-ff9555ef2a33"/>
-    <xsd:import namespace="8e0d46a4-c7d4-472b-9541-810c49191871"/>
-    <xsd:element name="properties">
-      <xsd:complexType>
-        <xsd:sequence>
-          <xsd:element name="documentManagement">
-            <xsd:complexType>
-              <xsd:all>
-                <xsd:element ref="ns2:MediaServiceMetadata" minOccurs="0"/>
-                <xsd:element ref="ns2:MediaServiceFastMetadata" minOccurs="0"/>
-                <xsd:element ref="ns2:MediaServiceSearchProperties" minOccurs="0"/>
-                <xsd:element ref="ns2:MediaServiceDateTaken" minOccurs="0"/>
-                <xsd:element ref="ns2:MediaServiceGenerationTime" minOccurs="0"/>
-                <xsd:element ref="ns2:MediaServiceEventHashCode" minOccurs="0"/>
-                <xsd:element ref="ns2:MediaLengthInSeconds" minOccurs="0"/>
-                <xsd:element ref="ns2:lcf76f155ced4ddcb4097134ff3c332f" minOccurs="0"/>
-                <xsd:element ref="ns3:TaxCatchAll" minOccurs="0"/>
-                <xsd:element ref="ns2:MediaServiceOCR" minOccurs="0"/>
-                <xsd:element ref="ns2:MediaServiceBillingMetadata" minOccurs="0"/>
-                <xsd:element ref="ns2:MediaServiceLocation" minOccurs="0"/>
-              </xsd:all>
-            </xsd:complexType>
-          </xsd:element>
-        </xsd:sequence>
-      </xsd:complexType>
-    </xsd:element>
-  </xsd:schema>
-  <xsd:schema xmlns:xsd="http://www.w3.org/2001/XMLSchema" xmlns:xs="http://www.w3.org/2001/XMLSchema" xmlns:dms="http://schemas.microsoft.com/office/2006/documentManagement/types" xmlns:pc="http://schemas.microsoft.com/office/infopath/2007/PartnerControls" targetNamespace="70093741-41eb-4420-bf3d-ff9555ef2a33" elementFormDefault="qualified">
-    <xsd:import namespace="http://schemas.microsoft.com/office/2006/documentManagement/types"/>
-    <xsd:import namespace="http://schemas.microsoft.com/office/infopath/2007/PartnerControls"/>
-    <xsd:element name="MediaServiceMetadata" ma:index="8" nillable="true" ma:displayName="MediaServiceMetadata" ma:hidden="true" ma:internalName="MediaServiceMetadata" ma:readOnly="true">
-      <xsd:simpleType>
-        <xsd:restriction base="dms:Note"/>
-      </xsd:simpleType>
-    </xsd:element>
-    <xsd:element name="MediaServiceFastMetadata" ma:index="9" nillable="true" ma:displayName="MediaServiceFastMetadata" ma:hidden="true" ma:internalName="MediaServiceFastMetadata" ma:readOnly="true">
-      <xsd:simpleType>
-        <xsd:restriction base="dms:Note"/>
-      </xsd:simpleType>
-    </xsd:element>
-    <xsd:element name="MediaServiceSearchProperties" ma:index="10" nillable="true" ma:displayName="MediaServiceSearchProperties" ma:hidden="true" ma:internalName="MediaServiceSearchProperties" ma:readOnly="true">
-      <xsd:simpleType>
-        <xsd:restriction base="dms:Note"/>
-      </xsd:simpleType>
-    </xsd:element>
-    <xsd:element name="MediaServiceDateTaken" ma:index="11" nillable="true" ma:displayName="MediaServiceDateTaken" ma:hidden="true" ma:indexed="true" ma:internalName="MediaServiceDateTaken" ma:readOnly="true">
-      <xsd:simpleType>
-        <xsd:restriction base="dms:Text"/>
-      </xsd:simpleType>
-    </xsd:element>
-    <xsd:element name="MediaServiceGenerationTime" ma:index="12" nillable="true" ma:displayName="MediaServiceGenerationTime" ma:hidden="true" ma:internalName="MediaServiceGenerationTime" ma:readOnly="true">
-      <xsd:simpleType>
-        <xsd:restriction base="dms:Text"/>
-      </xsd:simpleType>
-    </xsd:element>
-    <xsd:element name="MediaServiceEventHashCode" ma:index="13" nillable="true" ma:displayName="MediaServiceEventHashCode" ma:hidden="true" ma:internalName="MediaServiceEventHashCode" ma:readOnly="true">
-      <xsd:simpleType>
-        <xsd:restriction base="dms:Text"/>
-      </xsd:simpleType>
-    </xsd:element>
-    <xsd:element name="MediaLengthInSeconds" ma:index="14" nillable="true" ma:displayName="MediaLengthInSeconds" ma:hidden="true" ma:internalName="MediaLengthInSeconds" ma:readOnly="true">
-      <xsd:simpleType>
-        <xsd:restriction base="dms:Unknown"/>
-      </xsd:simpleType>
-    </xsd:element>
-    <xsd:element name="lcf76f155ced4ddcb4097134ff3c332f" ma:index="16" nillable="true" ma:taxonomy="true" ma:internalName="lcf76f155ced4ddcb4097134ff3c332f" ma:taxonomyFieldName="MediaServiceImageTags" ma:displayName="Afbeeldingtags" ma:readOnly="false" ma:fieldId="{5cf76f15-5ced-4ddc-b409-7134ff3c332f}" ma:taxonomyMulti="true" ma:sspId="5bd69f14-2b9f-433c-9887-fccfa466e118" ma:termSetId="09814cd3-568e-fe90-9814-8d621ff8fb84" ma:anchorId="fba54fb3-c3e1-fe81-a776-ca4b69148c4d" ma:open="true" ma:isKeyword="false">
-      <xsd:complexType>
-        <xsd:sequence>
-          <xsd:element ref="pc:Terms" minOccurs="0" maxOccurs="1"/>
-        </xsd:sequence>
-      </xsd:complexType>
-    </xsd:element>
-    <xsd:element name="MediaServiceOCR" ma:index="18" nillable="true" ma:displayName="Extracted Text" ma:internalName="MediaServiceOCR" ma:readOnly="true">
-      <xsd:simpleType>
-        <xsd:restriction base="dms:Note">
-          <xsd:maxLength value="255"/>
-        </xsd:restriction>
-      </xsd:simpleType>
-    </xsd:element>
-    <xsd:element name="MediaServiceBillingMetadata" ma:index="19" nillable="true" ma:displayName="MediaServiceBillingMetadata" ma:hidden="true" ma:internalName="MediaServiceBillingMetadata" ma:readOnly="true">
-      <xsd:simpleType>
-        <xsd:restriction base="dms:Note"/>
-      </xsd:simpleType>
-    </xsd:element>
-    <xsd:element name="MediaServiceLocation" ma:index="20" nillable="true" ma:displayName="Location" ma:description="" ma:indexed="true" ma:internalName="MediaServiceLocation" ma:readOnly="true">
-      <xsd:simpleType>
-        <xsd:restriction base="dms:Text"/>
-      </xsd:simpleType>
-    </xsd:element>
-  </xsd:schema>
-  <xsd:schema xmlns:xsd="http://www.w3.org/2001/XMLSchema" xmlns:xs="http://www.w3.org/2001/XMLSchema" xmlns:dms="http://schemas.microsoft.com/office/2006/documentManagement/types" xmlns:pc="http://schemas.microsoft.com/office/infopath/2007/PartnerControls" targetNamespace="8e0d46a4-c7d4-472b-9541-810c49191871" elementFormDefault="qualified">
-    <xsd:import namespace="http://schemas.microsoft.com/office/2006/documentManagement/types"/>
-    <xsd:import namespace="http://schemas.microsoft.com/office/infopath/2007/PartnerControls"/>
-    <xsd:element name="TaxCatchAll" ma:index="17" nillable="true" ma:displayName="Taxonomy Catch All Column" ma:hidden="true" ma:list="{c8ab18b9-6097-49a0-8cf1-8fd8c6c84254}" ma:internalName="TaxCatchAll" ma:showField="CatchAllData" ma:web="8e0d46a4-c7d4-472b-9541-810c49191871">
-      <xsd:complexType>
-        <xsd:complexContent>
-          <xsd:extension base="dms:MultiChoiceLookup">
-            <xsd:sequence>
-              <xsd:element name="Value" type="dms:Lookup" maxOccurs="unbounded" minOccurs="0" nillable="true"/>
-            </xsd:sequence>
-          </xsd:extension>
-        </xsd:complexContent>
-      </xsd:complexType>
-    </xsd:element>
-  </xsd:schema>
-  <xsd:schema xmlns="http://schemas.openxmlformats.org/package/2006/metadata/core-properties" xmlns:xsd="http://www.w3.org/2001/XMLSchema" xmlns:xsi="http://www.w3.org/2001/XMLSchema-instance" xmlns:dc="http://purl.org/dc/elements/1.1/" xmlns:dcterms="http://purl.org/dc/terms/" xmlns:odoc="http://schemas.microsoft.com/internal/obd" targetNamespace="http://schemas.openxmlformats.org/package/2006/metadata/core-properties" elementFormDefault="qualified" attributeFormDefault="unqualified" blockDefault="#all">
-    <xsd:import namespace="http://purl.org/dc/elements/1.1/" schemaLocation="http://dublincore.org/schemas/xmls/qdc/2003/04/02/dc.xsd"/>
-    <xsd:import namespace="http://purl.org/dc/terms/" schemaLocation="http://dublincore.org/schemas/xmls/qdc/2003/04/02/dcterms.xsd"/>
-    <xsd:element name="coreProperties" type="CT_coreProperties"/>
-    <xsd:complexType name="CT_coreProperties">
-      <xsd:all>
-        <xsd:element ref="dc:creator" minOccurs="0" maxOccurs="1"/>
-        <xsd:element ref="dcterms:created" minOccurs="0" maxOccurs="1"/>
-        <xsd:element ref="dc:identifier" minOccurs="0" maxOccurs="1"/>
-        <xsd:element name="contentType" minOccurs="0" maxOccurs="1" type="xsd:string" ma:index="0" ma:displayName="Inhoudstype"/>
-        <xsd:element ref="dc:title" minOccurs="0" maxOccurs="1" ma:index="4" ma:displayName="Titel"/>
-        <xsd:element ref="dc:subject" minOccurs="0" maxOccurs="1"/>
-        <xsd:element ref="dc:description" minOccurs="0" maxOccurs="1"/>
-        <xsd:element name="keywords" minOccurs="0" maxOccurs="1" type="xsd:string"/>
-        <xsd:element ref="dc:language" minOccurs="0" maxOccurs="1"/>
-        <xsd:element name="category" minOccurs="0" maxOccurs="1" type="xsd:string"/>
-        <xsd:element name="version" minOccurs="0" maxOccurs="1" type="xsd:string"/>
-        <xsd:element name="revision" minOccurs="0" maxOccurs="1" type="xsd:string">
-          <xsd:annotation>
-            <xsd:documentation>
-                        This value indicates the number of saves or revisions. The application is responsible for updating this value after each revision.
-                    </xsd:documentation>
-          </xsd:annotation>
-        </xsd:element>
-        <xsd:element name="lastModifiedBy" minOccurs="0" maxOccurs="1" type="xsd:string"/>
-        <xsd:element ref="dcterms:modified" minOccurs="0" maxOccurs="1"/>
-        <xsd:element name="contentStatus" minOccurs="0" maxOccurs="1" type="xsd:string"/>
-      </xsd:all>
-    </xsd:complexType>
-  </xsd:schema>
-  <xs:schema xmlns:pc="http://schemas.microsoft.com/office/infopath/2007/PartnerControls" xmlns:xs="http://www.w3.org/2001/XMLSchema" targetNamespace="http://schemas.microsoft.com/office/infopath/2007/PartnerControls" elementFormDefault="qualified" attributeFormDefault="unqualified">
-    <xs:element name="Person">
-      <xs:complexType>
-        <xs:sequence>
-          <xs:element ref="pc:DisplayName" minOccurs="0"/>
-          <xs:element ref="pc:AccountId" minOccurs="0"/>
-          <xs:element ref="pc:AccountType" minOccurs="0"/>
-        </xs:sequence>
-      </xs:complexType>
-    </xs:element>
-    <xs:element name="DisplayName" type="xs:string"/>
-    <xs:element name="AccountId" type="xs:string"/>
-    <xs:element name="AccountType" type="xs:string"/>
-    <xs:element name="BDCAssociatedEntity">
-      <xs:complexType>
-        <xs:sequence>
-          <xs:element ref="pc:BDCEntity" minOccurs="0" maxOccurs="unbounded"/>
-        </xs:sequence>
-        <xs:attribute ref="pc:EntityNamespace"/>
-        <xs:attribute ref="pc:EntityName"/>
-        <xs:attribute ref="pc:SystemInstanceName"/>
-        <xs:attribute ref="pc:AssociationName"/>
-      </xs:complexType>
-    </xs:element>
-    <xs:attribute name="EntityNamespace" type="xs:string"/>
-    <xs:attribute name="EntityName" type="xs:string"/>
-    <xs:attribute name="SystemInstanceName" type="xs:string"/>
-    <xs:attribute name="AssociationName" type="xs:string"/>
-    <xs:element name="BDCEntity">
-      <xs:complexType>
-        <xs:sequence>
-          <xs:element ref="pc:EntityDisplayName" minOccurs="0"/>
-          <xs:element ref="pc:EntityInstanceReference" minOccurs="0"/>
-          <xs:element ref="pc:EntityId1" minOccurs="0"/>
-          <xs:element ref="pc:EntityId2" minOccurs="0"/>
-          <xs:element ref="pc:EntityId3" minOccurs="0"/>
-          <xs:element ref="pc:EntityId4" minOccurs="0"/>
-          <xs:element ref="pc:EntityId5" minOccurs="0"/>
-        </xs:sequence>
-      </xs:complexType>
-    </xs:element>
-    <xs:element name="EntityDisplayName" type="xs:string"/>
-    <xs:element name="EntityInstanceReference" type="xs:string"/>
-    <xs:element name="EntityId1" type="xs:string"/>
-    <xs:element name="EntityId2" type="xs:string"/>
-    <xs:element name="EntityId3" type="xs:string"/>
-    <xs:element name="EntityId4" type="xs:string"/>
-    <xs:element name="EntityId5" type="xs:string"/>
-    <xs:element name="Terms">
-      <xs:complexType>
-        <xs:sequence>
-          <xs:element ref="pc:TermInfo" minOccurs="0" maxOccurs="unbounded"/>
-        </xs:sequence>
-      </xs:complexType>
-    </xs:element>
-    <xs:element name="TermInfo">
-      <xs:complexType>
-        <xs:sequence>
-          <xs:element ref="pc:TermName" minOccurs="0"/>
-          <xs:element ref="pc:TermId" minOccurs="0"/>
-        </xs:sequence>
-      </xs:complexType>
-    </xs:element>
-    <xs:element name="TermName" type="xs:string"/>
-    <xs:element name="TermId" type="xs:string"/>
-  </xs:schema>
-</ct:contentTypeSchema>
+<p:properties xmlns:p="http://schemas.microsoft.com/office/2006/metadata/properties" xmlns:xsi="http://www.w3.org/2001/XMLSchema-instance" xmlns:pc="http://schemas.microsoft.com/office/infopath/2007/PartnerControls">
+  <documentManagement>
+    <lcf76f155ced4ddcb4097134ff3c332f xmlns="70093741-41eb-4420-bf3d-ff9555ef2a33">
+      <Terms xmlns="http://schemas.microsoft.com/office/infopath/2007/PartnerControls"/>
+    </lcf76f155ced4ddcb4097134ff3c332f>
+    <TaxCatchAll xmlns="8e0d46a4-c7d4-472b-9541-810c49191871" xsi:nil="true"/>
+  </documentManagement>
+</p:properties>
 </file>
 
 <file path=customXml/itemProps1.xml><?xml version="1.0" encoding="utf-8"?>
@@ -11327,25 +11339,6 @@
 </file>
 
 <file path=customXml/itemProps3.xml><?xml version="1.0" encoding="utf-8"?>
-<ds:datastoreItem xmlns:ds="http://schemas.openxmlformats.org/officeDocument/2006/customXml" ds:itemID="{AFA79D07-4CBE-44F8-96D9-EF1619A15533}">
-  <ds:schemaRefs>
-    <ds:schemaRef ds:uri="http://schemas.microsoft.com/office/2006/metadata/properties"/>
-    <ds:schemaRef ds:uri="http://schemas.microsoft.com/office/infopath/2007/PartnerControls"/>
-    <ds:schemaRef ds:uri="70093741-41eb-4420-bf3d-ff9555ef2a33"/>
-    <ds:schemaRef ds:uri="8e0d46a4-c7d4-472b-9541-810c49191871"/>
-  </ds:schemaRefs>
-</ds:datastoreItem>
-</file>
-
-<file path=customXml/itemProps4.xml><?xml version="1.0" encoding="utf-8"?>
-<ds:datastoreItem xmlns:ds="http://schemas.openxmlformats.org/officeDocument/2006/customXml" ds:itemID="{A78D1BFD-FB21-4E94-A897-6F9CD570B4EA}">
-  <ds:schemaRefs>
-    <ds:schemaRef ds:uri="http://schemas.openxmlformats.org/officeDocument/2006/bibliography"/>
-  </ds:schemaRefs>
-</ds:datastoreItem>
-</file>
-
-<file path=customXml/itemProps5.xml><?xml version="1.0" encoding="utf-8"?>
 <ds:datastoreItem xmlns:ds="http://schemas.openxmlformats.org/officeDocument/2006/customXml" ds:itemID="{1D334DBD-E327-428E-966E-5E0935AA8778}">
   <ds:schemaRefs>
     <ds:schemaRef ds:uri="http://schemas.microsoft.com/office/2006/metadata/contentType"/>
@@ -11362,4 +11355,23 @@
     <ds:schemaRef ds:uri="http://schemas.microsoft.com/internal/obd"/>
   </ds:schemaRefs>
 </ds:datastoreItem>
+</file>
+
+<file path=customXml/itemProps4.xml><?xml version="1.0" encoding="utf-8"?>
+<ds:datastoreItem xmlns:ds="http://schemas.openxmlformats.org/officeDocument/2006/customXml" ds:itemID="{A78D1BFD-FB21-4E94-A897-6F9CD570B4EA}">
+  <ds:schemaRefs>
+    <ds:schemaRef ds:uri="http://schemas.openxmlformats.org/officeDocument/2006/bibliography"/>
+  </ds:schemaRefs>
+</ds:datastoreItem>
+</file>
+
+<file path=customXml/itemProps5.xml><?xml version="1.0" encoding="utf-8"?>
+<ds:datastoreItem xmlns:ds="http://schemas.openxmlformats.org/officeDocument/2006/customXml" ds:itemID="{AFA79D07-4CBE-44F8-96D9-EF1619A15533}">
+  <ds:schemaRefs>
+    <ds:schemaRef ds:uri="http://schemas.microsoft.com/office/2006/metadata/properties"/>
+    <ds:schemaRef ds:uri="http://schemas.microsoft.com/office/infopath/2007/PartnerControls"/>
+    <ds:schemaRef ds:uri="70093741-41eb-4420-bf3d-ff9555ef2a33"/>
+    <ds:schemaRef ds:uri="8e0d46a4-c7d4-472b-9541-810c49191871"/>
+  </ds:schemaRefs>
+</ds:datastoreItem>
 </file>
</xml_diff>